<commit_message>
Question Bank for END Term
</commit_message>
<xml_diff>
--- a/QUESTION BANK/NOSQL DATA MANAGEMENT QUESTION BANK.docx
+++ b/QUESTION BANK/NOSQL DATA MANAGEMENT QUESTION BANK.docx
@@ -9,15 +9,16 @@
         <w:ind w:left="1988" w:firstLine="0"/>
         <w:jc w:val="both"/>
         <w:rPr>
-          <w:rFonts w:asciiTheme="majorHAnsi" w:hAnsiTheme="majorHAnsi"/>
+          <w:rFonts w:ascii="Cambria" w:hAnsi="Cambria"/>
           <w:sz w:val="24"/>
           <w:szCs w:val="24"/>
           <w:u w:val="none"/>
         </w:rPr>
       </w:pPr>
-      <w:r>
-        <w:rPr>
-          <w:rFonts w:asciiTheme="majorHAnsi" w:hAnsiTheme="majorHAnsi"/>
+      <w:bookmarkStart w:id="0" w:name="_GoBack"/>
+      <w:r>
+        <w:rPr>
+          <w:rFonts w:ascii="Cambria" w:hAnsi="Cambria"/>
           <w:sz w:val="24"/>
           <w:szCs w:val="24"/>
         </w:rPr>
@@ -25,7 +26,7 @@
       </w:r>
       <w:r>
         <w:rPr>
-          <w:rFonts w:asciiTheme="majorHAnsi" w:hAnsiTheme="majorHAnsi"/>
+          <w:rFonts w:ascii="Cambria" w:hAnsi="Cambria"/>
           <w:spacing w:val="-7"/>
           <w:sz w:val="24"/>
           <w:szCs w:val="24"/>
@@ -34,7 +35,7 @@
       </w:r>
       <w:r>
         <w:rPr>
-          <w:rFonts w:asciiTheme="majorHAnsi" w:hAnsiTheme="majorHAnsi"/>
+          <w:rFonts w:ascii="Cambria" w:hAnsi="Cambria"/>
           <w:sz w:val="24"/>
           <w:szCs w:val="24"/>
         </w:rPr>
@@ -42,7 +43,7 @@
       </w:r>
       <w:r>
         <w:rPr>
-          <w:rFonts w:asciiTheme="majorHAnsi" w:hAnsiTheme="majorHAnsi"/>
+          <w:rFonts w:ascii="Cambria" w:hAnsi="Cambria"/>
           <w:sz w:val="24"/>
           <w:szCs w:val="24"/>
         </w:rPr>
@@ -50,7 +51,7 @@
       </w:r>
       <w:r>
         <w:rPr>
-          <w:rFonts w:asciiTheme="majorHAnsi" w:hAnsiTheme="majorHAnsi"/>
+          <w:rFonts w:ascii="Cambria" w:hAnsi="Cambria"/>
           <w:spacing w:val="-6"/>
           <w:sz w:val="24"/>
           <w:szCs w:val="24"/>
@@ -59,7 +60,7 @@
       </w:r>
       <w:r>
         <w:rPr>
-          <w:rFonts w:asciiTheme="majorHAnsi" w:hAnsiTheme="majorHAnsi"/>
+          <w:rFonts w:ascii="Cambria" w:hAnsi="Cambria"/>
           <w:spacing w:val="-6"/>
           <w:sz w:val="24"/>
           <w:szCs w:val="24"/>
@@ -68,7 +69,7 @@
       </w:r>
       <w:r>
         <w:rPr>
-          <w:rFonts w:asciiTheme="majorHAnsi" w:hAnsiTheme="majorHAnsi"/>
+          <w:rFonts w:ascii="Cambria" w:hAnsi="Cambria"/>
           <w:spacing w:val="-6"/>
           <w:sz w:val="24"/>
           <w:szCs w:val="24"/>
@@ -77,7 +78,7 @@
       </w:r>
       <w:r>
         <w:rPr>
-          <w:rFonts w:asciiTheme="majorHAnsi" w:hAnsiTheme="majorHAnsi"/>
+          <w:rFonts w:ascii="Cambria" w:hAnsi="Cambria"/>
           <w:sz w:val="24"/>
           <w:szCs w:val="24"/>
         </w:rPr>
@@ -85,7 +86,7 @@
       </w:r>
       <w:r>
         <w:rPr>
-          <w:rFonts w:asciiTheme="majorHAnsi" w:hAnsiTheme="majorHAnsi"/>
+          <w:rFonts w:ascii="Cambria" w:hAnsi="Cambria"/>
           <w:spacing w:val="-6"/>
           <w:sz w:val="24"/>
           <w:szCs w:val="24"/>
@@ -94,7 +95,7 @@
       </w:r>
       <w:r>
         <w:rPr>
-          <w:rFonts w:asciiTheme="majorHAnsi" w:hAnsiTheme="majorHAnsi"/>
+          <w:rFonts w:ascii="Cambria" w:hAnsi="Cambria"/>
           <w:sz w:val="24"/>
           <w:szCs w:val="24"/>
         </w:rPr>
@@ -107,7 +108,7 @@
         <w:ind w:left="23"/>
         <w:jc w:val="both"/>
         <w:rPr>
-          <w:rFonts w:asciiTheme="majorHAnsi" w:hAnsiTheme="majorHAnsi"/>
+          <w:rFonts w:ascii="Cambria" w:hAnsi="Cambria"/>
           <w:b/>
           <w:sz w:val="24"/>
           <w:szCs w:val="24"/>
@@ -115,7 +116,7 @@
       </w:pPr>
       <w:r>
         <w:rPr>
-          <w:rFonts w:asciiTheme="majorHAnsi" w:hAnsiTheme="majorHAnsi"/>
+          <w:rFonts w:ascii="Cambria" w:hAnsi="Cambria"/>
           <w:b/>
           <w:sz w:val="24"/>
           <w:szCs w:val="24"/>
@@ -125,7 +126,7 @@
       </w:r>
       <w:r>
         <w:rPr>
-          <w:rFonts w:asciiTheme="majorHAnsi" w:hAnsiTheme="majorHAnsi"/>
+          <w:rFonts w:ascii="Cambria" w:hAnsi="Cambria"/>
           <w:b/>
           <w:spacing w:val="-3"/>
           <w:sz w:val="24"/>
@@ -136,7 +137,7 @@
       </w:r>
       <w:r>
         <w:rPr>
-          <w:rFonts w:asciiTheme="majorHAnsi" w:hAnsiTheme="majorHAnsi"/>
+          <w:rFonts w:ascii="Cambria" w:hAnsi="Cambria"/>
           <w:b/>
           <w:spacing w:val="-2"/>
           <w:sz w:val="24"/>
@@ -160,14 +161,14 @@
         <w:ind w:left="741" w:hanging="358"/>
         <w:jc w:val="both"/>
         <w:rPr>
-          <w:rFonts w:asciiTheme="majorHAnsi" w:hAnsiTheme="majorHAnsi"/>
-          <w:sz w:val="24"/>
-          <w:szCs w:val="24"/>
-        </w:rPr>
-      </w:pPr>
-      <w:r>
-        <w:rPr>
-          <w:rFonts w:asciiTheme="majorHAnsi" w:hAnsiTheme="majorHAnsi"/>
+          <w:rFonts w:ascii="Cambria" w:hAnsi="Cambria"/>
+          <w:sz w:val="24"/>
+          <w:szCs w:val="24"/>
+        </w:rPr>
+      </w:pPr>
+      <w:r>
+        <w:rPr>
+          <w:rFonts w:ascii="Cambria" w:hAnsi="Cambria"/>
           <w:sz w:val="24"/>
           <w:szCs w:val="24"/>
         </w:rPr>
@@ -176,7 +177,7 @@
       <w:r>
         <w:rPr>
           <w:rStyle w:val="Strong"/>
-          <w:rFonts w:asciiTheme="majorHAnsi" w:hAnsiTheme="majorHAnsi"/>
+          <w:rFonts w:ascii="Cambria" w:hAnsi="Cambria"/>
           <w:sz w:val="24"/>
           <w:szCs w:val="24"/>
         </w:rPr>
@@ -184,7 +185,7 @@
       </w:r>
       <w:r>
         <w:rPr>
-          <w:rFonts w:asciiTheme="majorHAnsi" w:hAnsiTheme="majorHAnsi"/>
+          <w:rFonts w:ascii="Cambria" w:hAnsi="Cambria"/>
           <w:sz w:val="24"/>
           <w:szCs w:val="24"/>
         </w:rPr>
@@ -193,7 +194,7 @@
       <w:r>
         <w:rPr>
           <w:rStyle w:val="Strong"/>
-          <w:rFonts w:asciiTheme="majorHAnsi" w:hAnsiTheme="majorHAnsi"/>
+          <w:rFonts w:ascii="Cambria" w:hAnsi="Cambria"/>
           <w:sz w:val="24"/>
           <w:szCs w:val="24"/>
         </w:rPr>
@@ -201,7 +202,7 @@
       </w:r>
       <w:r>
         <w:rPr>
-          <w:rFonts w:asciiTheme="majorHAnsi" w:hAnsiTheme="majorHAnsi"/>
+          <w:rFonts w:ascii="Cambria" w:hAnsi="Cambria"/>
           <w:b/>
           <w:sz w:val="24"/>
           <w:szCs w:val="24"/>
@@ -223,14 +224,14 @@
         <w:ind w:left="741" w:hanging="358"/>
         <w:jc w:val="both"/>
         <w:rPr>
-          <w:rFonts w:asciiTheme="majorHAnsi" w:hAnsiTheme="majorHAnsi"/>
-          <w:sz w:val="24"/>
-          <w:szCs w:val="24"/>
-        </w:rPr>
-      </w:pPr>
-      <w:r>
-        <w:rPr>
-          <w:rFonts w:asciiTheme="majorHAnsi" w:hAnsiTheme="majorHAnsi"/>
+          <w:rFonts w:ascii="Cambria" w:hAnsi="Cambria"/>
+          <w:sz w:val="24"/>
+          <w:szCs w:val="24"/>
+        </w:rPr>
+      </w:pPr>
+      <w:r>
+        <w:rPr>
+          <w:rFonts w:ascii="Cambria" w:hAnsi="Cambria"/>
           <w:sz w:val="24"/>
           <w:szCs w:val="24"/>
         </w:rPr>
@@ -251,14 +252,14 @@
         <w:ind w:left="741" w:hanging="358"/>
         <w:jc w:val="both"/>
         <w:rPr>
-          <w:rFonts w:asciiTheme="majorHAnsi" w:hAnsiTheme="majorHAnsi"/>
-          <w:sz w:val="24"/>
-          <w:szCs w:val="24"/>
-        </w:rPr>
-      </w:pPr>
-      <w:r>
-        <w:rPr>
-          <w:rFonts w:asciiTheme="majorHAnsi" w:hAnsiTheme="majorHAnsi"/>
+          <w:rFonts w:ascii="Cambria" w:hAnsi="Cambria"/>
+          <w:sz w:val="24"/>
+          <w:szCs w:val="24"/>
+        </w:rPr>
+      </w:pPr>
+      <w:r>
+        <w:rPr>
+          <w:rFonts w:ascii="Cambria" w:hAnsi="Cambria"/>
           <w:sz w:val="24"/>
           <w:szCs w:val="24"/>
         </w:rPr>
@@ -267,7 +268,7 @@
       <w:r>
         <w:rPr>
           <w:rStyle w:val="Strong"/>
-          <w:rFonts w:asciiTheme="majorHAnsi" w:hAnsiTheme="majorHAnsi"/>
+          <w:rFonts w:ascii="Cambria" w:hAnsi="Cambria"/>
           <w:sz w:val="24"/>
           <w:szCs w:val="24"/>
         </w:rPr>
@@ -275,7 +276,7 @@
       </w:r>
       <w:r>
         <w:rPr>
-          <w:rFonts w:asciiTheme="majorHAnsi" w:hAnsiTheme="majorHAnsi"/>
+          <w:rFonts w:ascii="Cambria" w:hAnsi="Cambria"/>
           <w:sz w:val="24"/>
           <w:szCs w:val="24"/>
         </w:rPr>
@@ -296,14 +297,14 @@
         <w:ind w:left="741" w:hanging="358"/>
         <w:jc w:val="both"/>
         <w:rPr>
-          <w:rFonts w:asciiTheme="majorHAnsi" w:hAnsiTheme="majorHAnsi"/>
-          <w:sz w:val="24"/>
-          <w:szCs w:val="24"/>
-        </w:rPr>
-      </w:pPr>
-      <w:r>
-        <w:rPr>
-          <w:rFonts w:asciiTheme="majorHAnsi" w:hAnsiTheme="majorHAnsi"/>
+          <w:rFonts w:ascii="Cambria" w:hAnsi="Cambria"/>
+          <w:sz w:val="24"/>
+          <w:szCs w:val="24"/>
+        </w:rPr>
+      </w:pPr>
+      <w:r>
+        <w:rPr>
+          <w:rFonts w:ascii="Cambria" w:hAnsi="Cambria"/>
           <w:sz w:val="24"/>
           <w:szCs w:val="24"/>
         </w:rPr>
@@ -312,7 +313,7 @@
       <w:r>
         <w:rPr>
           <w:rStyle w:val="Strong"/>
-          <w:rFonts w:asciiTheme="majorHAnsi" w:hAnsiTheme="majorHAnsi"/>
+          <w:rFonts w:ascii="Cambria" w:hAnsi="Cambria"/>
           <w:sz w:val="24"/>
           <w:szCs w:val="24"/>
         </w:rPr>
@@ -320,7 +321,7 @@
       </w:r>
       <w:r>
         <w:rPr>
-          <w:rFonts w:asciiTheme="majorHAnsi" w:hAnsiTheme="majorHAnsi"/>
+          <w:rFonts w:ascii="Cambria" w:hAnsi="Cambria"/>
           <w:sz w:val="24"/>
           <w:szCs w:val="24"/>
         </w:rPr>
@@ -341,14 +342,14 @@
         <w:ind w:left="741" w:hanging="358"/>
         <w:jc w:val="both"/>
         <w:rPr>
-          <w:rFonts w:asciiTheme="majorHAnsi" w:hAnsiTheme="majorHAnsi"/>
-          <w:sz w:val="24"/>
-          <w:szCs w:val="24"/>
-        </w:rPr>
-      </w:pPr>
-      <w:r>
-        <w:rPr>
-          <w:rFonts w:asciiTheme="majorHAnsi" w:hAnsiTheme="majorHAnsi"/>
+          <w:rFonts w:ascii="Cambria" w:hAnsi="Cambria"/>
+          <w:sz w:val="24"/>
+          <w:szCs w:val="24"/>
+        </w:rPr>
+      </w:pPr>
+      <w:r>
+        <w:rPr>
+          <w:rFonts w:ascii="Cambria" w:hAnsi="Cambria"/>
           <w:sz w:val="24"/>
           <w:szCs w:val="24"/>
         </w:rPr>
@@ -357,7 +358,7 @@
       <w:proofErr w:type="spellStart"/>
       <w:r>
         <w:rPr>
-          <w:rFonts w:asciiTheme="majorHAnsi" w:hAnsiTheme="majorHAnsi"/>
+          <w:rFonts w:ascii="Cambria" w:hAnsi="Cambria"/>
           <w:sz w:val="24"/>
           <w:szCs w:val="24"/>
         </w:rPr>
@@ -366,7 +367,7 @@
       <w:proofErr w:type="spellEnd"/>
       <w:r>
         <w:rPr>
-          <w:rFonts w:asciiTheme="majorHAnsi" w:hAnsiTheme="majorHAnsi"/>
+          <w:rFonts w:ascii="Cambria" w:hAnsi="Cambria"/>
           <w:sz w:val="24"/>
           <w:szCs w:val="24"/>
         </w:rPr>
@@ -387,14 +388,14 @@
         <w:ind w:left="741" w:hanging="358"/>
         <w:jc w:val="both"/>
         <w:rPr>
-          <w:rFonts w:asciiTheme="majorHAnsi" w:hAnsiTheme="majorHAnsi"/>
-          <w:sz w:val="24"/>
-          <w:szCs w:val="24"/>
-        </w:rPr>
-      </w:pPr>
-      <w:r>
-        <w:rPr>
-          <w:rFonts w:asciiTheme="majorHAnsi" w:hAnsiTheme="majorHAnsi"/>
+          <w:rFonts w:ascii="Cambria" w:hAnsi="Cambria"/>
+          <w:sz w:val="24"/>
+          <w:szCs w:val="24"/>
+        </w:rPr>
+      </w:pPr>
+      <w:r>
+        <w:rPr>
+          <w:rFonts w:ascii="Cambria" w:hAnsi="Cambria"/>
           <w:sz w:val="24"/>
           <w:szCs w:val="24"/>
         </w:rPr>
@@ -415,14 +416,14 @@
         <w:ind w:left="741" w:hanging="358"/>
         <w:jc w:val="both"/>
         <w:rPr>
-          <w:rFonts w:asciiTheme="majorHAnsi" w:hAnsiTheme="majorHAnsi"/>
-          <w:sz w:val="24"/>
-          <w:szCs w:val="24"/>
-        </w:rPr>
-      </w:pPr>
-      <w:r>
-        <w:rPr>
-          <w:rFonts w:asciiTheme="majorHAnsi" w:hAnsiTheme="majorHAnsi"/>
+          <w:rFonts w:ascii="Cambria" w:hAnsi="Cambria"/>
+          <w:sz w:val="24"/>
+          <w:szCs w:val="24"/>
+        </w:rPr>
+      </w:pPr>
+      <w:r>
+        <w:rPr>
+          <w:rFonts w:ascii="Cambria" w:hAnsi="Cambria"/>
           <w:sz w:val="24"/>
           <w:szCs w:val="24"/>
         </w:rPr>
@@ -443,14 +444,14 @@
         <w:ind w:left="741" w:hanging="358"/>
         <w:jc w:val="both"/>
         <w:rPr>
-          <w:rFonts w:asciiTheme="majorHAnsi" w:hAnsiTheme="majorHAnsi"/>
-          <w:sz w:val="24"/>
-          <w:szCs w:val="24"/>
-        </w:rPr>
-      </w:pPr>
-      <w:r>
-        <w:rPr>
-          <w:rFonts w:asciiTheme="majorHAnsi" w:hAnsiTheme="majorHAnsi"/>
+          <w:rFonts w:ascii="Cambria" w:hAnsi="Cambria"/>
+          <w:sz w:val="24"/>
+          <w:szCs w:val="24"/>
+        </w:rPr>
+      </w:pPr>
+      <w:r>
+        <w:rPr>
+          <w:rFonts w:ascii="Cambria" w:hAnsi="Cambria"/>
           <w:sz w:val="24"/>
           <w:szCs w:val="24"/>
         </w:rPr>
@@ -470,14 +471,14 @@
         <w:ind w:left="741" w:hanging="358"/>
         <w:jc w:val="both"/>
         <w:rPr>
-          <w:rFonts w:asciiTheme="majorHAnsi" w:hAnsiTheme="majorHAnsi"/>
-          <w:sz w:val="24"/>
-          <w:szCs w:val="24"/>
-        </w:rPr>
-      </w:pPr>
-      <w:r>
-        <w:rPr>
-          <w:rFonts w:asciiTheme="majorHAnsi" w:hAnsiTheme="majorHAnsi"/>
+          <w:rFonts w:ascii="Cambria" w:hAnsi="Cambria"/>
+          <w:sz w:val="24"/>
+          <w:szCs w:val="24"/>
+        </w:rPr>
+      </w:pPr>
+      <w:r>
+        <w:rPr>
+          <w:rFonts w:ascii="Cambria" w:hAnsi="Cambria"/>
           <w:sz w:val="24"/>
           <w:szCs w:val="24"/>
         </w:rPr>
@@ -497,19 +498,27 @@
         <w:ind w:left="741" w:hanging="358"/>
         <w:jc w:val="both"/>
         <w:rPr>
-          <w:rFonts w:asciiTheme="majorHAnsi" w:hAnsiTheme="majorHAnsi"/>
-          <w:sz w:val="24"/>
-          <w:szCs w:val="24"/>
-        </w:rPr>
-      </w:pPr>
-      <w:r>
-        <w:rPr>
-          <w:rFonts w:asciiTheme="majorHAnsi" w:hAnsiTheme="majorHAnsi"/>
+          <w:rFonts w:ascii="Cambria" w:hAnsi="Cambria"/>
+          <w:sz w:val="24"/>
+          <w:szCs w:val="24"/>
+        </w:rPr>
+      </w:pPr>
+      <w:r>
+        <w:rPr>
+          <w:rFonts w:ascii="Cambria" w:hAnsi="Cambria"/>
           <w:sz w:val="24"/>
           <w:szCs w:val="24"/>
         </w:rPr>
         <w:t>State any two consequences of aggregate orientation in databases.</w:t>
       </w:r>
+      <w:r>
+        <w:rPr>
+          <w:rFonts w:ascii="Cambria" w:hAnsi="Cambria"/>
+          <w:sz w:val="24"/>
+          <w:szCs w:val="24"/>
+        </w:rPr>
+        <w:t xml:space="preserve"> </w:t>
+      </w:r>
     </w:p>
     <w:p>
       <w:pPr>
@@ -524,14 +533,49 @@
         <w:ind w:left="741" w:hanging="358"/>
         <w:jc w:val="both"/>
         <w:rPr>
-          <w:rFonts w:asciiTheme="majorHAnsi" w:hAnsiTheme="majorHAnsi"/>
-          <w:sz w:val="24"/>
-          <w:szCs w:val="24"/>
-        </w:rPr>
-      </w:pPr>
-      <w:r>
-        <w:rPr>
-          <w:rFonts w:asciiTheme="majorHAnsi" w:hAnsiTheme="majorHAnsi"/>
+          <w:rFonts w:ascii="Cambria" w:hAnsi="Cambria"/>
+          <w:sz w:val="24"/>
+          <w:szCs w:val="24"/>
+        </w:rPr>
+      </w:pPr>
+      <w:r>
+        <w:rPr>
+          <w:rFonts w:ascii="Cambria" w:hAnsi="Cambria"/>
+          <w:sz w:val="24"/>
+          <w:szCs w:val="24"/>
+        </w:rPr>
+        <w:t xml:space="preserve"> </w:t>
+      </w:r>
+      <w:r>
+        <w:rPr>
+          <w:rFonts w:ascii="Cambria" w:hAnsi="Cambria" w:cstheme="minorHAnsi"/>
+          <w:sz w:val="24"/>
+          <w:szCs w:val="24"/>
+        </w:rPr>
+        <w:t>Explain eventual consistency in distributed system.</w:t>
+      </w:r>
+    </w:p>
+    <w:p>
+      <w:pPr>
+        <w:pStyle w:val="ListParagraph"/>
+        <w:numPr>
+          <w:ilvl w:val="0"/>
+          <w:numId w:val="5"/>
+        </w:numPr>
+        <w:tabs>
+          <w:tab w:val="left" w:pos="741"/>
+        </w:tabs>
+        <w:ind w:left="741" w:hanging="358"/>
+        <w:jc w:val="both"/>
+        <w:rPr>
+          <w:rFonts w:ascii="Cambria" w:hAnsi="Cambria"/>
+          <w:sz w:val="24"/>
+          <w:szCs w:val="24"/>
+        </w:rPr>
+      </w:pPr>
+      <w:r>
+        <w:rPr>
+          <w:rFonts w:ascii="Cambria" w:hAnsi="Cambria"/>
           <w:sz w:val="24"/>
           <w:szCs w:val="24"/>
         </w:rPr>
@@ -551,14 +595,41 @@
         <w:ind w:left="741" w:hanging="358"/>
         <w:jc w:val="both"/>
         <w:rPr>
-          <w:rFonts w:asciiTheme="majorHAnsi" w:hAnsiTheme="majorHAnsi"/>
-          <w:sz w:val="24"/>
-          <w:szCs w:val="24"/>
-        </w:rPr>
-      </w:pPr>
-      <w:r>
-        <w:rPr>
-          <w:rFonts w:asciiTheme="majorHAnsi" w:hAnsiTheme="majorHAnsi"/>
+          <w:rFonts w:ascii="Cambria" w:hAnsi="Cambria"/>
+          <w:sz w:val="24"/>
+          <w:szCs w:val="24"/>
+        </w:rPr>
+      </w:pPr>
+      <w:r>
+        <w:rPr>
+          <w:rFonts w:ascii="Cambria" w:hAnsi="Cambria"/>
+          <w:sz w:val="24"/>
+          <w:szCs w:val="24"/>
+        </w:rPr>
+        <w:t>Define a column-family store with an example.</w:t>
+      </w:r>
+    </w:p>
+    <w:p>
+      <w:pPr>
+        <w:pStyle w:val="ListParagraph"/>
+        <w:numPr>
+          <w:ilvl w:val="0"/>
+          <w:numId w:val="5"/>
+        </w:numPr>
+        <w:tabs>
+          <w:tab w:val="left" w:pos="741"/>
+        </w:tabs>
+        <w:ind w:left="741" w:hanging="358"/>
+        <w:jc w:val="both"/>
+        <w:rPr>
+          <w:rFonts w:ascii="Cambria" w:hAnsi="Cambria"/>
+          <w:sz w:val="24"/>
+          <w:szCs w:val="24"/>
+        </w:rPr>
+      </w:pPr>
+      <w:r>
+        <w:rPr>
+          <w:rFonts w:ascii="Cambria" w:hAnsi="Cambria"/>
           <w:sz w:val="24"/>
           <w:szCs w:val="24"/>
         </w:rPr>
@@ -579,14 +650,14 @@
         <w:ind w:left="741" w:hanging="358"/>
         <w:jc w:val="both"/>
         <w:rPr>
-          <w:rFonts w:asciiTheme="majorHAnsi" w:hAnsiTheme="majorHAnsi"/>
-          <w:sz w:val="24"/>
-          <w:szCs w:val="24"/>
-        </w:rPr>
-      </w:pPr>
-      <w:r>
-        <w:rPr>
-          <w:rFonts w:asciiTheme="majorHAnsi" w:hAnsiTheme="majorHAnsi"/>
+          <w:rFonts w:ascii="Cambria" w:hAnsi="Cambria"/>
+          <w:sz w:val="24"/>
+          <w:szCs w:val="24"/>
+        </w:rPr>
+      </w:pPr>
+      <w:r>
+        <w:rPr>
+          <w:rFonts w:ascii="Cambria" w:hAnsi="Cambria"/>
           <w:sz w:val="24"/>
           <w:szCs w:val="24"/>
         </w:rPr>
@@ -595,7 +666,7 @@
       <w:r>
         <w:rPr>
           <w:rStyle w:val="Strong"/>
-          <w:rFonts w:asciiTheme="majorHAnsi" w:hAnsiTheme="majorHAnsi"/>
+          <w:rFonts w:ascii="Cambria" w:hAnsi="Cambria"/>
           <w:sz w:val="24"/>
           <w:szCs w:val="24"/>
         </w:rPr>
@@ -603,7 +674,7 @@
       </w:r>
       <w:r>
         <w:rPr>
-          <w:rFonts w:asciiTheme="majorHAnsi" w:hAnsiTheme="majorHAnsi"/>
+          <w:rFonts w:ascii="Cambria" w:hAnsi="Cambria"/>
           <w:sz w:val="24"/>
           <w:szCs w:val="24"/>
         </w:rPr>
@@ -624,35 +695,26 @@
         <w:ind w:left="741" w:hanging="358"/>
         <w:jc w:val="both"/>
         <w:rPr>
-          <w:rFonts w:asciiTheme="majorHAnsi" w:hAnsiTheme="majorHAnsi"/>
-          <w:sz w:val="24"/>
-          <w:szCs w:val="24"/>
-        </w:rPr>
-      </w:pPr>
-      <w:r>
-        <w:rPr>
-          <w:rFonts w:asciiTheme="majorHAnsi" w:hAnsiTheme="majorHAnsi"/>
-          <w:sz w:val="24"/>
-          <w:szCs w:val="24"/>
-        </w:rPr>
-        <w:t xml:space="preserve">Write short notes on </w:t>
-      </w:r>
-      <w:r>
-        <w:rPr>
-          <w:rStyle w:val="Strong"/>
-          <w:rFonts w:asciiTheme="majorHAnsi" w:hAnsiTheme="majorHAnsi"/>
-          <w:sz w:val="24"/>
-          <w:szCs w:val="24"/>
-        </w:rPr>
-        <w:t>quorums</w:t>
-      </w:r>
-      <w:r>
-        <w:rPr>
-          <w:rFonts w:asciiTheme="majorHAnsi" w:hAnsiTheme="majorHAnsi"/>
-          <w:sz w:val="24"/>
-          <w:szCs w:val="24"/>
-        </w:rPr>
-        <w:t xml:space="preserve"> in distributed systems.</w:t>
+          <w:rFonts w:ascii="Cambria" w:hAnsi="Cambria"/>
+          <w:sz w:val="24"/>
+          <w:szCs w:val="24"/>
+        </w:rPr>
+      </w:pPr>
+      <w:r>
+        <w:rPr>
+          <w:rFonts w:ascii="Cambria" w:hAnsi="Cambria" w:cstheme="minorHAnsi"/>
+          <w:sz w:val="24"/>
+          <w:szCs w:val="24"/>
+        </w:rPr>
+        <w:t>What is the difference between master-slave and peer-to-peer replication</w:t>
+      </w:r>
+      <w:r>
+        <w:rPr>
+          <w:rFonts w:ascii="Cambria" w:hAnsi="Cambria" w:cstheme="minorHAnsi"/>
+          <w:sz w:val="24"/>
+          <w:szCs w:val="24"/>
+        </w:rPr>
+        <w:t>.</w:t>
       </w:r>
     </w:p>
     <w:p>
@@ -669,18 +731,18 @@
         <w:ind w:left="741" w:hanging="358"/>
         <w:jc w:val="both"/>
         <w:rPr>
-          <w:rFonts w:asciiTheme="majorHAnsi" w:hAnsiTheme="majorHAnsi"/>
-          <w:sz w:val="24"/>
-          <w:szCs w:val="24"/>
-        </w:rPr>
-      </w:pPr>
-      <w:r>
-        <w:rPr>
-          <w:rFonts w:asciiTheme="majorHAnsi" w:hAnsiTheme="majorHAnsi"/>
-          <w:sz w:val="24"/>
-          <w:szCs w:val="24"/>
-        </w:rPr>
-        <w:t>What is schema-less database design? Give one example.</w:t>
+          <w:rFonts w:ascii="Cambria" w:hAnsi="Cambria"/>
+          <w:sz w:val="24"/>
+          <w:szCs w:val="24"/>
+        </w:rPr>
+      </w:pPr>
+      <w:r>
+        <w:rPr>
+          <w:rFonts w:ascii="Cambria" w:hAnsi="Cambria" w:cstheme="minorHAnsi"/>
+          <w:sz w:val="24"/>
+          <w:szCs w:val="24"/>
+        </w:rPr>
+        <w:t>Mention two advantages of aggregate-oriented databases.</w:t>
       </w:r>
     </w:p>
     <w:p>
@@ -697,18 +759,18 @@
         <w:ind w:left="741" w:hanging="358"/>
         <w:jc w:val="both"/>
         <w:rPr>
-          <w:rFonts w:asciiTheme="majorHAnsi" w:hAnsiTheme="majorHAnsi"/>
-          <w:sz w:val="24"/>
-          <w:szCs w:val="24"/>
-        </w:rPr>
-      </w:pPr>
-      <w:r>
-        <w:rPr>
-          <w:rFonts w:asciiTheme="majorHAnsi" w:hAnsiTheme="majorHAnsi"/>
-          <w:sz w:val="24"/>
-          <w:szCs w:val="24"/>
-        </w:rPr>
-        <w:t>Differentiate between master-slave replication and peer-to-peer replication.</w:t>
+          <w:rFonts w:ascii="Cambria" w:hAnsi="Cambria"/>
+          <w:sz w:val="24"/>
+          <w:szCs w:val="24"/>
+        </w:rPr>
+      </w:pPr>
+      <w:r>
+        <w:rPr>
+          <w:rFonts w:ascii="Cambria" w:hAnsi="Cambria"/>
+          <w:sz w:val="24"/>
+          <w:szCs w:val="24"/>
+        </w:rPr>
+        <w:t>Explain the term "Impedance Mismatch" in the context of relational databases and object-oriented applications.</w:t>
       </w:r>
     </w:p>
     <w:p>
@@ -725,18 +787,35 @@
         <w:ind w:left="741" w:hanging="358"/>
         <w:jc w:val="both"/>
         <w:rPr>
-          <w:rFonts w:asciiTheme="majorHAnsi" w:hAnsiTheme="majorHAnsi"/>
-          <w:sz w:val="24"/>
-          <w:szCs w:val="24"/>
-        </w:rPr>
-      </w:pPr>
-      <w:r>
-        <w:rPr>
-          <w:rFonts w:asciiTheme="majorHAnsi" w:hAnsiTheme="majorHAnsi"/>
-          <w:sz w:val="24"/>
-          <w:szCs w:val="24"/>
-        </w:rPr>
-        <w:t>What is a column-family store? Name two popular systems that use it.</w:t>
+          <w:rFonts w:ascii="Cambria" w:hAnsi="Cambria"/>
+          <w:sz w:val="24"/>
+          <w:szCs w:val="24"/>
+        </w:rPr>
+      </w:pPr>
+      <w:r>
+        <w:rPr>
+          <w:rFonts w:ascii="Cambria" w:hAnsi="Cambria"/>
+          <w:sz w:val="24"/>
+          <w:szCs w:val="24"/>
+        </w:rPr>
+        <w:t xml:space="preserve">Write short notes on </w:t>
+      </w:r>
+      <w:r>
+        <w:rPr>
+          <w:rStyle w:val="Strong"/>
+          <w:rFonts w:ascii="Cambria" w:hAnsi="Cambria"/>
+          <w:sz w:val="24"/>
+          <w:szCs w:val="24"/>
+        </w:rPr>
+        <w:t>quorums</w:t>
+      </w:r>
+      <w:r>
+        <w:rPr>
+          <w:rFonts w:ascii="Cambria" w:hAnsi="Cambria"/>
+          <w:sz w:val="24"/>
+          <w:szCs w:val="24"/>
+        </w:rPr>
+        <w:t xml:space="preserve"> in distributed systems.</w:t>
       </w:r>
     </w:p>
     <w:p>
@@ -753,18 +832,18 @@
         <w:ind w:left="741" w:hanging="358"/>
         <w:jc w:val="both"/>
         <w:rPr>
-          <w:rFonts w:asciiTheme="majorHAnsi" w:hAnsiTheme="majorHAnsi"/>
-          <w:sz w:val="24"/>
-          <w:szCs w:val="24"/>
-        </w:rPr>
-      </w:pPr>
-      <w:r>
-        <w:rPr>
-          <w:rFonts w:asciiTheme="majorHAnsi" w:hAnsiTheme="majorHAnsi"/>
-          <w:sz w:val="24"/>
-          <w:szCs w:val="24"/>
-        </w:rPr>
-        <w:t>What is meant by “eventual consistency” in distributed systems?</w:t>
+          <w:rFonts w:ascii="Cambria" w:hAnsi="Cambria"/>
+          <w:sz w:val="24"/>
+          <w:szCs w:val="24"/>
+        </w:rPr>
+      </w:pPr>
+      <w:r>
+        <w:rPr>
+          <w:rFonts w:ascii="Cambria" w:hAnsi="Cambria" w:cstheme="minorHAnsi"/>
+          <w:sz w:val="24"/>
+          <w:szCs w:val="24"/>
+        </w:rPr>
+        <w:t>Mention two key features of a key-value store.</w:t>
       </w:r>
     </w:p>
     <w:p>
@@ -781,18 +860,36 @@
         <w:ind w:left="741" w:hanging="358"/>
         <w:jc w:val="both"/>
         <w:rPr>
-          <w:rFonts w:asciiTheme="majorHAnsi" w:hAnsiTheme="majorHAnsi"/>
-          <w:sz w:val="24"/>
-          <w:szCs w:val="24"/>
-        </w:rPr>
-      </w:pPr>
-      <w:r>
-        <w:rPr>
-          <w:rFonts w:asciiTheme="majorHAnsi" w:hAnsiTheme="majorHAnsi"/>
-          <w:sz w:val="24"/>
-          <w:szCs w:val="24"/>
-        </w:rPr>
-        <w:t>What is a version stamp in distributed databases? Why is it required?</w:t>
+          <w:rFonts w:ascii="Cambria" w:hAnsi="Cambria"/>
+          <w:sz w:val="24"/>
+          <w:szCs w:val="24"/>
+        </w:rPr>
+      </w:pPr>
+      <w:r>
+        <w:rPr>
+          <w:rFonts w:ascii="Cambria" w:hAnsi="Cambria"/>
+          <w:sz w:val="24"/>
+          <w:szCs w:val="24"/>
+        </w:rPr>
+        <w:t xml:space="preserve">Compare </w:t>
+      </w:r>
+      <w:proofErr w:type="spellStart"/>
+      <w:r>
+        <w:rPr>
+          <w:rFonts w:ascii="Cambria" w:hAnsi="Cambria"/>
+          <w:sz w:val="24"/>
+          <w:szCs w:val="24"/>
+        </w:rPr>
+        <w:t>Sharding</w:t>
+      </w:r>
+      <w:proofErr w:type="spellEnd"/>
+      <w:r>
+        <w:rPr>
+          <w:rFonts w:ascii="Cambria" w:hAnsi="Cambria"/>
+          <w:sz w:val="24"/>
+          <w:szCs w:val="24"/>
+        </w:rPr>
+        <w:t xml:space="preserve"> and Master-Slave Replication as distribution models.</w:t>
       </w:r>
     </w:p>
     <w:p>
@@ -809,18 +906,18 @@
         <w:ind w:left="741" w:hanging="358"/>
         <w:jc w:val="both"/>
         <w:rPr>
-          <w:rFonts w:asciiTheme="majorHAnsi" w:hAnsiTheme="majorHAnsi"/>
-          <w:sz w:val="24"/>
-          <w:szCs w:val="24"/>
-        </w:rPr>
-      </w:pPr>
-      <w:r>
-        <w:rPr>
-          <w:rFonts w:asciiTheme="majorHAnsi" w:hAnsiTheme="majorHAnsi"/>
-          <w:sz w:val="24"/>
-          <w:szCs w:val="24"/>
-        </w:rPr>
-        <w:t>What is the role of aggregates in aggregate-oriented data models?</w:t>
+          <w:rFonts w:ascii="Cambria" w:hAnsi="Cambria"/>
+          <w:sz w:val="24"/>
+          <w:szCs w:val="24"/>
+        </w:rPr>
+      </w:pPr>
+      <w:r>
+        <w:rPr>
+          <w:rFonts w:ascii="Cambria" w:hAnsi="Cambria"/>
+          <w:sz w:val="24"/>
+          <w:szCs w:val="24"/>
+        </w:rPr>
+        <w:t>What is schema-less database design? Give one example.</w:t>
       </w:r>
     </w:p>
     <w:p>
@@ -837,19 +934,29 @@
         <w:ind w:left="741" w:hanging="358"/>
         <w:jc w:val="both"/>
         <w:rPr>
-          <w:rFonts w:asciiTheme="majorHAnsi" w:hAnsiTheme="majorHAnsi"/>
-          <w:sz w:val="24"/>
-          <w:szCs w:val="24"/>
-        </w:rPr>
-      </w:pPr>
-      <w:r>
-        <w:rPr>
-          <w:rFonts w:asciiTheme="majorHAnsi" w:hAnsiTheme="majorHAnsi"/>
-          <w:sz w:val="24"/>
-          <w:szCs w:val="24"/>
-        </w:rPr>
-        <w:t>Explain the difference between update consistency and read consistency.</w:t>
-      </w:r>
+          <w:rFonts w:ascii="Cambria" w:hAnsi="Cambria"/>
+          <w:sz w:val="24"/>
+          <w:szCs w:val="24"/>
+        </w:rPr>
+      </w:pPr>
+      <w:r>
+        <w:rPr>
+          <w:rFonts w:ascii="Cambria" w:hAnsi="Cambria" w:cstheme="minorHAnsi"/>
+          <w:sz w:val="24"/>
+          <w:szCs w:val="24"/>
+        </w:rPr>
+        <w:t xml:space="preserve">What is the use of materialized view in NoSQL </w:t>
+      </w:r>
+      <w:proofErr w:type="gramStart"/>
+      <w:r>
+        <w:rPr>
+          <w:rFonts w:ascii="Cambria" w:hAnsi="Cambria" w:cstheme="minorHAnsi"/>
+          <w:sz w:val="24"/>
+          <w:szCs w:val="24"/>
+        </w:rPr>
+        <w:t>databases.</w:t>
+      </w:r>
+      <w:proofErr w:type="gramEnd"/>
     </w:p>
     <w:p>
       <w:pPr>
@@ -865,18 +972,36 @@
         <w:ind w:left="741" w:hanging="358"/>
         <w:jc w:val="both"/>
         <w:rPr>
-          <w:rFonts w:asciiTheme="majorHAnsi" w:hAnsiTheme="majorHAnsi"/>
-          <w:sz w:val="24"/>
-          <w:szCs w:val="24"/>
-        </w:rPr>
-      </w:pPr>
-      <w:r>
-        <w:rPr>
-          <w:rFonts w:asciiTheme="majorHAnsi" w:hAnsiTheme="majorHAnsi"/>
-          <w:sz w:val="24"/>
-          <w:szCs w:val="24"/>
-        </w:rPr>
-        <w:t>What do you mean by “relaxing durability” in distributed databases?</w:t>
+          <w:rFonts w:ascii="Cambria" w:hAnsi="Cambria"/>
+          <w:sz w:val="24"/>
+          <w:szCs w:val="24"/>
+        </w:rPr>
+      </w:pPr>
+      <w:r>
+        <w:rPr>
+          <w:rFonts w:ascii="Cambria" w:hAnsi="Cambria" w:cstheme="minorHAnsi"/>
+          <w:sz w:val="24"/>
+          <w:szCs w:val="24"/>
+        </w:rPr>
+        <w:t xml:space="preserve">State the role of the Map and Reduce function in </w:t>
+      </w:r>
+      <w:proofErr w:type="spellStart"/>
+      <w:r>
+        <w:rPr>
+          <w:rFonts w:ascii="Cambria" w:hAnsi="Cambria" w:cstheme="minorHAnsi"/>
+          <w:sz w:val="24"/>
+          <w:szCs w:val="24"/>
+        </w:rPr>
+        <w:t>MapReduce</w:t>
+      </w:r>
+      <w:proofErr w:type="spellEnd"/>
+      <w:r>
+        <w:rPr>
+          <w:rFonts w:ascii="Cambria" w:hAnsi="Cambria" w:cstheme="minorHAnsi"/>
+          <w:sz w:val="24"/>
+          <w:szCs w:val="24"/>
+        </w:rPr>
+        <w:t>.</w:t>
       </w:r>
     </w:p>
     <w:p>
@@ -893,18 +1018,18 @@
         <w:ind w:left="741" w:hanging="358"/>
         <w:jc w:val="both"/>
         <w:rPr>
-          <w:rFonts w:asciiTheme="majorHAnsi" w:hAnsiTheme="majorHAnsi"/>
-          <w:sz w:val="24"/>
-          <w:szCs w:val="24"/>
-        </w:rPr>
-      </w:pPr>
-      <w:r>
-        <w:rPr>
-          <w:rFonts w:asciiTheme="majorHAnsi" w:hAnsiTheme="majorHAnsi"/>
-          <w:sz w:val="24"/>
-          <w:szCs w:val="24"/>
-        </w:rPr>
-        <w:t>How does replication improve fault tolerance in distributed databases?</w:t>
+          <w:rFonts w:ascii="Cambria" w:hAnsi="Cambria"/>
+          <w:sz w:val="24"/>
+          <w:szCs w:val="24"/>
+        </w:rPr>
+      </w:pPr>
+      <w:r>
+        <w:rPr>
+          <w:rFonts w:ascii="Cambria" w:hAnsi="Cambria"/>
+          <w:sz w:val="24"/>
+          <w:szCs w:val="24"/>
+        </w:rPr>
+        <w:t>What is the significance of a Quorum in a distributed database system?</w:t>
       </w:r>
     </w:p>
     <w:p>
@@ -921,18 +1046,18 @@
         <w:ind w:left="741" w:hanging="358"/>
         <w:jc w:val="both"/>
         <w:rPr>
-          <w:rFonts w:asciiTheme="majorHAnsi" w:hAnsiTheme="majorHAnsi"/>
-          <w:sz w:val="24"/>
-          <w:szCs w:val="24"/>
-        </w:rPr>
-      </w:pPr>
-      <w:r>
-        <w:rPr>
-          <w:rFonts w:asciiTheme="majorHAnsi" w:hAnsiTheme="majorHAnsi"/>
-          <w:sz w:val="24"/>
-          <w:szCs w:val="24"/>
-        </w:rPr>
-        <w:t>Mention any two use cases of graph databases.</w:t>
+          <w:rFonts w:ascii="Cambria" w:hAnsi="Cambria"/>
+          <w:sz w:val="24"/>
+          <w:szCs w:val="24"/>
+        </w:rPr>
+      </w:pPr>
+      <w:r>
+        <w:rPr>
+          <w:rFonts w:ascii="Cambria" w:hAnsi="Cambria"/>
+          <w:sz w:val="24"/>
+          <w:szCs w:val="24"/>
+        </w:rPr>
+        <w:t>Differentiate between master-slave replication and peer-to-peer replication.</w:t>
       </w:r>
     </w:p>
     <w:p>
@@ -949,18 +1074,709 @@
         <w:ind w:left="741" w:hanging="358"/>
         <w:jc w:val="both"/>
         <w:rPr>
-          <w:rFonts w:asciiTheme="majorHAnsi" w:hAnsiTheme="majorHAnsi"/>
-          <w:sz w:val="24"/>
-          <w:szCs w:val="24"/>
-        </w:rPr>
-      </w:pPr>
-      <w:r>
-        <w:rPr>
-          <w:rFonts w:asciiTheme="majorHAnsi" w:hAnsiTheme="majorHAnsi"/>
+          <w:rFonts w:ascii="Cambria" w:hAnsi="Cambria"/>
+          <w:sz w:val="24"/>
+          <w:szCs w:val="24"/>
+        </w:rPr>
+      </w:pPr>
+      <w:r>
+        <w:rPr>
+          <w:rFonts w:ascii="Cambria" w:hAnsi="Cambria" w:cstheme="minorHAnsi"/>
+          <w:sz w:val="24"/>
+          <w:szCs w:val="24"/>
+        </w:rPr>
+        <w:t>List two common use cases of document databases.</w:t>
+      </w:r>
+    </w:p>
+    <w:p>
+      <w:pPr>
+        <w:pStyle w:val="ListParagraph"/>
+        <w:numPr>
+          <w:ilvl w:val="0"/>
+          <w:numId w:val="5"/>
+        </w:numPr>
+        <w:tabs>
+          <w:tab w:val="left" w:pos="741"/>
+        </w:tabs>
+        <w:spacing w:before="21"/>
+        <w:ind w:left="741" w:hanging="358"/>
+        <w:jc w:val="both"/>
+        <w:rPr>
+          <w:rFonts w:ascii="Cambria" w:hAnsi="Cambria"/>
+          <w:sz w:val="24"/>
+          <w:szCs w:val="24"/>
+        </w:rPr>
+      </w:pPr>
+      <w:r>
+        <w:rPr>
+          <w:rFonts w:ascii="Cambria" w:hAnsi="Cambria"/>
+          <w:sz w:val="24"/>
+          <w:szCs w:val="24"/>
+        </w:rPr>
+        <w:t>What is a column-family store? Name two popular systems that use it.</w:t>
+      </w:r>
+    </w:p>
+    <w:p>
+      <w:pPr>
+        <w:pStyle w:val="ListParagraph"/>
+        <w:numPr>
+          <w:ilvl w:val="0"/>
+          <w:numId w:val="5"/>
+        </w:numPr>
+        <w:tabs>
+          <w:tab w:val="left" w:pos="741"/>
+        </w:tabs>
+        <w:spacing w:before="21"/>
+        <w:ind w:left="741" w:hanging="358"/>
+        <w:jc w:val="both"/>
+        <w:rPr>
+          <w:rFonts w:ascii="Cambria" w:hAnsi="Cambria"/>
+          <w:sz w:val="24"/>
+          <w:szCs w:val="24"/>
+        </w:rPr>
+      </w:pPr>
+      <w:r>
+        <w:rPr>
+          <w:rFonts w:ascii="Cambria" w:hAnsi="Cambria"/>
+          <w:sz w:val="24"/>
+          <w:szCs w:val="24"/>
+        </w:rPr>
+        <w:t>What is meant by “eventual consistency” in distributed systems?</w:t>
+      </w:r>
+    </w:p>
+    <w:p>
+      <w:pPr>
+        <w:pStyle w:val="ListParagraph"/>
+        <w:numPr>
+          <w:ilvl w:val="0"/>
+          <w:numId w:val="5"/>
+        </w:numPr>
+        <w:tabs>
+          <w:tab w:val="left" w:pos="741"/>
+        </w:tabs>
+        <w:spacing w:before="21"/>
+        <w:ind w:left="741" w:hanging="358"/>
+        <w:jc w:val="both"/>
+        <w:rPr>
+          <w:rFonts w:ascii="Cambria" w:hAnsi="Cambria"/>
+          <w:sz w:val="24"/>
+          <w:szCs w:val="24"/>
+        </w:rPr>
+      </w:pPr>
+      <w:r>
+        <w:rPr>
+          <w:rFonts w:ascii="Cambria" w:hAnsi="Cambria" w:cstheme="minorHAnsi"/>
+          <w:sz w:val="24"/>
+          <w:szCs w:val="24"/>
+        </w:rPr>
+        <w:t>Explain the term single server model in NoSQL.</w:t>
+      </w:r>
+    </w:p>
+    <w:p>
+      <w:pPr>
+        <w:pStyle w:val="ListParagraph"/>
+        <w:numPr>
+          <w:ilvl w:val="0"/>
+          <w:numId w:val="5"/>
+        </w:numPr>
+        <w:tabs>
+          <w:tab w:val="left" w:pos="741"/>
+        </w:tabs>
+        <w:spacing w:before="21"/>
+        <w:ind w:left="741" w:hanging="358"/>
+        <w:jc w:val="both"/>
+        <w:rPr>
+          <w:rFonts w:ascii="Cambria" w:hAnsi="Cambria"/>
+          <w:sz w:val="24"/>
+          <w:szCs w:val="24"/>
+        </w:rPr>
+      </w:pPr>
+      <w:r>
+        <w:rPr>
+          <w:rFonts w:ascii="Cambria" w:hAnsi="Cambria"/>
+          <w:sz w:val="24"/>
+          <w:szCs w:val="24"/>
+        </w:rPr>
+        <w:t>Illustrate the 'Map' phase of the Map-Reduce framework with a simple example.</w:t>
+      </w:r>
+    </w:p>
+    <w:p>
+      <w:pPr>
+        <w:pStyle w:val="ListParagraph"/>
+        <w:numPr>
+          <w:ilvl w:val="0"/>
+          <w:numId w:val="5"/>
+        </w:numPr>
+        <w:tabs>
+          <w:tab w:val="left" w:pos="741"/>
+        </w:tabs>
+        <w:spacing w:before="21"/>
+        <w:ind w:left="741" w:hanging="358"/>
+        <w:jc w:val="both"/>
+        <w:rPr>
+          <w:rFonts w:ascii="Cambria" w:hAnsi="Cambria"/>
+          <w:sz w:val="24"/>
+          <w:szCs w:val="24"/>
+        </w:rPr>
+      </w:pPr>
+      <w:r>
+        <w:rPr>
+          <w:rFonts w:ascii="Cambria" w:hAnsi="Cambria" w:cstheme="minorHAnsi"/>
+          <w:sz w:val="24"/>
+          <w:szCs w:val="24"/>
+        </w:rPr>
+        <w:t>State one advantage of schema flexibility in document-oriented databases.</w:t>
+      </w:r>
+    </w:p>
+    <w:p>
+      <w:pPr>
+        <w:pStyle w:val="ListParagraph"/>
+        <w:numPr>
+          <w:ilvl w:val="0"/>
+          <w:numId w:val="5"/>
+        </w:numPr>
+        <w:tabs>
+          <w:tab w:val="left" w:pos="741"/>
+        </w:tabs>
+        <w:spacing w:before="21"/>
+        <w:ind w:left="741" w:hanging="358"/>
+        <w:jc w:val="both"/>
+        <w:rPr>
+          <w:rFonts w:ascii="Cambria" w:hAnsi="Cambria"/>
+          <w:sz w:val="24"/>
+          <w:szCs w:val="24"/>
+        </w:rPr>
+      </w:pPr>
+      <w:r>
+        <w:rPr>
+          <w:rFonts w:ascii="Cambria" w:hAnsi="Cambria"/>
+          <w:sz w:val="24"/>
+          <w:szCs w:val="24"/>
+        </w:rPr>
+        <w:t>What is a version stamp in distributed databases? Why is it required?</w:t>
+      </w:r>
+    </w:p>
+    <w:p>
+      <w:pPr>
+        <w:pStyle w:val="ListParagraph"/>
+        <w:numPr>
+          <w:ilvl w:val="0"/>
+          <w:numId w:val="5"/>
+        </w:numPr>
+        <w:tabs>
+          <w:tab w:val="left" w:pos="741"/>
+        </w:tabs>
+        <w:spacing w:before="21"/>
+        <w:ind w:left="741" w:hanging="358"/>
+        <w:jc w:val="both"/>
+        <w:rPr>
+          <w:rFonts w:ascii="Cambria" w:hAnsi="Cambria"/>
+          <w:sz w:val="24"/>
+          <w:szCs w:val="24"/>
+        </w:rPr>
+      </w:pPr>
+      <w:r>
+        <w:rPr>
+          <w:rFonts w:ascii="Cambria" w:hAnsi="Cambria"/>
+          <w:sz w:val="24"/>
+          <w:szCs w:val="24"/>
+        </w:rPr>
+        <w:t>What is the role of aggregates in aggregate-oriented data models?</w:t>
+      </w:r>
+    </w:p>
+    <w:p>
+      <w:pPr>
+        <w:pStyle w:val="ListParagraph"/>
+        <w:numPr>
+          <w:ilvl w:val="0"/>
+          <w:numId w:val="5"/>
+        </w:numPr>
+        <w:tabs>
+          <w:tab w:val="left" w:pos="741"/>
+        </w:tabs>
+        <w:spacing w:before="21"/>
+        <w:ind w:left="741" w:hanging="358"/>
+        <w:jc w:val="both"/>
+        <w:rPr>
+          <w:rFonts w:ascii="Cambria" w:hAnsi="Cambria"/>
+          <w:sz w:val="24"/>
+          <w:szCs w:val="24"/>
+        </w:rPr>
+      </w:pPr>
+      <w:r>
+        <w:rPr>
+          <w:rFonts w:ascii="Cambria" w:hAnsi="Cambria" w:cstheme="minorHAnsi"/>
+          <w:sz w:val="24"/>
+          <w:szCs w:val="24"/>
+        </w:rPr>
+        <w:t>What is the role of quorums in distributed databases?</w:t>
+      </w:r>
+    </w:p>
+    <w:p>
+      <w:pPr>
+        <w:pStyle w:val="ListParagraph"/>
+        <w:numPr>
+          <w:ilvl w:val="0"/>
+          <w:numId w:val="5"/>
+        </w:numPr>
+        <w:tabs>
+          <w:tab w:val="left" w:pos="741"/>
+        </w:tabs>
+        <w:spacing w:before="21"/>
+        <w:ind w:left="741" w:hanging="358"/>
+        <w:jc w:val="both"/>
+        <w:rPr>
+          <w:rFonts w:ascii="Cambria" w:hAnsi="Cambria"/>
+          <w:sz w:val="24"/>
+          <w:szCs w:val="24"/>
+        </w:rPr>
+      </w:pPr>
+      <w:r>
+        <w:rPr>
+          <w:rFonts w:ascii="Cambria" w:hAnsi="Cambria"/>
+          <w:sz w:val="24"/>
+          <w:szCs w:val="24"/>
+        </w:rPr>
+        <w:t>Why are Key-Value stores not suitable for querying by data values or set operations?</w:t>
+      </w:r>
+    </w:p>
+    <w:p>
+      <w:pPr>
+        <w:pStyle w:val="ListParagraph"/>
+        <w:numPr>
+          <w:ilvl w:val="0"/>
+          <w:numId w:val="5"/>
+        </w:numPr>
+        <w:tabs>
+          <w:tab w:val="left" w:pos="741"/>
+        </w:tabs>
+        <w:spacing w:before="21"/>
+        <w:ind w:left="741" w:hanging="358"/>
+        <w:jc w:val="both"/>
+        <w:rPr>
+          <w:rFonts w:ascii="Cambria" w:hAnsi="Cambria"/>
+          <w:sz w:val="24"/>
+          <w:szCs w:val="24"/>
+        </w:rPr>
+      </w:pPr>
+      <w:r>
+        <w:rPr>
+          <w:rFonts w:ascii="Cambria" w:hAnsi="Cambria" w:cstheme="minorHAnsi"/>
+          <w:sz w:val="24"/>
+          <w:szCs w:val="24"/>
+        </w:rPr>
+        <w:t>What are the two main components of a graph database?</w:t>
+      </w:r>
+    </w:p>
+    <w:p>
+      <w:pPr>
+        <w:pStyle w:val="ListParagraph"/>
+        <w:numPr>
+          <w:ilvl w:val="0"/>
+          <w:numId w:val="5"/>
+        </w:numPr>
+        <w:tabs>
+          <w:tab w:val="left" w:pos="741"/>
+        </w:tabs>
+        <w:spacing w:before="21"/>
+        <w:ind w:left="741" w:hanging="358"/>
+        <w:jc w:val="both"/>
+        <w:rPr>
+          <w:rFonts w:ascii="Cambria" w:hAnsi="Cambria"/>
+          <w:sz w:val="24"/>
+          <w:szCs w:val="24"/>
+        </w:rPr>
+      </w:pPr>
+      <w:r>
+        <w:rPr>
+          <w:rFonts w:ascii="Cambria" w:hAnsi="Cambria"/>
+          <w:sz w:val="24"/>
+          <w:szCs w:val="24"/>
+        </w:rPr>
+        <w:t>Explain the difference between update consistency and read consistency.</w:t>
+      </w:r>
+    </w:p>
+    <w:p>
+      <w:pPr>
+        <w:pStyle w:val="ListParagraph"/>
+        <w:numPr>
+          <w:ilvl w:val="0"/>
+          <w:numId w:val="5"/>
+        </w:numPr>
+        <w:tabs>
+          <w:tab w:val="left" w:pos="741"/>
+        </w:tabs>
+        <w:spacing w:before="21"/>
+        <w:ind w:left="741" w:hanging="358"/>
+        <w:jc w:val="both"/>
+        <w:rPr>
+          <w:rFonts w:ascii="Cambria" w:hAnsi="Cambria"/>
+          <w:sz w:val="24"/>
+          <w:szCs w:val="24"/>
+        </w:rPr>
+      </w:pPr>
+      <w:r>
+        <w:rPr>
+          <w:rFonts w:ascii="Cambria" w:hAnsi="Cambria" w:cstheme="minorHAnsi"/>
+          <w:sz w:val="24"/>
+          <w:szCs w:val="24"/>
+        </w:rPr>
+        <w:t>Give one real-world example of a key-value database and its purpose.</w:t>
+      </w:r>
+    </w:p>
+    <w:p>
+      <w:pPr>
+        <w:pStyle w:val="ListParagraph"/>
+        <w:numPr>
+          <w:ilvl w:val="0"/>
+          <w:numId w:val="5"/>
+        </w:numPr>
+        <w:tabs>
+          <w:tab w:val="left" w:pos="741"/>
+        </w:tabs>
+        <w:spacing w:before="21"/>
+        <w:ind w:left="741" w:hanging="358"/>
+        <w:jc w:val="both"/>
+        <w:rPr>
+          <w:rFonts w:ascii="Cambria" w:hAnsi="Cambria"/>
+          <w:sz w:val="24"/>
+          <w:szCs w:val="24"/>
+        </w:rPr>
+      </w:pPr>
+      <w:r>
+        <w:rPr>
+          <w:rFonts w:ascii="Cambria" w:hAnsi="Cambria"/>
+          <w:sz w:val="24"/>
+          <w:szCs w:val="24"/>
+        </w:rPr>
+        <w:t>What do you mean by “relaxing durability” in distributed databases?</w:t>
+      </w:r>
+    </w:p>
+    <w:p>
+      <w:pPr>
+        <w:pStyle w:val="ListParagraph"/>
+        <w:numPr>
+          <w:ilvl w:val="0"/>
+          <w:numId w:val="5"/>
+        </w:numPr>
+        <w:tabs>
+          <w:tab w:val="left" w:pos="741"/>
+        </w:tabs>
+        <w:spacing w:before="21"/>
+        <w:ind w:left="741" w:hanging="358"/>
+        <w:jc w:val="both"/>
+        <w:rPr>
+          <w:rFonts w:ascii="Cambria" w:hAnsi="Cambria"/>
+          <w:sz w:val="24"/>
+          <w:szCs w:val="24"/>
+        </w:rPr>
+      </w:pPr>
+      <w:r>
+        <w:rPr>
+          <w:rFonts w:ascii="Cambria" w:hAnsi="Cambria" w:cstheme="minorHAnsi"/>
+          <w:sz w:val="24"/>
+          <w:szCs w:val="24"/>
+        </w:rPr>
+        <w:t>Mention any two applications of graph databases.</w:t>
+      </w:r>
+    </w:p>
+    <w:p>
+      <w:pPr>
+        <w:pStyle w:val="ListParagraph"/>
+        <w:numPr>
+          <w:ilvl w:val="0"/>
+          <w:numId w:val="5"/>
+        </w:numPr>
+        <w:tabs>
+          <w:tab w:val="left" w:pos="741"/>
+        </w:tabs>
+        <w:spacing w:before="21"/>
+        <w:ind w:left="741" w:hanging="358"/>
+        <w:jc w:val="both"/>
+        <w:rPr>
+          <w:rFonts w:ascii="Cambria" w:hAnsi="Cambria"/>
+          <w:sz w:val="24"/>
+          <w:szCs w:val="24"/>
+        </w:rPr>
+      </w:pPr>
+      <w:r>
+        <w:rPr>
+          <w:rFonts w:ascii="Cambria" w:hAnsi="Cambria"/>
+          <w:sz w:val="24"/>
+          <w:szCs w:val="24"/>
+        </w:rPr>
+        <w:t>Analyze a scenario where a Document-Oriented database would be a more suitable choice than a Relational database for a Content Management System.</w:t>
+      </w:r>
+    </w:p>
+    <w:p>
+      <w:pPr>
+        <w:pStyle w:val="ListParagraph"/>
+        <w:numPr>
+          <w:ilvl w:val="0"/>
+          <w:numId w:val="5"/>
+        </w:numPr>
+        <w:tabs>
+          <w:tab w:val="left" w:pos="741"/>
+        </w:tabs>
+        <w:spacing w:before="21"/>
+        <w:ind w:left="741" w:hanging="358"/>
+        <w:jc w:val="both"/>
+        <w:rPr>
+          <w:rFonts w:ascii="Cambria" w:hAnsi="Cambria"/>
+          <w:sz w:val="24"/>
+          <w:szCs w:val="24"/>
+        </w:rPr>
+      </w:pPr>
+      <w:r>
+        <w:rPr>
+          <w:rFonts w:ascii="Cambria" w:hAnsi="Cambria" w:cstheme="minorHAnsi"/>
+          <w:sz w:val="24"/>
+          <w:szCs w:val="24"/>
+        </w:rPr>
+        <w:t xml:space="preserve">What is </w:t>
+      </w:r>
+      <w:proofErr w:type="spellStart"/>
+      <w:r>
+        <w:rPr>
+          <w:rFonts w:ascii="Cambria" w:hAnsi="Cambria" w:cstheme="minorHAnsi"/>
+          <w:sz w:val="24"/>
+          <w:szCs w:val="24"/>
+        </w:rPr>
+        <w:t>MapReduce</w:t>
+      </w:r>
+      <w:proofErr w:type="spellEnd"/>
+      <w:r>
+        <w:rPr>
+          <w:rFonts w:ascii="Cambria" w:hAnsi="Cambria" w:cstheme="minorHAnsi"/>
+          <w:sz w:val="24"/>
+          <w:szCs w:val="24"/>
+        </w:rPr>
+        <w:t xml:space="preserve"> in NoSQL systems?</w:t>
+      </w:r>
+    </w:p>
+    <w:p>
+      <w:pPr>
+        <w:pStyle w:val="ListParagraph"/>
+        <w:numPr>
+          <w:ilvl w:val="0"/>
+          <w:numId w:val="5"/>
+        </w:numPr>
+        <w:tabs>
+          <w:tab w:val="left" w:pos="741"/>
+        </w:tabs>
+        <w:spacing w:before="21"/>
+        <w:ind w:left="741" w:hanging="358"/>
+        <w:jc w:val="both"/>
+        <w:rPr>
+          <w:rFonts w:ascii="Cambria" w:hAnsi="Cambria"/>
+          <w:sz w:val="24"/>
+          <w:szCs w:val="24"/>
+        </w:rPr>
+      </w:pPr>
+      <w:r>
+        <w:rPr>
+          <w:rFonts w:ascii="Cambria" w:hAnsi="Cambria" w:cstheme="minorHAnsi"/>
+          <w:sz w:val="24"/>
+          <w:szCs w:val="24"/>
+        </w:rPr>
+        <w:t>What is the structure of a document in a document database?</w:t>
+      </w:r>
+    </w:p>
+    <w:p>
+      <w:pPr>
+        <w:pStyle w:val="ListParagraph"/>
+        <w:numPr>
+          <w:ilvl w:val="0"/>
+          <w:numId w:val="5"/>
+        </w:numPr>
+        <w:tabs>
+          <w:tab w:val="left" w:pos="741"/>
+        </w:tabs>
+        <w:spacing w:before="21"/>
+        <w:ind w:left="741" w:hanging="358"/>
+        <w:jc w:val="both"/>
+        <w:rPr>
+          <w:rFonts w:ascii="Cambria" w:hAnsi="Cambria"/>
+          <w:sz w:val="24"/>
+          <w:szCs w:val="24"/>
+        </w:rPr>
+      </w:pPr>
+      <w:r>
+        <w:rPr>
+          <w:rFonts w:ascii="Cambria" w:hAnsi="Cambria" w:cstheme="minorHAnsi"/>
+          <w:sz w:val="24"/>
+          <w:szCs w:val="24"/>
+        </w:rPr>
+        <w:t>State one difference between relational and aggregate-based data models.</w:t>
+      </w:r>
+    </w:p>
+    <w:p>
+      <w:pPr>
+        <w:pStyle w:val="ListParagraph"/>
+        <w:numPr>
+          <w:ilvl w:val="0"/>
+          <w:numId w:val="5"/>
+        </w:numPr>
+        <w:tabs>
+          <w:tab w:val="left" w:pos="741"/>
+        </w:tabs>
+        <w:spacing w:before="21"/>
+        <w:ind w:left="741" w:hanging="358"/>
+        <w:jc w:val="both"/>
+        <w:rPr>
+          <w:rFonts w:ascii="Cambria" w:hAnsi="Cambria"/>
+          <w:sz w:val="24"/>
+          <w:szCs w:val="24"/>
+        </w:rPr>
+      </w:pPr>
+      <w:r>
+        <w:rPr>
+          <w:rFonts w:ascii="Cambria" w:hAnsi="Cambria"/>
+          <w:sz w:val="24"/>
+          <w:szCs w:val="24"/>
+        </w:rPr>
+        <w:t>How does replication improve fault tolerance in distributed databases?</w:t>
+      </w:r>
+    </w:p>
+    <w:p>
+      <w:pPr>
+        <w:pStyle w:val="ListParagraph"/>
+        <w:numPr>
+          <w:ilvl w:val="0"/>
+          <w:numId w:val="5"/>
+        </w:numPr>
+        <w:tabs>
+          <w:tab w:val="left" w:pos="741"/>
+        </w:tabs>
+        <w:spacing w:before="21"/>
+        <w:ind w:left="741" w:hanging="358"/>
+        <w:jc w:val="both"/>
+        <w:rPr>
+          <w:rFonts w:ascii="Cambria" w:hAnsi="Cambria"/>
+          <w:sz w:val="24"/>
+          <w:szCs w:val="24"/>
+        </w:rPr>
+      </w:pPr>
+      <w:r>
+        <w:rPr>
+          <w:rFonts w:ascii="Cambria" w:hAnsi="Cambria"/>
+          <w:sz w:val="24"/>
+          <w:szCs w:val="24"/>
+        </w:rPr>
+        <w:lastRenderedPageBreak/>
+        <w:t>What are the potential challenges of using a document database for applications requiring complex transactions across different documents?</w:t>
+      </w:r>
+    </w:p>
+    <w:p>
+      <w:pPr>
+        <w:pStyle w:val="ListParagraph"/>
+        <w:numPr>
+          <w:ilvl w:val="0"/>
+          <w:numId w:val="5"/>
+        </w:numPr>
+        <w:tabs>
+          <w:tab w:val="left" w:pos="741"/>
+        </w:tabs>
+        <w:spacing w:before="21"/>
+        <w:ind w:left="741" w:hanging="358"/>
+        <w:jc w:val="both"/>
+        <w:rPr>
+          <w:rFonts w:ascii="Cambria" w:hAnsi="Cambria"/>
+          <w:sz w:val="24"/>
+          <w:szCs w:val="24"/>
+        </w:rPr>
+      </w:pPr>
+      <w:r>
+        <w:rPr>
+          <w:rFonts w:ascii="Cambria" w:hAnsi="Cambria"/>
+          <w:sz w:val="24"/>
+          <w:szCs w:val="24"/>
+        </w:rPr>
+        <w:t>Mention any two use cases of graph databases.</w:t>
+      </w:r>
+    </w:p>
+    <w:p>
+      <w:pPr>
+        <w:pStyle w:val="ListParagraph"/>
+        <w:numPr>
+          <w:ilvl w:val="0"/>
+          <w:numId w:val="5"/>
+        </w:numPr>
+        <w:tabs>
+          <w:tab w:val="left" w:pos="741"/>
+        </w:tabs>
+        <w:spacing w:before="21"/>
+        <w:ind w:left="741" w:hanging="358"/>
+        <w:jc w:val="both"/>
+        <w:rPr>
+          <w:rFonts w:ascii="Cambria" w:hAnsi="Cambria"/>
+          <w:sz w:val="24"/>
+          <w:szCs w:val="24"/>
+        </w:rPr>
+      </w:pPr>
+      <w:r>
+        <w:rPr>
+          <w:rFonts w:ascii="Cambria" w:hAnsi="Cambria"/>
+          <w:sz w:val="24"/>
+          <w:szCs w:val="24"/>
+        </w:rPr>
+        <w:t>Evaluate why a Graph Database is exceptionally efficient for running recommendation engine algorithms.</w:t>
+      </w:r>
+    </w:p>
+    <w:p>
+      <w:pPr>
+        <w:pStyle w:val="ListParagraph"/>
+        <w:numPr>
+          <w:ilvl w:val="0"/>
+          <w:numId w:val="5"/>
+        </w:numPr>
+        <w:tabs>
+          <w:tab w:val="left" w:pos="741"/>
+        </w:tabs>
+        <w:spacing w:before="21"/>
+        <w:ind w:left="741" w:hanging="358"/>
+        <w:jc w:val="both"/>
+        <w:rPr>
+          <w:rFonts w:ascii="Cambria" w:hAnsi="Cambria"/>
+          <w:sz w:val="24"/>
+          <w:szCs w:val="24"/>
+        </w:rPr>
+      </w:pPr>
+      <w:r>
+        <w:rPr>
+          <w:rFonts w:ascii="Cambria" w:hAnsi="Cambria"/>
           <w:sz w:val="24"/>
           <w:szCs w:val="24"/>
         </w:rPr>
         <w:t>What is the role of materialized views in query optimization?</w:t>
+      </w:r>
+    </w:p>
+    <w:p>
+      <w:pPr>
+        <w:pStyle w:val="ListParagraph"/>
+        <w:numPr>
+          <w:ilvl w:val="0"/>
+          <w:numId w:val="5"/>
+        </w:numPr>
+        <w:tabs>
+          <w:tab w:val="left" w:pos="741"/>
+        </w:tabs>
+        <w:spacing w:before="21"/>
+        <w:ind w:left="741" w:hanging="358"/>
+        <w:jc w:val="both"/>
+        <w:rPr>
+          <w:rFonts w:ascii="Cambria" w:hAnsi="Cambria"/>
+          <w:sz w:val="24"/>
+          <w:szCs w:val="24"/>
+        </w:rPr>
+      </w:pPr>
+      <w:r>
+        <w:rPr>
+          <w:rFonts w:ascii="Cambria" w:hAnsi="Cambria"/>
+          <w:sz w:val="24"/>
+          <w:szCs w:val="24"/>
+        </w:rPr>
+        <w:t>In the context of Graph Databases, why is the "Availability" characteristic often a challenge in cluster configurations?</w:t>
       </w:r>
     </w:p>
     <w:p>
@@ -969,7 +1785,7 @@
         <w:spacing w:before="202"/>
         <w:ind w:left="0" w:firstLine="0"/>
         <w:rPr>
-          <w:rFonts w:asciiTheme="majorHAnsi" w:hAnsiTheme="majorHAnsi"/>
+          <w:rFonts w:ascii="Cambria" w:hAnsi="Cambria"/>
         </w:rPr>
       </w:pPr>
     </w:p>
@@ -982,7 +1798,7 @@
         </w:numPr>
         <w:jc w:val="both"/>
         <w:rPr>
-          <w:rFonts w:asciiTheme="majorHAnsi" w:hAnsiTheme="majorHAnsi"/>
+          <w:rFonts w:ascii="Cambria" w:hAnsi="Cambria"/>
           <w:b/>
           <w:sz w:val="24"/>
           <w:szCs w:val="24"/>
@@ -990,7 +1806,7 @@
       </w:pPr>
       <w:r>
         <w:rPr>
-          <w:rFonts w:asciiTheme="majorHAnsi" w:hAnsiTheme="majorHAnsi"/>
+          <w:rFonts w:ascii="Cambria" w:hAnsi="Cambria"/>
           <w:b/>
           <w:sz w:val="24"/>
           <w:szCs w:val="24"/>
@@ -1000,7 +1816,7 @@
       </w:r>
       <w:r>
         <w:rPr>
-          <w:rFonts w:asciiTheme="majorHAnsi" w:hAnsiTheme="majorHAnsi"/>
+          <w:rFonts w:ascii="Cambria" w:hAnsi="Cambria"/>
           <w:b/>
           <w:spacing w:val="-3"/>
           <w:sz w:val="24"/>
@@ -1011,7 +1827,7 @@
       </w:r>
       <w:r>
         <w:rPr>
-          <w:rFonts w:asciiTheme="majorHAnsi" w:hAnsiTheme="majorHAnsi"/>
+          <w:rFonts w:ascii="Cambria" w:hAnsi="Cambria"/>
           <w:b/>
           <w:spacing w:val="-2"/>
           <w:sz w:val="24"/>
@@ -1035,14 +1851,14 @@
         <w:ind w:right="20"/>
         <w:jc w:val="both"/>
         <w:rPr>
-          <w:rFonts w:asciiTheme="majorHAnsi" w:hAnsiTheme="majorHAnsi"/>
-          <w:sz w:val="24"/>
-          <w:szCs w:val="24"/>
-        </w:rPr>
-      </w:pPr>
-      <w:r>
-        <w:rPr>
-          <w:rFonts w:asciiTheme="majorHAnsi" w:hAnsiTheme="majorHAnsi"/>
+          <w:rFonts w:ascii="Cambria" w:hAnsi="Cambria"/>
+          <w:sz w:val="24"/>
+          <w:szCs w:val="24"/>
+        </w:rPr>
+      </w:pPr>
+      <w:r>
+        <w:rPr>
+          <w:rFonts w:ascii="Cambria" w:hAnsi="Cambria"/>
           <w:sz w:val="24"/>
           <w:szCs w:val="24"/>
         </w:rPr>
@@ -1051,7 +1867,7 @@
       <w:r>
         <w:rPr>
           <w:rStyle w:val="Strong"/>
-          <w:rFonts w:asciiTheme="majorHAnsi" w:hAnsiTheme="majorHAnsi"/>
+          <w:rFonts w:ascii="Cambria" w:hAnsi="Cambria"/>
           <w:sz w:val="24"/>
           <w:szCs w:val="24"/>
         </w:rPr>
@@ -1059,7 +1875,7 @@
       </w:r>
       <w:r>
         <w:rPr>
-          <w:rFonts w:asciiTheme="majorHAnsi" w:hAnsiTheme="majorHAnsi"/>
+          <w:rFonts w:ascii="Cambria" w:hAnsi="Cambria"/>
           <w:sz w:val="24"/>
           <w:szCs w:val="24"/>
         </w:rPr>
@@ -1068,7 +1884,7 @@
       <w:r>
         <w:rPr>
           <w:rStyle w:val="Strong"/>
-          <w:rFonts w:asciiTheme="majorHAnsi" w:hAnsiTheme="majorHAnsi"/>
+          <w:rFonts w:ascii="Cambria" w:hAnsi="Cambria"/>
           <w:sz w:val="24"/>
           <w:szCs w:val="24"/>
         </w:rPr>
@@ -1076,7 +1892,7 @@
       </w:r>
       <w:r>
         <w:rPr>
-          <w:rFonts w:asciiTheme="majorHAnsi" w:hAnsiTheme="majorHAnsi"/>
+          <w:rFonts w:ascii="Cambria" w:hAnsi="Cambria"/>
           <w:sz w:val="24"/>
           <w:szCs w:val="24"/>
         </w:rPr>
@@ -1097,14 +1913,42 @@
         <w:ind w:right="20"/>
         <w:jc w:val="both"/>
         <w:rPr>
-          <w:rFonts w:asciiTheme="majorHAnsi" w:hAnsiTheme="majorHAnsi"/>
-          <w:sz w:val="24"/>
-          <w:szCs w:val="24"/>
-        </w:rPr>
-      </w:pPr>
-      <w:r>
-        <w:rPr>
-          <w:rFonts w:asciiTheme="majorHAnsi" w:hAnsiTheme="majorHAnsi"/>
+          <w:rFonts w:ascii="Cambria" w:hAnsi="Cambria"/>
+          <w:sz w:val="24"/>
+          <w:szCs w:val="24"/>
+        </w:rPr>
+      </w:pPr>
+      <w:r>
+        <w:rPr>
+          <w:rFonts w:ascii="Cambria" w:hAnsi="Cambria"/>
+          <w:sz w:val="24"/>
+          <w:szCs w:val="24"/>
+        </w:rPr>
+        <w:t>Explain the consequences of using an Aggregate-Oriented data model. How does it affect data relationships and scalability?</w:t>
+      </w:r>
+    </w:p>
+    <w:p>
+      <w:pPr>
+        <w:pStyle w:val="ListParagraph"/>
+        <w:numPr>
+          <w:ilvl w:val="0"/>
+          <w:numId w:val="1"/>
+        </w:numPr>
+        <w:tabs>
+          <w:tab w:val="left" w:pos="743"/>
+        </w:tabs>
+        <w:spacing w:before="180" w:line="276" w:lineRule="auto"/>
+        <w:ind w:right="20"/>
+        <w:jc w:val="both"/>
+        <w:rPr>
+          <w:rFonts w:ascii="Cambria" w:hAnsi="Cambria"/>
+          <w:sz w:val="24"/>
+          <w:szCs w:val="24"/>
+        </w:rPr>
+      </w:pPr>
+      <w:r>
+        <w:rPr>
+          <w:rFonts w:ascii="Cambria" w:hAnsi="Cambria"/>
           <w:sz w:val="24"/>
           <w:szCs w:val="24"/>
         </w:rPr>
@@ -1125,14 +1969,14 @@
         <w:ind w:right="23"/>
         <w:jc w:val="both"/>
         <w:rPr>
-          <w:rFonts w:asciiTheme="majorHAnsi" w:hAnsiTheme="majorHAnsi"/>
-          <w:sz w:val="24"/>
-          <w:szCs w:val="24"/>
-        </w:rPr>
-      </w:pPr>
-      <w:r>
-        <w:rPr>
-          <w:rFonts w:asciiTheme="majorHAnsi" w:hAnsiTheme="majorHAnsi"/>
+          <w:rFonts w:ascii="Cambria" w:hAnsi="Cambria"/>
+          <w:sz w:val="24"/>
+          <w:szCs w:val="24"/>
+        </w:rPr>
+      </w:pPr>
+      <w:r>
+        <w:rPr>
+          <w:rFonts w:ascii="Cambria" w:hAnsi="Cambria"/>
           <w:sz w:val="24"/>
           <w:szCs w:val="24"/>
         </w:rPr>
@@ -1153,18 +1997,136 @@
         <w:ind w:right="23"/>
         <w:jc w:val="both"/>
         <w:rPr>
-          <w:rFonts w:asciiTheme="majorHAnsi" w:hAnsiTheme="majorHAnsi"/>
-          <w:sz w:val="24"/>
-          <w:szCs w:val="24"/>
-        </w:rPr>
-      </w:pPr>
-      <w:r>
-        <w:rPr>
-          <w:rFonts w:asciiTheme="majorHAnsi" w:hAnsiTheme="majorHAnsi"/>
+          <w:rFonts w:ascii="Cambria" w:hAnsi="Cambria"/>
+          <w:sz w:val="24"/>
+          <w:szCs w:val="24"/>
+        </w:rPr>
+      </w:pPr>
+      <w:r>
+        <w:rPr>
+          <w:rFonts w:ascii="Cambria" w:hAnsi="Cambria"/>
           <w:sz w:val="24"/>
           <w:szCs w:val="24"/>
         </w:rPr>
         <w:t>With an example, explain the impedance mismatch problem between object-oriented applications and relational databases.</w:t>
+      </w:r>
+    </w:p>
+    <w:p>
+      <w:pPr>
+        <w:pStyle w:val="ListParagraph"/>
+        <w:numPr>
+          <w:ilvl w:val="0"/>
+          <w:numId w:val="1"/>
+        </w:numPr>
+        <w:tabs>
+          <w:tab w:val="left" w:pos="743"/>
+        </w:tabs>
+        <w:spacing w:before="1" w:line="276" w:lineRule="auto"/>
+        <w:ind w:right="23"/>
+        <w:jc w:val="both"/>
+        <w:rPr>
+          <w:rFonts w:ascii="Cambria" w:hAnsi="Cambria"/>
+          <w:sz w:val="24"/>
+          <w:szCs w:val="24"/>
+        </w:rPr>
+      </w:pPr>
+      <w:r>
+        <w:rPr>
+          <w:rFonts w:ascii="Cambria" w:hAnsi="Cambria" w:cstheme="minorHAnsi"/>
+          <w:sz w:val="24"/>
+          <w:szCs w:val="24"/>
+        </w:rPr>
+        <w:t xml:space="preserve">Define Key-value pair database?  Given a hash table size of 11. The keys are customer IDs (8983, 4556, 6778, </w:t>
+      </w:r>
+      <w:proofErr w:type="gramStart"/>
+      <w:r>
+        <w:rPr>
+          <w:rFonts w:ascii="Cambria" w:hAnsi="Cambria" w:cstheme="minorHAnsi"/>
+          <w:sz w:val="24"/>
+          <w:szCs w:val="24"/>
+        </w:rPr>
+        <w:t>7328</w:t>
+      </w:r>
+      <w:proofErr w:type="gramEnd"/>
+      <w:r>
+        <w:rPr>
+          <w:rFonts w:ascii="Cambria" w:hAnsi="Cambria" w:cstheme="minorHAnsi"/>
+          <w:sz w:val="24"/>
+          <w:szCs w:val="24"/>
+        </w:rPr>
+        <w:t>). Explain collision with diagram.</w:t>
+      </w:r>
+      <w:r>
+        <w:rPr>
+          <w:rFonts w:ascii="Cambria" w:hAnsi="Cambria" w:cstheme="minorHAnsi"/>
+          <w:sz w:val="24"/>
+          <w:szCs w:val="24"/>
+        </w:rPr>
+        <w:t xml:space="preserve"> </w:t>
+      </w:r>
+      <w:r>
+        <w:rPr>
+          <w:rFonts w:ascii="Cambria" w:hAnsi="Cambria" w:cstheme="minorHAnsi"/>
+          <w:sz w:val="24"/>
+          <w:szCs w:val="24"/>
+        </w:rPr>
+        <w:t>Explain chaining by considering suitable number of keys. Apply and draw hash mechanism for customer database where each customer documents holds id, name, last name, address.</w:t>
+      </w:r>
+    </w:p>
+    <w:p>
+      <w:pPr>
+        <w:pStyle w:val="ListParagraph"/>
+        <w:numPr>
+          <w:ilvl w:val="0"/>
+          <w:numId w:val="1"/>
+        </w:numPr>
+        <w:tabs>
+          <w:tab w:val="left" w:pos="743"/>
+        </w:tabs>
+        <w:spacing w:before="1" w:line="276" w:lineRule="auto"/>
+        <w:ind w:right="23"/>
+        <w:jc w:val="both"/>
+        <w:rPr>
+          <w:rFonts w:ascii="Cambria" w:hAnsi="Cambria"/>
+          <w:sz w:val="24"/>
+          <w:szCs w:val="24"/>
+        </w:rPr>
+      </w:pPr>
+      <w:r>
+        <w:rPr>
+          <w:rFonts w:ascii="Cambria" w:hAnsi="Cambria"/>
+          <w:sz w:val="24"/>
+          <w:szCs w:val="24"/>
+        </w:rPr>
+        <w:t>Differentiate between Key-Value and Document data models based on their structure and querying capabilities.</w:t>
+      </w:r>
+    </w:p>
+    <w:p>
+      <w:pPr>
+        <w:pStyle w:val="ListParagraph"/>
+        <w:numPr>
+          <w:ilvl w:val="0"/>
+          <w:numId w:val="1"/>
+        </w:numPr>
+        <w:tabs>
+          <w:tab w:val="left" w:pos="743"/>
+        </w:tabs>
+        <w:spacing w:before="1" w:line="276" w:lineRule="auto"/>
+        <w:ind w:right="23"/>
+        <w:jc w:val="both"/>
+        <w:rPr>
+          <w:rFonts w:ascii="Cambria" w:hAnsi="Cambria"/>
+          <w:sz w:val="24"/>
+          <w:szCs w:val="24"/>
+        </w:rPr>
+      </w:pPr>
+      <w:r>
+        <w:rPr>
+          <w:rFonts w:ascii="Cambria" w:hAnsi="Cambria"/>
+          <w:sz w:val="24"/>
+          <w:szCs w:val="24"/>
+        </w:rPr>
+        <w:t>Summarize the main reasons for the emergence of NoSQL databases.</w:t>
       </w:r>
     </w:p>
     <w:p>
@@ -1181,14 +2143,14 @@
         <w:ind w:right="25"/>
         <w:jc w:val="both"/>
         <w:rPr>
-          <w:rFonts w:asciiTheme="majorHAnsi" w:hAnsiTheme="majorHAnsi"/>
-          <w:sz w:val="24"/>
-          <w:szCs w:val="24"/>
-        </w:rPr>
-      </w:pPr>
-      <w:r>
-        <w:rPr>
-          <w:rFonts w:asciiTheme="majorHAnsi" w:hAnsiTheme="majorHAnsi"/>
+          <w:rFonts w:ascii="Cambria" w:hAnsi="Cambria"/>
+          <w:sz w:val="24"/>
+          <w:szCs w:val="24"/>
+        </w:rPr>
+      </w:pPr>
+      <w:r>
+        <w:rPr>
+          <w:rFonts w:ascii="Cambria" w:hAnsi="Cambria"/>
           <w:sz w:val="24"/>
           <w:szCs w:val="24"/>
         </w:rPr>
@@ -1197,7 +2159,7 @@
       <w:r>
         <w:rPr>
           <w:rStyle w:val="Strong"/>
-          <w:rFonts w:asciiTheme="majorHAnsi" w:hAnsiTheme="majorHAnsi"/>
+          <w:rFonts w:ascii="Cambria" w:hAnsi="Cambria"/>
           <w:sz w:val="24"/>
           <w:szCs w:val="24"/>
         </w:rPr>
@@ -1205,7 +2167,7 @@
       </w:r>
       <w:r>
         <w:rPr>
-          <w:rFonts w:asciiTheme="majorHAnsi" w:hAnsiTheme="majorHAnsi"/>
+          <w:rFonts w:ascii="Cambria" w:hAnsi="Cambria"/>
           <w:sz w:val="24"/>
           <w:szCs w:val="24"/>
         </w:rPr>
@@ -1213,7 +2175,7 @@
       </w:r>
       <w:r>
         <w:rPr>
-          <w:rFonts w:asciiTheme="majorHAnsi" w:hAnsiTheme="majorHAnsi"/>
+          <w:rFonts w:ascii="Cambria" w:hAnsi="Cambria"/>
           <w:sz w:val="24"/>
           <w:szCs w:val="24"/>
         </w:rPr>
@@ -1234,14 +2196,14 @@
         <w:ind w:right="25"/>
         <w:jc w:val="both"/>
         <w:rPr>
-          <w:rFonts w:asciiTheme="majorHAnsi" w:hAnsiTheme="majorHAnsi"/>
-          <w:sz w:val="24"/>
-          <w:szCs w:val="24"/>
-        </w:rPr>
-      </w:pPr>
-      <w:r>
-        <w:rPr>
-          <w:rFonts w:asciiTheme="majorHAnsi" w:hAnsiTheme="majorHAnsi"/>
+          <w:rFonts w:ascii="Cambria" w:hAnsi="Cambria"/>
+          <w:sz w:val="24"/>
+          <w:szCs w:val="24"/>
+        </w:rPr>
+      </w:pPr>
+      <w:r>
+        <w:rPr>
+          <w:rFonts w:ascii="Cambria" w:hAnsi="Cambria"/>
           <w:sz w:val="24"/>
           <w:szCs w:val="24"/>
         </w:rPr>
@@ -1262,14 +2224,14 @@
         <w:ind w:right="25"/>
         <w:jc w:val="both"/>
         <w:rPr>
-          <w:rFonts w:asciiTheme="majorHAnsi" w:hAnsiTheme="majorHAnsi"/>
-          <w:sz w:val="24"/>
-          <w:szCs w:val="24"/>
-        </w:rPr>
-      </w:pPr>
-      <w:r>
-        <w:rPr>
-          <w:rFonts w:asciiTheme="majorHAnsi" w:hAnsiTheme="majorHAnsi"/>
+          <w:rFonts w:ascii="Cambria" w:hAnsi="Cambria"/>
+          <w:sz w:val="24"/>
+          <w:szCs w:val="24"/>
+        </w:rPr>
+      </w:pPr>
+      <w:r>
+        <w:rPr>
+          <w:rFonts w:ascii="Cambria" w:hAnsi="Cambria"/>
           <w:sz w:val="24"/>
           <w:szCs w:val="24"/>
         </w:rPr>
@@ -1290,18 +2252,18 @@
         <w:ind w:right="25"/>
         <w:jc w:val="both"/>
         <w:rPr>
-          <w:rFonts w:asciiTheme="majorHAnsi" w:hAnsiTheme="majorHAnsi" w:cstheme="minorHAnsi"/>
-          <w:sz w:val="24"/>
-          <w:szCs w:val="24"/>
-        </w:rPr>
-      </w:pPr>
-      <w:r>
-        <w:rPr>
-          <w:rFonts w:asciiTheme="majorHAnsi" w:hAnsiTheme="majorHAnsi" w:cstheme="minorHAnsi"/>
-          <w:sz w:val="24"/>
-          <w:szCs w:val="24"/>
-        </w:rPr>
-        <w:t>Explain the CAP theorem in detail. How do different NoSQL systems (MongoDB, Cassandra, etc.) prioritize these trade-offs?</w:t>
+          <w:rFonts w:ascii="Cambria" w:hAnsi="Cambria"/>
+          <w:sz w:val="24"/>
+          <w:szCs w:val="24"/>
+        </w:rPr>
+      </w:pPr>
+      <w:r>
+        <w:rPr>
+          <w:rFonts w:ascii="Cambria" w:hAnsi="Cambria"/>
+          <w:sz w:val="24"/>
+          <w:szCs w:val="24"/>
+        </w:rPr>
+        <w:t>Compare the three main types of Aggregate-Oriented databases (Key-Value, Document, Column-Family), highlighting their primary use cases.</w:t>
       </w:r>
     </w:p>
     <w:p>
@@ -1318,45 +2280,50 @@
         <w:ind w:right="25"/>
         <w:jc w:val="both"/>
         <w:rPr>
-          <w:rFonts w:asciiTheme="majorHAnsi" w:hAnsiTheme="majorHAnsi"/>
-          <w:sz w:val="24"/>
-          <w:szCs w:val="24"/>
-        </w:rPr>
-      </w:pPr>
-      <w:r>
-        <w:rPr>
-          <w:rFonts w:asciiTheme="majorHAnsi" w:hAnsiTheme="majorHAnsi"/>
-          <w:sz w:val="24"/>
-          <w:szCs w:val="24"/>
-        </w:rPr>
-        <w:t xml:space="preserve">Using the CAP theorem, analyze which trade-offs you would make in a </w:t>
-      </w:r>
-      <w:r>
-        <w:rPr>
-          <w:rStyle w:val="Strong"/>
-          <w:rFonts w:asciiTheme="majorHAnsi" w:hAnsiTheme="majorHAnsi"/>
-          <w:sz w:val="24"/>
-          <w:szCs w:val="24"/>
-        </w:rPr>
-        <w:t xml:space="preserve">real-time </w:t>
-      </w:r>
-      <w:r>
-        <w:rPr>
-          <w:rStyle w:val="Strong"/>
-          <w:rFonts w:asciiTheme="majorHAnsi" w:hAnsiTheme="majorHAnsi"/>
-          <w:sz w:val="24"/>
-          <w:szCs w:val="24"/>
-        </w:rPr>
-        <w:lastRenderedPageBreak/>
-        <w:t>stock trading system</w:t>
-      </w:r>
-      <w:r>
-        <w:rPr>
-          <w:rFonts w:asciiTheme="majorHAnsi" w:hAnsiTheme="majorHAnsi"/>
-          <w:sz w:val="24"/>
-          <w:szCs w:val="24"/>
-        </w:rPr>
-        <w:t>.</w:t>
+          <w:rFonts w:ascii="Cambria" w:hAnsi="Cambria"/>
+          <w:sz w:val="24"/>
+          <w:szCs w:val="24"/>
+        </w:rPr>
+      </w:pPr>
+      <w:r>
+        <w:rPr>
+          <w:rFonts w:ascii="Cambria" w:hAnsi="Cambria" w:cstheme="minorHAnsi"/>
+          <w:sz w:val="24"/>
+          <w:szCs w:val="24"/>
+        </w:rPr>
+        <w:t>What is partitioning in Map-Reduce.</w:t>
+      </w:r>
+      <w:r>
+        <w:rPr>
+          <w:rFonts w:ascii="Cambria" w:hAnsi="Cambria" w:cstheme="minorHAnsi"/>
+          <w:sz w:val="24"/>
+          <w:szCs w:val="24"/>
+        </w:rPr>
+        <w:t xml:space="preserve"> </w:t>
+      </w:r>
+      <w:r>
+        <w:rPr>
+          <w:rFonts w:ascii="Cambria" w:hAnsi="Cambria" w:cstheme="minorHAnsi"/>
+          <w:sz w:val="24"/>
+          <w:szCs w:val="24"/>
+        </w:rPr>
+        <w:t>Explain partitioning and combining phases in Map-Reduce using a word frequency example.</w:t>
+      </w:r>
+      <w:r>
+        <w:rPr>
+          <w:rFonts w:ascii="Cambria" w:hAnsi="Cambria" w:cstheme="minorHAnsi"/>
+          <w:sz w:val="24"/>
+          <w:szCs w:val="24"/>
+        </w:rPr>
+        <w:t xml:space="preserve"> </w:t>
+      </w:r>
+      <w:r>
+        <w:rPr>
+          <w:rFonts w:ascii="Cambria" w:hAnsi="Cambria" w:cstheme="minorHAnsi"/>
+          <w:sz w:val="24"/>
+          <w:szCs w:val="24"/>
+        </w:rPr>
+        <w:t>Create a two-stage Map-Reduce process to calculate top-selling products per region and visualize its execution flow.</w:t>
       </w:r>
     </w:p>
     <w:p>
@@ -1373,14 +2340,212 @@
         <w:ind w:right="25"/>
         <w:jc w:val="both"/>
         <w:rPr>
-          <w:rFonts w:asciiTheme="majorHAnsi" w:hAnsiTheme="majorHAnsi"/>
-          <w:sz w:val="24"/>
-          <w:szCs w:val="24"/>
-        </w:rPr>
-      </w:pPr>
-      <w:r>
-        <w:rPr>
-          <w:rFonts w:asciiTheme="majorHAnsi" w:hAnsiTheme="majorHAnsi"/>
+          <w:rFonts w:ascii="Cambria" w:hAnsi="Cambria"/>
+          <w:sz w:val="24"/>
+          <w:szCs w:val="24"/>
+        </w:rPr>
+      </w:pPr>
+      <w:r>
+        <w:rPr>
+          <w:rFonts w:ascii="Cambria" w:hAnsi="Cambria"/>
+          <w:sz w:val="24"/>
+          <w:szCs w:val="24"/>
+        </w:rPr>
+        <w:t>Explain the concept of a "Schema-less" database and one advantage it offers during application development</w:t>
+      </w:r>
+      <w:r>
+        <w:rPr>
+          <w:rFonts w:ascii="Cambria" w:hAnsi="Cambria"/>
+          <w:sz w:val="24"/>
+          <w:szCs w:val="24"/>
+        </w:rPr>
+        <w:t>.</w:t>
+      </w:r>
+    </w:p>
+    <w:p>
+      <w:pPr>
+        <w:pStyle w:val="ListParagraph"/>
+        <w:numPr>
+          <w:ilvl w:val="0"/>
+          <w:numId w:val="1"/>
+        </w:numPr>
+        <w:tabs>
+          <w:tab w:val="left" w:pos="743"/>
+        </w:tabs>
+        <w:spacing w:line="276" w:lineRule="auto"/>
+        <w:ind w:right="25"/>
+        <w:jc w:val="both"/>
+        <w:rPr>
+          <w:rFonts w:ascii="Cambria" w:hAnsi="Cambria"/>
+          <w:sz w:val="24"/>
+          <w:szCs w:val="24"/>
+        </w:rPr>
+      </w:pPr>
+      <w:r>
+        <w:rPr>
+          <w:rFonts w:ascii="Cambria" w:hAnsi="Cambria"/>
+          <w:sz w:val="24"/>
+          <w:szCs w:val="24"/>
+        </w:rPr>
+        <w:t>Illustrate how "Materialized Views" can be used to model data for different access patterns.</w:t>
+      </w:r>
+    </w:p>
+    <w:p>
+      <w:pPr>
+        <w:pStyle w:val="ListParagraph"/>
+        <w:numPr>
+          <w:ilvl w:val="0"/>
+          <w:numId w:val="1"/>
+        </w:numPr>
+        <w:tabs>
+          <w:tab w:val="left" w:pos="743"/>
+        </w:tabs>
+        <w:spacing w:line="276" w:lineRule="auto"/>
+        <w:ind w:right="25"/>
+        <w:jc w:val="both"/>
+        <w:rPr>
+          <w:rFonts w:ascii="Cambria" w:hAnsi="Cambria" w:cstheme="minorHAnsi"/>
+          <w:sz w:val="24"/>
+          <w:szCs w:val="24"/>
+        </w:rPr>
+      </w:pPr>
+      <w:r>
+        <w:rPr>
+          <w:rFonts w:ascii="Cambria" w:hAnsi="Cambria" w:cstheme="minorHAnsi"/>
+          <w:sz w:val="24"/>
+          <w:szCs w:val="24"/>
+        </w:rPr>
+        <w:t>Explain the CAP theorem in detail. How do different NoSQL systems (MongoDB, Cassandra, etc.) prioritize these trade-offs?</w:t>
+      </w:r>
+    </w:p>
+    <w:p>
+      <w:pPr>
+        <w:pStyle w:val="ListParagraph"/>
+        <w:numPr>
+          <w:ilvl w:val="0"/>
+          <w:numId w:val="1"/>
+        </w:numPr>
+        <w:tabs>
+          <w:tab w:val="left" w:pos="743"/>
+        </w:tabs>
+        <w:spacing w:line="276" w:lineRule="auto"/>
+        <w:ind w:right="25"/>
+        <w:jc w:val="both"/>
+        <w:rPr>
+          <w:rFonts w:ascii="Cambria" w:hAnsi="Cambria"/>
+          <w:sz w:val="24"/>
+          <w:szCs w:val="24"/>
+        </w:rPr>
+      </w:pPr>
+      <w:r>
+        <w:rPr>
+          <w:rFonts w:ascii="Cambria" w:hAnsi="Cambria"/>
+          <w:sz w:val="24"/>
+          <w:szCs w:val="24"/>
+        </w:rPr>
+        <w:lastRenderedPageBreak/>
+        <w:t xml:space="preserve">Using the CAP theorem, analyze which trade-offs you would make in a </w:t>
+      </w:r>
+      <w:r>
+        <w:rPr>
+          <w:rStyle w:val="Strong"/>
+          <w:rFonts w:ascii="Cambria" w:hAnsi="Cambria"/>
+          <w:sz w:val="24"/>
+          <w:szCs w:val="24"/>
+        </w:rPr>
+        <w:t>real-time stock trading system</w:t>
+      </w:r>
+      <w:r>
+        <w:rPr>
+          <w:rFonts w:ascii="Cambria" w:hAnsi="Cambria"/>
+          <w:sz w:val="24"/>
+          <w:szCs w:val="24"/>
+        </w:rPr>
+        <w:t>.</w:t>
+      </w:r>
+    </w:p>
+    <w:p>
+      <w:pPr>
+        <w:pStyle w:val="ListParagraph"/>
+        <w:numPr>
+          <w:ilvl w:val="0"/>
+          <w:numId w:val="1"/>
+        </w:numPr>
+        <w:tabs>
+          <w:tab w:val="left" w:pos="743"/>
+        </w:tabs>
+        <w:spacing w:line="276" w:lineRule="auto"/>
+        <w:ind w:right="25"/>
+        <w:jc w:val="both"/>
+        <w:rPr>
+          <w:rFonts w:ascii="Cambria" w:hAnsi="Cambria"/>
+          <w:sz w:val="24"/>
+          <w:szCs w:val="24"/>
+        </w:rPr>
+      </w:pPr>
+      <w:r>
+        <w:rPr>
+          <w:rFonts w:ascii="Cambria" w:hAnsi="Cambria" w:cstheme="minorHAnsi"/>
+          <w:sz w:val="24"/>
+          <w:szCs w:val="24"/>
+        </w:rPr>
+        <w:t>Define consistency in NoSQL databases.</w:t>
+      </w:r>
+      <w:r>
+        <w:rPr>
+          <w:rFonts w:ascii="Cambria" w:hAnsi="Cambria" w:cstheme="minorHAnsi"/>
+          <w:sz w:val="24"/>
+          <w:szCs w:val="24"/>
+        </w:rPr>
+        <w:t xml:space="preserve"> </w:t>
+      </w:r>
+      <w:r>
+        <w:rPr>
+          <w:rFonts w:ascii="Cambria" w:hAnsi="Cambria" w:cstheme="minorHAnsi"/>
+          <w:sz w:val="24"/>
+          <w:szCs w:val="24"/>
+        </w:rPr>
+        <w:t>Explain the CAP theorem and its implications for distributed databases.</w:t>
+      </w:r>
+      <w:r>
+        <w:rPr>
+          <w:rFonts w:ascii="Cambria" w:hAnsi="Cambria" w:cstheme="minorHAnsi"/>
+          <w:sz w:val="24"/>
+          <w:szCs w:val="24"/>
+        </w:rPr>
+        <w:t xml:space="preserve"> </w:t>
+      </w:r>
+      <w:r>
+        <w:rPr>
+          <w:rFonts w:ascii="Cambria" w:hAnsi="Cambria" w:cstheme="minorHAnsi"/>
+          <w:sz w:val="24"/>
+          <w:szCs w:val="24"/>
+        </w:rPr>
+        <w:t>Compare Strong consistency, eventual consistency, and casual consistency. Provide scenarios where each is preferred.</w:t>
+      </w:r>
+    </w:p>
+    <w:p>
+      <w:pPr>
+        <w:pStyle w:val="ListParagraph"/>
+        <w:numPr>
+          <w:ilvl w:val="0"/>
+          <w:numId w:val="1"/>
+        </w:numPr>
+        <w:tabs>
+          <w:tab w:val="left" w:pos="743"/>
+        </w:tabs>
+        <w:spacing w:line="276" w:lineRule="auto"/>
+        <w:ind w:right="25"/>
+        <w:jc w:val="both"/>
+        <w:rPr>
+          <w:rFonts w:ascii="Cambria" w:hAnsi="Cambria"/>
+          <w:sz w:val="24"/>
+          <w:szCs w:val="24"/>
+        </w:rPr>
+      </w:pPr>
+      <w:r>
+        <w:rPr>
+          <w:rFonts w:ascii="Cambria" w:hAnsi="Cambria"/>
           <w:sz w:val="24"/>
           <w:szCs w:val="24"/>
         </w:rPr>
@@ -1389,7 +2554,7 @@
       <w:proofErr w:type="spellStart"/>
       <w:r>
         <w:rPr>
-          <w:rFonts w:asciiTheme="majorHAnsi" w:hAnsiTheme="majorHAnsi"/>
+          <w:rFonts w:ascii="Cambria" w:hAnsi="Cambria"/>
           <w:sz w:val="24"/>
           <w:szCs w:val="24"/>
         </w:rPr>
@@ -1398,11 +2563,149 @@
       <w:proofErr w:type="spellEnd"/>
       <w:r>
         <w:rPr>
-          <w:rFonts w:asciiTheme="majorHAnsi" w:hAnsiTheme="majorHAnsi"/>
+          <w:rFonts w:ascii="Cambria" w:hAnsi="Cambria"/>
           <w:sz w:val="24"/>
           <w:szCs w:val="24"/>
         </w:rPr>
         <w:t>. How does it differ from replication? Provide diagrams to explain.</w:t>
+      </w:r>
+    </w:p>
+    <w:p>
+      <w:pPr>
+        <w:pStyle w:val="ListParagraph"/>
+        <w:numPr>
+          <w:ilvl w:val="0"/>
+          <w:numId w:val="1"/>
+        </w:numPr>
+        <w:tabs>
+          <w:tab w:val="left" w:pos="743"/>
+        </w:tabs>
+        <w:spacing w:line="276" w:lineRule="auto"/>
+        <w:ind w:right="25"/>
+        <w:jc w:val="both"/>
+        <w:rPr>
+          <w:rFonts w:ascii="Cambria" w:hAnsi="Cambria"/>
+          <w:sz w:val="24"/>
+          <w:szCs w:val="24"/>
+        </w:rPr>
+      </w:pPr>
+      <w:r>
+        <w:rPr>
+          <w:rFonts w:ascii="Cambria" w:hAnsi="Cambria"/>
+          <w:sz w:val="24"/>
+          <w:szCs w:val="24"/>
+        </w:rPr>
+        <w:t>Compare the peer-to-peer and master-slave replication models in terms of fault tolerance, write scalability, and complexity.</w:t>
+      </w:r>
+    </w:p>
+    <w:p>
+      <w:pPr>
+        <w:pStyle w:val="ListParagraph"/>
+        <w:numPr>
+          <w:ilvl w:val="0"/>
+          <w:numId w:val="1"/>
+        </w:numPr>
+        <w:tabs>
+          <w:tab w:val="left" w:pos="743"/>
+        </w:tabs>
+        <w:spacing w:line="276" w:lineRule="auto"/>
+        <w:ind w:right="25"/>
+        <w:jc w:val="both"/>
+        <w:rPr>
+          <w:rFonts w:ascii="Cambria" w:hAnsi="Cambria"/>
+          <w:sz w:val="24"/>
+          <w:szCs w:val="24"/>
+        </w:rPr>
+      </w:pPr>
+      <w:r>
+        <w:rPr>
+          <w:rFonts w:ascii="Cambria" w:hAnsi="Cambria"/>
+          <w:sz w:val="24"/>
+          <w:szCs w:val="24"/>
+        </w:rPr>
+        <w:t xml:space="preserve">Analyze the CAP theorem. For a distributed </w:t>
+      </w:r>
+      <w:r>
+        <w:rPr>
+          <w:rFonts w:ascii="Cambria" w:hAnsi="Cambria"/>
+          <w:sz w:val="24"/>
+          <w:szCs w:val="24"/>
+        </w:rPr>
+        <w:t>banking system, which two characteristics would you prioritize and why?</w:t>
+      </w:r>
+    </w:p>
+    <w:p>
+      <w:pPr>
+        <w:pStyle w:val="ListParagraph"/>
+        <w:numPr>
+          <w:ilvl w:val="0"/>
+          <w:numId w:val="1"/>
+        </w:numPr>
+        <w:tabs>
+          <w:tab w:val="left" w:pos="743"/>
+        </w:tabs>
+        <w:spacing w:line="276" w:lineRule="auto"/>
+        <w:ind w:right="25"/>
+        <w:jc w:val="both"/>
+        <w:rPr>
+          <w:rFonts w:ascii="Cambria" w:hAnsi="Cambria"/>
+          <w:sz w:val="24"/>
+          <w:szCs w:val="24"/>
+        </w:rPr>
+      </w:pPr>
+      <w:r>
+        <w:rPr>
+          <w:rFonts w:ascii="Cambria" w:hAnsi="Cambria"/>
+          <w:sz w:val="24"/>
+          <w:szCs w:val="24"/>
+        </w:rPr>
+        <w:t>Explain the trade-off involved when "Relaxing Durability" in a distributed data store.</w:t>
+      </w:r>
+    </w:p>
+    <w:p>
+      <w:pPr>
+        <w:pStyle w:val="ListParagraph"/>
+        <w:numPr>
+          <w:ilvl w:val="0"/>
+          <w:numId w:val="1"/>
+        </w:numPr>
+        <w:tabs>
+          <w:tab w:val="left" w:pos="743"/>
+        </w:tabs>
+        <w:spacing w:line="276" w:lineRule="auto"/>
+        <w:ind w:right="25"/>
+        <w:jc w:val="both"/>
+        <w:rPr>
+          <w:rFonts w:ascii="Cambria" w:hAnsi="Cambria"/>
+          <w:sz w:val="24"/>
+          <w:szCs w:val="24"/>
+        </w:rPr>
+      </w:pPr>
+      <w:r>
+        <w:rPr>
+          <w:rFonts w:ascii="Cambria" w:hAnsi="Cambria"/>
+          <w:sz w:val="24"/>
+          <w:szCs w:val="24"/>
+        </w:rPr>
+        <w:t xml:space="preserve">Illustrate how </w:t>
+      </w:r>
+      <w:proofErr w:type="spellStart"/>
+      <w:r>
+        <w:rPr>
+          <w:rFonts w:ascii="Cambria" w:hAnsi="Cambria"/>
+          <w:sz w:val="24"/>
+          <w:szCs w:val="24"/>
+        </w:rPr>
+        <w:t>sharding</w:t>
+      </w:r>
+      <w:proofErr w:type="spellEnd"/>
+      <w:r>
+        <w:rPr>
+          <w:rFonts w:ascii="Cambria" w:hAnsi="Cambria"/>
+          <w:sz w:val="24"/>
+          <w:szCs w:val="24"/>
+        </w:rPr>
+        <w:t xml:space="preserve"> can be combined with replication to achieve both scalability and availability.</w:t>
       </w:r>
     </w:p>
     <w:p>
@@ -1419,14 +2722,14 @@
         <w:ind w:right="25"/>
         <w:jc w:val="both"/>
         <w:rPr>
-          <w:rFonts w:asciiTheme="majorHAnsi" w:hAnsiTheme="majorHAnsi"/>
-          <w:sz w:val="24"/>
-          <w:szCs w:val="24"/>
-        </w:rPr>
-      </w:pPr>
-      <w:r>
-        <w:rPr>
-          <w:rFonts w:asciiTheme="majorHAnsi" w:hAnsiTheme="majorHAnsi"/>
+          <w:rFonts w:ascii="Cambria" w:hAnsi="Cambria"/>
+          <w:sz w:val="24"/>
+          <w:szCs w:val="24"/>
+        </w:rPr>
+      </w:pPr>
+      <w:r>
+        <w:rPr>
+          <w:rFonts w:ascii="Cambria" w:hAnsi="Cambria"/>
           <w:sz w:val="24"/>
           <w:szCs w:val="24"/>
         </w:rPr>
@@ -1435,7 +2738,7 @@
       <w:r>
         <w:rPr>
           <w:rStyle w:val="Strong"/>
-          <w:rFonts w:asciiTheme="majorHAnsi" w:hAnsiTheme="majorHAnsi"/>
+          <w:rFonts w:ascii="Cambria" w:hAnsi="Cambria"/>
           <w:sz w:val="24"/>
           <w:szCs w:val="24"/>
         </w:rPr>
@@ -1443,7 +2746,7 @@
       </w:r>
       <w:r>
         <w:rPr>
-          <w:rFonts w:asciiTheme="majorHAnsi" w:hAnsiTheme="majorHAnsi"/>
+          <w:rFonts w:ascii="Cambria" w:hAnsi="Cambria"/>
           <w:sz w:val="24"/>
           <w:szCs w:val="24"/>
         </w:rPr>
@@ -1464,18 +2767,58 @@
         <w:ind w:right="25"/>
         <w:jc w:val="both"/>
         <w:rPr>
-          <w:rFonts w:asciiTheme="majorHAnsi" w:hAnsiTheme="majorHAnsi"/>
-          <w:sz w:val="24"/>
-          <w:szCs w:val="24"/>
-        </w:rPr>
-      </w:pPr>
-      <w:r>
-        <w:rPr>
-          <w:rFonts w:asciiTheme="majorHAnsi" w:hAnsiTheme="majorHAnsi"/>
-          <w:sz w:val="24"/>
-          <w:szCs w:val="24"/>
-        </w:rPr>
-        <w:t>Discuss how peer-to-peer replication works using gossip protocols. Highlight its advantages and disadvantages.</w:t>
+          <w:rFonts w:ascii="Cambria" w:hAnsi="Cambria"/>
+          <w:sz w:val="24"/>
+          <w:szCs w:val="24"/>
+        </w:rPr>
+      </w:pPr>
+      <w:r>
+        <w:rPr>
+          <w:rFonts w:ascii="Cambria" w:hAnsi="Cambria" w:cstheme="minorHAnsi"/>
+          <w:sz w:val="24"/>
+          <w:szCs w:val="24"/>
+        </w:rPr>
+        <w:t>What is replication in NoSQL databases?</w:t>
+      </w:r>
+      <w:r>
+        <w:rPr>
+          <w:rFonts w:ascii="Cambria" w:hAnsi="Cambria" w:cstheme="minorHAnsi"/>
+          <w:sz w:val="24"/>
+          <w:szCs w:val="24"/>
+        </w:rPr>
+        <w:t xml:space="preserve"> </w:t>
+      </w:r>
+      <w:r>
+        <w:rPr>
+          <w:rFonts w:ascii="Cambria" w:hAnsi="Cambria" w:cstheme="minorHAnsi"/>
+          <w:sz w:val="24"/>
+          <w:szCs w:val="24"/>
+        </w:rPr>
+        <w:t>Explain master-slave replication with a neat diagram.</w:t>
+      </w:r>
+      <w:r>
+        <w:rPr>
+          <w:rFonts w:ascii="Cambria" w:hAnsi="Cambria" w:cstheme="minorHAnsi"/>
+          <w:sz w:val="24"/>
+          <w:szCs w:val="24"/>
+        </w:rPr>
+        <w:t xml:space="preserve"> </w:t>
+      </w:r>
+      <w:r>
+        <w:rPr>
+          <w:rFonts w:ascii="Cambria" w:hAnsi="Cambria" w:cstheme="minorHAnsi"/>
+          <w:sz w:val="24"/>
+          <w:szCs w:val="24"/>
+        </w:rPr>
+        <w:t>Discuss peer-to-peer replication with example. Discuss how conflicts are resolved in distributed environments.</w:t>
+      </w:r>
+      <w:r>
+        <w:rPr>
+          <w:rFonts w:ascii="Cambria" w:hAnsi="Cambria" w:cstheme="minorHAnsi"/>
+          <w:sz w:val="24"/>
+          <w:szCs w:val="24"/>
+        </w:rPr>
+        <w:t xml:space="preserve"> </w:t>
       </w:r>
     </w:p>
     <w:p>
@@ -1492,18 +2835,18 @@
         <w:ind w:right="25"/>
         <w:jc w:val="both"/>
         <w:rPr>
-          <w:rFonts w:asciiTheme="majorHAnsi" w:hAnsiTheme="majorHAnsi"/>
-          <w:sz w:val="24"/>
-          <w:szCs w:val="24"/>
-        </w:rPr>
-      </w:pPr>
-      <w:r>
-        <w:rPr>
-          <w:rFonts w:asciiTheme="majorHAnsi" w:hAnsiTheme="majorHAnsi"/>
-          <w:sz w:val="24"/>
-          <w:szCs w:val="24"/>
-        </w:rPr>
-        <w:t>Explain how materialized views enhance performance in NoSQL databases. Provide an example from an e-commerce domain.</w:t>
+          <w:rFonts w:ascii="Cambria" w:hAnsi="Cambria"/>
+          <w:sz w:val="24"/>
+          <w:szCs w:val="24"/>
+        </w:rPr>
+      </w:pPr>
+      <w:r>
+        <w:rPr>
+          <w:rFonts w:ascii="Cambria" w:hAnsi="Cambria"/>
+          <w:sz w:val="24"/>
+          <w:szCs w:val="24"/>
+        </w:rPr>
+        <w:t>Discuss how peer-to-peer replication works using gossip protocols. Highlight its advantages and disadvantages.</w:t>
       </w:r>
     </w:p>
     <w:p>
@@ -1520,18 +2863,18 @@
         <w:ind w:right="25"/>
         <w:jc w:val="both"/>
         <w:rPr>
-          <w:rFonts w:asciiTheme="majorHAnsi" w:hAnsiTheme="majorHAnsi"/>
-          <w:sz w:val="24"/>
-          <w:szCs w:val="24"/>
-        </w:rPr>
-      </w:pPr>
-      <w:r>
-        <w:rPr>
-          <w:rFonts w:asciiTheme="majorHAnsi" w:hAnsiTheme="majorHAnsi"/>
-          <w:sz w:val="24"/>
-          <w:szCs w:val="24"/>
-        </w:rPr>
-        <w:t>Describe the role of aggregates in modeling business applications. Provide examples from social media or retail.</w:t>
+          <w:rFonts w:ascii="Cambria" w:hAnsi="Cambria"/>
+          <w:sz w:val="24"/>
+          <w:szCs w:val="24"/>
+        </w:rPr>
+      </w:pPr>
+      <w:r>
+        <w:rPr>
+          <w:rFonts w:ascii="Cambria" w:hAnsi="Cambria"/>
+          <w:sz w:val="24"/>
+          <w:szCs w:val="24"/>
+        </w:rPr>
+        <w:t>Analyze the trade-offs between Consistency, Availability, and Query Features in Document-Oriented databases. How do these trade-offs influence database selection?</w:t>
       </w:r>
     </w:p>
     <w:p>
@@ -1548,69 +2891,18 @@
         <w:ind w:right="25"/>
         <w:jc w:val="both"/>
         <w:rPr>
-          <w:rFonts w:asciiTheme="majorHAnsi" w:hAnsiTheme="majorHAnsi"/>
-          <w:sz w:val="24"/>
-          <w:szCs w:val="24"/>
-        </w:rPr>
-      </w:pPr>
-      <w:r>
-        <w:rPr>
-          <w:rFonts w:asciiTheme="majorHAnsi" w:hAnsiTheme="majorHAnsi"/>
-          <w:sz w:val="24"/>
-          <w:szCs w:val="24"/>
-        </w:rPr>
-        <w:t xml:space="preserve">Compare </w:t>
-      </w:r>
-      <w:r>
-        <w:rPr>
-          <w:rStyle w:val="Strong"/>
-          <w:rFonts w:asciiTheme="majorHAnsi" w:hAnsiTheme="majorHAnsi"/>
-          <w:sz w:val="24"/>
-          <w:szCs w:val="24"/>
-        </w:rPr>
-        <w:t>Key-Value</w:t>
-      </w:r>
-      <w:r>
-        <w:rPr>
-          <w:rFonts w:asciiTheme="majorHAnsi" w:hAnsiTheme="majorHAnsi"/>
-          <w:sz w:val="24"/>
-          <w:szCs w:val="24"/>
-        </w:rPr>
-        <w:t xml:space="preserve">, </w:t>
-      </w:r>
-      <w:r>
-        <w:rPr>
-          <w:rStyle w:val="Strong"/>
-          <w:rFonts w:asciiTheme="majorHAnsi" w:hAnsiTheme="majorHAnsi"/>
-          <w:sz w:val="24"/>
-          <w:szCs w:val="24"/>
-        </w:rPr>
-        <w:t>Document</w:t>
-      </w:r>
-      <w:r>
-        <w:rPr>
-          <w:rFonts w:asciiTheme="majorHAnsi" w:hAnsiTheme="majorHAnsi"/>
-          <w:sz w:val="24"/>
-          <w:szCs w:val="24"/>
-        </w:rPr>
-        <w:t xml:space="preserve">, and </w:t>
-      </w:r>
-      <w:r>
-        <w:rPr>
-          <w:rStyle w:val="Strong"/>
-          <w:rFonts w:asciiTheme="majorHAnsi" w:hAnsiTheme="majorHAnsi"/>
-          <w:sz w:val="24"/>
-          <w:szCs w:val="24"/>
-        </w:rPr>
-        <w:t>Column-Family</w:t>
-      </w:r>
-      <w:r>
-        <w:rPr>
-          <w:rFonts w:asciiTheme="majorHAnsi" w:hAnsiTheme="majorHAnsi"/>
-          <w:sz w:val="24"/>
-          <w:szCs w:val="24"/>
-        </w:rPr>
-        <w:t xml:space="preserve"> data models with examples.</w:t>
+          <w:rFonts w:ascii="Cambria" w:hAnsi="Cambria"/>
+          <w:sz w:val="24"/>
+          <w:szCs w:val="24"/>
+        </w:rPr>
+      </w:pPr>
+      <w:r>
+        <w:rPr>
+          <w:rFonts w:ascii="Cambria" w:hAnsi="Cambria"/>
+          <w:sz w:val="24"/>
+          <w:szCs w:val="24"/>
+        </w:rPr>
+        <w:t>Evaluate the suitability of a document database for a real-time web analytics application. What specific features make it a good fit?</w:t>
       </w:r>
     </w:p>
     <w:p>
@@ -1627,35 +2919,58 @@
         <w:ind w:right="25"/>
         <w:jc w:val="both"/>
         <w:rPr>
-          <w:rFonts w:asciiTheme="majorHAnsi" w:hAnsiTheme="majorHAnsi"/>
-          <w:sz w:val="24"/>
-          <w:szCs w:val="24"/>
-        </w:rPr>
-      </w:pPr>
-      <w:r>
-        <w:rPr>
-          <w:rFonts w:asciiTheme="majorHAnsi" w:hAnsiTheme="majorHAnsi"/>
-          <w:sz w:val="24"/>
-          <w:szCs w:val="24"/>
-        </w:rPr>
-        <w:t xml:space="preserve">Design a </w:t>
-      </w:r>
-      <w:r>
-        <w:rPr>
-          <w:rStyle w:val="Strong"/>
-          <w:rFonts w:asciiTheme="majorHAnsi" w:hAnsiTheme="majorHAnsi"/>
-          <w:sz w:val="24"/>
-          <w:szCs w:val="24"/>
-        </w:rPr>
-        <w:t>library management database</w:t>
-      </w:r>
-      <w:r>
-        <w:rPr>
-          <w:rFonts w:asciiTheme="majorHAnsi" w:hAnsiTheme="majorHAnsi"/>
-          <w:sz w:val="24"/>
-          <w:szCs w:val="24"/>
-        </w:rPr>
-        <w:t xml:space="preserve"> with authors, books, and borrow records. Using aggregate-oriented design, model borrow transactions within the member document. Provide example documents for at least one member with multiple borrow records.</w:t>
+          <w:rFonts w:ascii="Cambria" w:hAnsi="Cambria"/>
+          <w:sz w:val="24"/>
+          <w:szCs w:val="24"/>
+        </w:rPr>
+      </w:pPr>
+      <w:r>
+        <w:rPr>
+          <w:rFonts w:ascii="Cambria" w:hAnsi="Cambria"/>
+          <w:sz w:val="24"/>
+          <w:szCs w:val="24"/>
+        </w:rPr>
+        <w:t>What is a document database?</w:t>
+      </w:r>
+      <w:r>
+        <w:rPr>
+          <w:rFonts w:ascii="Cambria" w:hAnsi="Cambria"/>
+          <w:sz w:val="24"/>
+          <w:szCs w:val="24"/>
+        </w:rPr>
+        <w:t xml:space="preserve"> </w:t>
+      </w:r>
+      <w:r>
+        <w:rPr>
+          <w:rFonts w:ascii="Cambria" w:hAnsi="Cambria"/>
+          <w:sz w:val="24"/>
+          <w:szCs w:val="24"/>
+        </w:rPr>
+        <w:t>Explain the structure of a JSON document with an example of a “Student” document.</w:t>
+      </w:r>
+      <w:r>
+        <w:rPr>
+          <w:rFonts w:ascii="Cambria" w:hAnsi="Cambria"/>
+          <w:sz w:val="24"/>
+          <w:szCs w:val="24"/>
+        </w:rPr>
+        <w:t xml:space="preserve"> </w:t>
+      </w:r>
+      <w:r>
+        <w:rPr>
+          <w:rFonts w:ascii="Cambria" w:hAnsi="Cambria"/>
+          <w:sz w:val="24"/>
+          <w:szCs w:val="24"/>
+        </w:rPr>
+        <w:t>Design and implement a small document schema for a “Library Management System” in MongoDB. Include collections</w:t>
+      </w:r>
+      <w:r>
+        <w:rPr>
+          <w:rFonts w:ascii="Cambria" w:hAnsi="Cambria"/>
+          <w:sz w:val="24"/>
+          <w:szCs w:val="24"/>
+        </w:rPr>
+        <w:t>.</w:t>
       </w:r>
     </w:p>
     <w:p>
@@ -1672,52 +2987,18 @@
         <w:ind w:right="25"/>
         <w:jc w:val="both"/>
         <w:rPr>
-          <w:rFonts w:asciiTheme="majorHAnsi" w:hAnsiTheme="majorHAnsi"/>
-          <w:sz w:val="24"/>
-          <w:szCs w:val="24"/>
-        </w:rPr>
-      </w:pPr>
-      <w:r>
-        <w:rPr>
-          <w:rFonts w:asciiTheme="majorHAnsi" w:hAnsiTheme="majorHAnsi"/>
-          <w:sz w:val="24"/>
-          <w:szCs w:val="24"/>
-        </w:rPr>
-        <w:t xml:space="preserve">In a </w:t>
-      </w:r>
-      <w:r>
-        <w:rPr>
-          <w:rStyle w:val="Strong"/>
-          <w:rFonts w:asciiTheme="majorHAnsi" w:hAnsiTheme="majorHAnsi"/>
-          <w:sz w:val="24"/>
-          <w:szCs w:val="24"/>
-        </w:rPr>
-        <w:t>banking system</w:t>
-      </w:r>
-      <w:r>
-        <w:rPr>
-          <w:rFonts w:asciiTheme="majorHAnsi" w:hAnsiTheme="majorHAnsi"/>
-          <w:sz w:val="24"/>
-          <w:szCs w:val="24"/>
-        </w:rPr>
-        <w:t xml:space="preserve">, customers can have multiple accounts and each account can have multiple transactions. Model this using an </w:t>
-      </w:r>
-      <w:r>
-        <w:rPr>
-          <w:rStyle w:val="Strong"/>
-          <w:rFonts w:asciiTheme="majorHAnsi" w:hAnsiTheme="majorHAnsi"/>
-          <w:sz w:val="24"/>
-          <w:szCs w:val="24"/>
-        </w:rPr>
-        <w:t>aggregate-oriented schema</w:t>
-      </w:r>
-      <w:r>
-        <w:rPr>
-          <w:rFonts w:asciiTheme="majorHAnsi" w:hAnsiTheme="majorHAnsi"/>
-          <w:sz w:val="24"/>
-          <w:szCs w:val="24"/>
-        </w:rPr>
-        <w:t xml:space="preserve"> where each customer embeds accounts and their transactions. Provide example documents for one customer with at least two accounts.</w:t>
+          <w:rFonts w:ascii="Cambria" w:hAnsi="Cambria"/>
+          <w:sz w:val="24"/>
+          <w:szCs w:val="24"/>
+        </w:rPr>
+      </w:pPr>
+      <w:r>
+        <w:rPr>
+          <w:rFonts w:ascii="Cambria" w:hAnsi="Cambria"/>
+          <w:sz w:val="24"/>
+          <w:szCs w:val="24"/>
+        </w:rPr>
+        <w:t>Propose a data model for an E-Commerce product catalog in a document database, justifying the structure of your aggregates.</w:t>
       </w:r>
     </w:p>
     <w:p>
@@ -1734,18 +3015,55 @@
         <w:ind w:right="25"/>
         <w:jc w:val="both"/>
         <w:rPr>
-          <w:rFonts w:asciiTheme="majorHAnsi" w:hAnsiTheme="majorHAnsi"/>
-          <w:sz w:val="24"/>
-          <w:szCs w:val="24"/>
-        </w:rPr>
-      </w:pPr>
-      <w:r>
-        <w:rPr>
-          <w:rFonts w:asciiTheme="majorHAnsi" w:hAnsiTheme="majorHAnsi"/>
-          <w:sz w:val="24"/>
-          <w:szCs w:val="24"/>
-        </w:rPr>
-        <w:t>Compare and contrast master-slave replication and peer-to-peer replication. Which scenarios are best suited for each?</w:t>
+          <w:rFonts w:ascii="Cambria" w:hAnsi="Cambria"/>
+          <w:sz w:val="24"/>
+          <w:szCs w:val="24"/>
+        </w:rPr>
+      </w:pPr>
+      <w:r>
+        <w:rPr>
+          <w:rFonts w:ascii="Cambria" w:hAnsi="Cambria"/>
+          <w:color w:val="000000"/>
+          <w:sz w:val="24"/>
+          <w:szCs w:val="24"/>
+        </w:rPr>
+        <w:t>Define the features – Consistency, Transactions, Availability, in the context of graph databases.</w:t>
+      </w:r>
+      <w:r>
+        <w:rPr>
+          <w:rFonts w:ascii="Cambria" w:hAnsi="Cambria"/>
+          <w:color w:val="000000"/>
+          <w:sz w:val="24"/>
+          <w:szCs w:val="24"/>
+        </w:rPr>
+        <w:t xml:space="preserve"> </w:t>
+      </w:r>
+      <w:r>
+        <w:rPr>
+          <w:rFonts w:ascii="Cambria" w:hAnsi="Cambria"/>
+          <w:color w:val="000000"/>
+          <w:sz w:val="24"/>
+          <w:szCs w:val="24"/>
+        </w:rPr>
+        <w:t>Explain how these features are implemented in a graph database like Neo4j with the help of a neat labeled diagram showing nodes, relationships, and replication setup.</w:t>
+      </w:r>
+      <w:r>
+        <w:rPr>
+          <w:rFonts w:ascii="Cambria" w:hAnsi="Cambria"/>
+          <w:color w:val="000000"/>
+          <w:sz w:val="24"/>
+          <w:szCs w:val="24"/>
+        </w:rPr>
+        <w:t xml:space="preserve"> </w:t>
+      </w:r>
+      <w:r>
+        <w:rPr>
+          <w:rFonts w:ascii="Cambria" w:hAnsi="Cambria"/>
+          <w:color w:val="000000"/>
+          <w:sz w:val="24"/>
+          <w:szCs w:val="24"/>
+        </w:rPr>
+        <w:t>Design a large-scale social networking graph system and illustrate how each feature is achieved within the architecture.</w:t>
       </w:r>
     </w:p>
     <w:p>
@@ -1762,14 +3080,897 @@
         <w:ind w:right="25"/>
         <w:jc w:val="both"/>
         <w:rPr>
-          <w:rFonts w:asciiTheme="majorHAnsi" w:hAnsiTheme="majorHAnsi"/>
-          <w:sz w:val="24"/>
-          <w:szCs w:val="24"/>
-        </w:rPr>
-      </w:pPr>
-      <w:r>
-        <w:rPr>
-          <w:rFonts w:asciiTheme="majorHAnsi" w:hAnsiTheme="majorHAnsi"/>
+          <w:rFonts w:ascii="Cambria" w:hAnsi="Cambria"/>
+          <w:sz w:val="24"/>
+          <w:szCs w:val="24"/>
+        </w:rPr>
+      </w:pPr>
+      <w:r>
+        <w:rPr>
+          <w:rFonts w:ascii="Cambria" w:hAnsi="Cambria"/>
+          <w:sz w:val="24"/>
+          <w:szCs w:val="24"/>
+        </w:rPr>
+        <w:t>Explain how materialized views enhance performance in NoSQL databases. Provide an example from an e-commerce domain.</w:t>
+      </w:r>
+    </w:p>
+    <w:p>
+      <w:pPr>
+        <w:pStyle w:val="ListParagraph"/>
+        <w:numPr>
+          <w:ilvl w:val="0"/>
+          <w:numId w:val="1"/>
+        </w:numPr>
+        <w:tabs>
+          <w:tab w:val="left" w:pos="743"/>
+        </w:tabs>
+        <w:spacing w:line="278" w:lineRule="auto"/>
+        <w:ind w:right="25"/>
+        <w:jc w:val="both"/>
+        <w:rPr>
+          <w:rFonts w:ascii="Cambria" w:hAnsi="Cambria"/>
+          <w:sz w:val="24"/>
+          <w:szCs w:val="24"/>
+        </w:rPr>
+      </w:pPr>
+      <w:r>
+        <w:rPr>
+          <w:rFonts w:ascii="Cambria" w:hAnsi="Cambria"/>
+          <w:sz w:val="24"/>
+          <w:szCs w:val="24"/>
+        </w:rPr>
+        <w:t>Critically evaluate a scenario where a Document-Oriented database would be an inappropriate choice. What specific system requirements would lead to this conclusion?</w:t>
+      </w:r>
+    </w:p>
+    <w:p>
+      <w:pPr>
+        <w:pStyle w:val="ListParagraph"/>
+        <w:numPr>
+          <w:ilvl w:val="0"/>
+          <w:numId w:val="1"/>
+        </w:numPr>
+        <w:tabs>
+          <w:tab w:val="left" w:pos="743"/>
+        </w:tabs>
+        <w:spacing w:line="278" w:lineRule="auto"/>
+        <w:ind w:right="25"/>
+        <w:jc w:val="both"/>
+        <w:rPr>
+          <w:rFonts w:ascii="Cambria" w:hAnsi="Cambria"/>
+          <w:sz w:val="24"/>
+          <w:szCs w:val="24"/>
+        </w:rPr>
+      </w:pPr>
+      <w:r>
+        <w:rPr>
+          <w:rFonts w:ascii="Cambria" w:hAnsi="Cambria"/>
+          <w:sz w:val="24"/>
+          <w:szCs w:val="24"/>
+        </w:rPr>
+        <w:t xml:space="preserve">Propose an alternative data </w:t>
+      </w:r>
+      <w:proofErr w:type="gramStart"/>
+      <w:r>
+        <w:rPr>
+          <w:rFonts w:ascii="Cambria" w:hAnsi="Cambria"/>
+          <w:sz w:val="24"/>
+          <w:szCs w:val="24"/>
+        </w:rPr>
+        <w:t>Modeling</w:t>
+      </w:r>
+      <w:proofErr w:type="gramEnd"/>
+      <w:r>
+        <w:rPr>
+          <w:rFonts w:ascii="Cambria" w:hAnsi="Cambria"/>
+          <w:sz w:val="24"/>
+          <w:szCs w:val="24"/>
+        </w:rPr>
+        <w:t xml:space="preserve"> strategy within a document database to handle "varying aggregate structures."</w:t>
+      </w:r>
+    </w:p>
+    <w:p>
+      <w:pPr>
+        <w:pStyle w:val="ListParagraph"/>
+        <w:numPr>
+          <w:ilvl w:val="0"/>
+          <w:numId w:val="1"/>
+        </w:numPr>
+        <w:tabs>
+          <w:tab w:val="left" w:pos="743"/>
+        </w:tabs>
+        <w:spacing w:line="278" w:lineRule="auto"/>
+        <w:ind w:right="25"/>
+        <w:jc w:val="both"/>
+        <w:rPr>
+          <w:rFonts w:ascii="Cambria" w:hAnsi="Cambria"/>
+          <w:sz w:val="24"/>
+          <w:szCs w:val="24"/>
+        </w:rPr>
+      </w:pPr>
+      <w:r>
+        <w:rPr>
+          <w:rFonts w:ascii="Cambria" w:hAnsi="Cambria"/>
+          <w:sz w:val="24"/>
+          <w:szCs w:val="24"/>
+        </w:rPr>
+        <w:t xml:space="preserve">How does the scaling strategy (e.g., </w:t>
+      </w:r>
+      <w:proofErr w:type="spellStart"/>
+      <w:r>
+        <w:rPr>
+          <w:rFonts w:ascii="Cambria" w:hAnsi="Cambria"/>
+          <w:sz w:val="24"/>
+          <w:szCs w:val="24"/>
+        </w:rPr>
+        <w:t>sharding</w:t>
+      </w:r>
+      <w:proofErr w:type="spellEnd"/>
+      <w:r>
+        <w:rPr>
+          <w:rFonts w:ascii="Cambria" w:hAnsi="Cambria"/>
+          <w:sz w:val="24"/>
+          <w:szCs w:val="24"/>
+        </w:rPr>
+        <w:t>) of a document database impact the way you design your document IDs?</w:t>
+      </w:r>
+    </w:p>
+    <w:p>
+      <w:pPr>
+        <w:pStyle w:val="ListParagraph"/>
+        <w:numPr>
+          <w:ilvl w:val="0"/>
+          <w:numId w:val="1"/>
+        </w:numPr>
+        <w:tabs>
+          <w:tab w:val="left" w:pos="743"/>
+        </w:tabs>
+        <w:spacing w:line="278" w:lineRule="auto"/>
+        <w:ind w:right="25"/>
+        <w:jc w:val="both"/>
+        <w:rPr>
+          <w:rFonts w:ascii="Cambria" w:hAnsi="Cambria"/>
+          <w:sz w:val="24"/>
+          <w:szCs w:val="24"/>
+        </w:rPr>
+      </w:pPr>
+      <w:r>
+        <w:rPr>
+          <w:rFonts w:ascii="Cambria" w:hAnsi="Cambria" w:cstheme="minorHAnsi"/>
+          <w:sz w:val="24"/>
+          <w:szCs w:val="24"/>
+        </w:rPr>
+        <w:t>What is a graph database?</w:t>
+      </w:r>
+      <w:r>
+        <w:rPr>
+          <w:rFonts w:ascii="Cambria" w:hAnsi="Cambria" w:cstheme="minorHAnsi"/>
+          <w:sz w:val="24"/>
+          <w:szCs w:val="24"/>
+        </w:rPr>
+        <w:t xml:space="preserve"> </w:t>
+      </w:r>
+      <w:r>
+        <w:rPr>
+          <w:rFonts w:ascii="Cambria" w:hAnsi="Cambria" w:cstheme="minorHAnsi"/>
+          <w:sz w:val="24"/>
+          <w:szCs w:val="24"/>
+        </w:rPr>
+        <w:t>Differentiate between nodes, edges, and properties with an example?</w:t>
+      </w:r>
+      <w:r>
+        <w:rPr>
+          <w:rFonts w:ascii="Cambria" w:hAnsi="Cambria" w:cstheme="minorHAnsi"/>
+          <w:sz w:val="24"/>
+          <w:szCs w:val="24"/>
+        </w:rPr>
+        <w:t xml:space="preserve"> </w:t>
+      </w:r>
+      <w:r>
+        <w:rPr>
+          <w:rFonts w:ascii="Cambria" w:hAnsi="Cambria" w:cstheme="minorHAnsi"/>
+          <w:sz w:val="24"/>
+          <w:szCs w:val="24"/>
+        </w:rPr>
+        <w:t xml:space="preserve">Model a social networking application using a graph database showing users, friendships, and posts. Draw the graph and explain sample queries </w:t>
+      </w:r>
+      <w:r>
+        <w:rPr>
+          <w:rFonts w:ascii="Cambria" w:hAnsi="Cambria" w:cstheme="minorHAnsi"/>
+          <w:sz w:val="24"/>
+          <w:szCs w:val="24"/>
+        </w:rPr>
+        <w:lastRenderedPageBreak/>
+        <w:t>using Neo4J for node and edge creation.</w:t>
+      </w:r>
+    </w:p>
+    <w:p>
+      <w:pPr>
+        <w:pStyle w:val="ListParagraph"/>
+        <w:numPr>
+          <w:ilvl w:val="0"/>
+          <w:numId w:val="1"/>
+        </w:numPr>
+        <w:tabs>
+          <w:tab w:val="left" w:pos="743"/>
+        </w:tabs>
+        <w:spacing w:line="278" w:lineRule="auto"/>
+        <w:ind w:right="25"/>
+        <w:jc w:val="both"/>
+        <w:rPr>
+          <w:rFonts w:ascii="Cambria" w:hAnsi="Cambria"/>
+          <w:sz w:val="24"/>
+          <w:szCs w:val="24"/>
+        </w:rPr>
+      </w:pPr>
+      <w:r>
+        <w:rPr>
+          <w:rFonts w:ascii="Cambria" w:hAnsi="Cambria" w:cstheme="minorHAnsi"/>
+          <w:sz w:val="24"/>
+          <w:szCs w:val="24"/>
+        </w:rPr>
+        <w:t>Design a Map-Reduce job to calculate monthly total sales per product category from large transaction data. Draw the flow of map, shuffle, and reduce stages.</w:t>
+      </w:r>
+      <w:r>
+        <w:rPr>
+          <w:rFonts w:ascii="Cambria" w:hAnsi="Cambria" w:cstheme="minorHAnsi"/>
+          <w:sz w:val="24"/>
+          <w:szCs w:val="24"/>
+        </w:rPr>
+        <w:t xml:space="preserve"> </w:t>
+      </w:r>
+      <w:r>
+        <w:rPr>
+          <w:rFonts w:ascii="Cambria" w:hAnsi="Cambria" w:cstheme="minorHAnsi"/>
+          <w:sz w:val="24"/>
+          <w:szCs w:val="24"/>
+        </w:rPr>
+        <w:t>Explain the working of Map and Reduce phases using a word count example.</w:t>
+      </w:r>
+    </w:p>
+    <w:p>
+      <w:pPr>
+        <w:pStyle w:val="ListParagraph"/>
+        <w:numPr>
+          <w:ilvl w:val="0"/>
+          <w:numId w:val="1"/>
+        </w:numPr>
+        <w:tabs>
+          <w:tab w:val="left" w:pos="743"/>
+        </w:tabs>
+        <w:spacing w:line="278" w:lineRule="auto"/>
+        <w:ind w:right="25"/>
+        <w:jc w:val="both"/>
+        <w:rPr>
+          <w:rFonts w:ascii="Cambria" w:hAnsi="Cambria"/>
+          <w:sz w:val="24"/>
+          <w:szCs w:val="24"/>
+        </w:rPr>
+      </w:pPr>
+      <w:r>
+        <w:rPr>
+          <w:rFonts w:ascii="Cambria" w:hAnsi="Cambria"/>
+          <w:sz w:val="24"/>
+          <w:szCs w:val="24"/>
+        </w:rPr>
+        <w:t>Describe the role of aggregates in modeling business applications. Provide examples from social media or retail.</w:t>
+      </w:r>
+    </w:p>
+    <w:p>
+      <w:pPr>
+        <w:pStyle w:val="ListParagraph"/>
+        <w:numPr>
+          <w:ilvl w:val="0"/>
+          <w:numId w:val="1"/>
+        </w:numPr>
+        <w:tabs>
+          <w:tab w:val="left" w:pos="743"/>
+        </w:tabs>
+        <w:spacing w:line="278" w:lineRule="auto"/>
+        <w:ind w:right="25"/>
+        <w:jc w:val="both"/>
+        <w:rPr>
+          <w:rFonts w:ascii="Cambria" w:hAnsi="Cambria"/>
+          <w:sz w:val="24"/>
+          <w:szCs w:val="24"/>
+        </w:rPr>
+      </w:pPr>
+      <w:r>
+        <w:rPr>
+          <w:rFonts w:ascii="Cambria" w:hAnsi="Cambria" w:cstheme="minorHAnsi"/>
+          <w:sz w:val="24"/>
+          <w:szCs w:val="24"/>
+        </w:rPr>
+        <w:t>Define a graph database?</w:t>
+      </w:r>
+      <w:r>
+        <w:rPr>
+          <w:rFonts w:ascii="Cambria" w:hAnsi="Cambria" w:cstheme="minorHAnsi"/>
+          <w:sz w:val="24"/>
+          <w:szCs w:val="24"/>
+        </w:rPr>
+        <w:t xml:space="preserve"> </w:t>
+      </w:r>
+      <w:r>
+        <w:rPr>
+          <w:rFonts w:ascii="Cambria" w:hAnsi="Cambria" w:cstheme="minorHAnsi"/>
+          <w:sz w:val="24"/>
+          <w:szCs w:val="24"/>
+        </w:rPr>
+        <w:t>Design a graph model for a “Food Delivery Application” showing customers, restaurants, delivery partners. Draw the graph and explain sample queries using Neo4j for node and edge creation.</w:t>
+      </w:r>
+    </w:p>
+    <w:p>
+      <w:pPr>
+        <w:pStyle w:val="ListParagraph"/>
+        <w:numPr>
+          <w:ilvl w:val="0"/>
+          <w:numId w:val="1"/>
+        </w:numPr>
+        <w:tabs>
+          <w:tab w:val="left" w:pos="743"/>
+        </w:tabs>
+        <w:spacing w:line="278" w:lineRule="auto"/>
+        <w:ind w:right="25"/>
+        <w:jc w:val="both"/>
+        <w:rPr>
+          <w:rFonts w:ascii="Cambria" w:hAnsi="Cambria"/>
+          <w:sz w:val="24"/>
+          <w:szCs w:val="24"/>
+        </w:rPr>
+      </w:pPr>
+      <w:r>
+        <w:rPr>
+          <w:rFonts w:ascii="Cambria" w:hAnsi="Cambria"/>
+          <w:sz w:val="24"/>
+          <w:szCs w:val="24"/>
+        </w:rPr>
+        <w:t xml:space="preserve">Compare </w:t>
+      </w:r>
+      <w:r>
+        <w:rPr>
+          <w:rStyle w:val="Strong"/>
+          <w:rFonts w:ascii="Cambria" w:hAnsi="Cambria"/>
+          <w:sz w:val="24"/>
+          <w:szCs w:val="24"/>
+        </w:rPr>
+        <w:t>Key-Value</w:t>
+      </w:r>
+      <w:r>
+        <w:rPr>
+          <w:rFonts w:ascii="Cambria" w:hAnsi="Cambria"/>
+          <w:sz w:val="24"/>
+          <w:szCs w:val="24"/>
+        </w:rPr>
+        <w:t xml:space="preserve">, </w:t>
+      </w:r>
+      <w:r>
+        <w:rPr>
+          <w:rStyle w:val="Strong"/>
+          <w:rFonts w:ascii="Cambria" w:hAnsi="Cambria"/>
+          <w:sz w:val="24"/>
+          <w:szCs w:val="24"/>
+        </w:rPr>
+        <w:t>Document</w:t>
+      </w:r>
+      <w:r>
+        <w:rPr>
+          <w:rFonts w:ascii="Cambria" w:hAnsi="Cambria"/>
+          <w:sz w:val="24"/>
+          <w:szCs w:val="24"/>
+        </w:rPr>
+        <w:t xml:space="preserve">, and </w:t>
+      </w:r>
+      <w:r>
+        <w:rPr>
+          <w:rStyle w:val="Strong"/>
+          <w:rFonts w:ascii="Cambria" w:hAnsi="Cambria"/>
+          <w:sz w:val="24"/>
+          <w:szCs w:val="24"/>
+        </w:rPr>
+        <w:t>Column-Family</w:t>
+      </w:r>
+      <w:r>
+        <w:rPr>
+          <w:rFonts w:ascii="Cambria" w:hAnsi="Cambria"/>
+          <w:sz w:val="24"/>
+          <w:szCs w:val="24"/>
+        </w:rPr>
+        <w:t xml:space="preserve"> data models with examples.</w:t>
+      </w:r>
+    </w:p>
+    <w:p>
+      <w:pPr>
+        <w:pStyle w:val="ListParagraph"/>
+        <w:numPr>
+          <w:ilvl w:val="0"/>
+          <w:numId w:val="1"/>
+        </w:numPr>
+        <w:tabs>
+          <w:tab w:val="left" w:pos="743"/>
+        </w:tabs>
+        <w:spacing w:line="278" w:lineRule="auto"/>
+        <w:ind w:right="25"/>
+        <w:jc w:val="both"/>
+        <w:rPr>
+          <w:rFonts w:ascii="Cambria" w:hAnsi="Cambria"/>
+          <w:sz w:val="24"/>
+          <w:szCs w:val="24"/>
+        </w:rPr>
+      </w:pPr>
+      <w:r>
+        <w:rPr>
+          <w:rFonts w:ascii="Cambria" w:hAnsi="Cambria"/>
+          <w:sz w:val="24"/>
+          <w:szCs w:val="24"/>
+        </w:rPr>
+        <w:t>Analyze why Graph Databases are inherently better at handling deeply interconnected data than relational or aggregate-oriented databases. Use the example of a social network.</w:t>
+      </w:r>
+    </w:p>
+    <w:p>
+      <w:pPr>
+        <w:pStyle w:val="ListParagraph"/>
+        <w:numPr>
+          <w:ilvl w:val="0"/>
+          <w:numId w:val="1"/>
+        </w:numPr>
+        <w:tabs>
+          <w:tab w:val="left" w:pos="743"/>
+        </w:tabs>
+        <w:spacing w:line="278" w:lineRule="auto"/>
+        <w:ind w:right="25"/>
+        <w:jc w:val="both"/>
+        <w:rPr>
+          <w:rFonts w:ascii="Cambria" w:hAnsi="Cambria"/>
+          <w:sz w:val="24"/>
+          <w:szCs w:val="24"/>
+        </w:rPr>
+      </w:pPr>
+      <w:r>
+        <w:rPr>
+          <w:rFonts w:ascii="Cambria" w:hAnsi="Cambria"/>
+          <w:sz w:val="24"/>
+          <w:szCs w:val="24"/>
+        </w:rPr>
+        <w:t>Propose a use case for a Graph Database in "Routing, Dispatch, and Location-Based Services" that would be inefficient in a SQL database.</w:t>
+      </w:r>
+    </w:p>
+    <w:p>
+      <w:pPr>
+        <w:pStyle w:val="ListParagraph"/>
+        <w:numPr>
+          <w:ilvl w:val="0"/>
+          <w:numId w:val="1"/>
+        </w:numPr>
+        <w:tabs>
+          <w:tab w:val="left" w:pos="743"/>
+        </w:tabs>
+        <w:spacing w:line="278" w:lineRule="auto"/>
+        <w:ind w:right="25"/>
+        <w:jc w:val="both"/>
+        <w:rPr>
+          <w:rFonts w:ascii="Cambria" w:hAnsi="Cambria"/>
+          <w:sz w:val="24"/>
+          <w:szCs w:val="24"/>
+        </w:rPr>
+      </w:pPr>
+      <w:r>
+        <w:rPr>
+          <w:rFonts w:ascii="Cambria" w:hAnsi="Cambria"/>
+          <w:sz w:val="24"/>
+          <w:szCs w:val="24"/>
+        </w:rPr>
+        <w:t>Evaluate the challenges of scaling a Graph Database in a peer-to-peer cluster.</w:t>
+      </w:r>
+    </w:p>
+    <w:p>
+      <w:pPr>
+        <w:pStyle w:val="ListParagraph"/>
+        <w:numPr>
+          <w:ilvl w:val="0"/>
+          <w:numId w:val="1"/>
+        </w:numPr>
+        <w:tabs>
+          <w:tab w:val="left" w:pos="743"/>
+        </w:tabs>
+        <w:spacing w:line="278" w:lineRule="auto"/>
+        <w:ind w:right="25"/>
+        <w:jc w:val="both"/>
+        <w:rPr>
+          <w:rFonts w:ascii="Cambria" w:hAnsi="Cambria"/>
+          <w:sz w:val="24"/>
+          <w:szCs w:val="24"/>
+        </w:rPr>
+      </w:pPr>
+      <w:r>
+        <w:rPr>
+          <w:rFonts w:ascii="Cambria" w:hAnsi="Cambria" w:cstheme="minorHAnsi"/>
+          <w:sz w:val="24"/>
+          <w:szCs w:val="24"/>
+        </w:rPr>
+        <w:t>Design a key-value store for managing user session data, shopping cart information, and user preferences in an online shopping platform.</w:t>
+      </w:r>
+      <w:r>
+        <w:rPr>
+          <w:rFonts w:ascii="Cambria" w:hAnsi="Cambria" w:cstheme="minorHAnsi"/>
+          <w:sz w:val="24"/>
+          <w:szCs w:val="24"/>
+        </w:rPr>
+        <w:t xml:space="preserve"> </w:t>
+      </w:r>
+      <w:r>
+        <w:rPr>
+          <w:rFonts w:ascii="Cambria" w:hAnsi="Cambria" w:cstheme="minorHAnsi"/>
+          <w:sz w:val="24"/>
+          <w:szCs w:val="24"/>
+        </w:rPr>
+        <w:t>Explain the features and structures of data in key-value database.</w:t>
+      </w:r>
+    </w:p>
+    <w:p>
+      <w:pPr>
+        <w:pStyle w:val="ListParagraph"/>
+        <w:numPr>
+          <w:ilvl w:val="0"/>
+          <w:numId w:val="1"/>
+        </w:numPr>
+        <w:tabs>
+          <w:tab w:val="left" w:pos="743"/>
+        </w:tabs>
+        <w:spacing w:line="278" w:lineRule="auto"/>
+        <w:ind w:right="25"/>
+        <w:jc w:val="both"/>
+        <w:rPr>
+          <w:rFonts w:ascii="Cambria" w:hAnsi="Cambria"/>
+          <w:sz w:val="24"/>
+          <w:szCs w:val="24"/>
+        </w:rPr>
+      </w:pPr>
+      <w:r>
+        <w:rPr>
+          <w:rFonts w:ascii="Cambria" w:hAnsi="Cambria"/>
+          <w:sz w:val="24"/>
+          <w:szCs w:val="24"/>
+        </w:rPr>
+        <w:t xml:space="preserve">Design a </w:t>
+      </w:r>
+      <w:r>
+        <w:rPr>
+          <w:rStyle w:val="Strong"/>
+          <w:rFonts w:ascii="Cambria" w:hAnsi="Cambria"/>
+          <w:sz w:val="24"/>
+          <w:szCs w:val="24"/>
+        </w:rPr>
+        <w:t>library management database</w:t>
+      </w:r>
+      <w:r>
+        <w:rPr>
+          <w:rFonts w:ascii="Cambria" w:hAnsi="Cambria"/>
+          <w:sz w:val="24"/>
+          <w:szCs w:val="24"/>
+        </w:rPr>
+        <w:t xml:space="preserve"> with authors, books, and borrow records. Using aggregate-oriented design, model borrow transactions within the member document. Provide example documents for at least one member with multiple borrow records.</w:t>
+      </w:r>
+    </w:p>
+    <w:p>
+      <w:pPr>
+        <w:pStyle w:val="ListParagraph"/>
+        <w:numPr>
+          <w:ilvl w:val="0"/>
+          <w:numId w:val="1"/>
+        </w:numPr>
+        <w:tabs>
+          <w:tab w:val="left" w:pos="743"/>
+        </w:tabs>
+        <w:spacing w:line="278" w:lineRule="auto"/>
+        <w:ind w:right="25"/>
+        <w:jc w:val="both"/>
+        <w:rPr>
+          <w:rFonts w:ascii="Cambria" w:hAnsi="Cambria"/>
+          <w:sz w:val="24"/>
+          <w:szCs w:val="24"/>
+        </w:rPr>
+      </w:pPr>
+      <w:r>
+        <w:rPr>
+          <w:rFonts w:ascii="Cambria" w:hAnsi="Cambria"/>
+          <w:sz w:val="24"/>
+          <w:szCs w:val="24"/>
+        </w:rPr>
+        <w:t>Critically assess the transaction and consistency model of a typical Graph Database. How does it support ACID properties compared to other NoSQL stores?</w:t>
+      </w:r>
+    </w:p>
+    <w:p>
+      <w:pPr>
+        <w:pStyle w:val="ListParagraph"/>
+        <w:numPr>
+          <w:ilvl w:val="0"/>
+          <w:numId w:val="1"/>
+        </w:numPr>
+        <w:tabs>
+          <w:tab w:val="left" w:pos="743"/>
+        </w:tabs>
+        <w:spacing w:line="278" w:lineRule="auto"/>
+        <w:ind w:right="25"/>
+        <w:jc w:val="both"/>
+        <w:rPr>
+          <w:rFonts w:ascii="Cambria" w:hAnsi="Cambria"/>
+          <w:sz w:val="24"/>
+          <w:szCs w:val="24"/>
+        </w:rPr>
+      </w:pPr>
+      <w:r>
+        <w:rPr>
+          <w:rFonts w:ascii="Cambria" w:hAnsi="Cambria"/>
+          <w:sz w:val="24"/>
+          <w:szCs w:val="24"/>
+        </w:rPr>
+        <w:t>Design a simple graph model for a recommendation engine that suggests "friends you may know."</w:t>
+      </w:r>
+    </w:p>
+    <w:p>
+      <w:pPr>
+        <w:pStyle w:val="ListParagraph"/>
+        <w:numPr>
+          <w:ilvl w:val="0"/>
+          <w:numId w:val="1"/>
+        </w:numPr>
+        <w:tabs>
+          <w:tab w:val="left" w:pos="743"/>
+        </w:tabs>
+        <w:spacing w:line="278" w:lineRule="auto"/>
+        <w:ind w:right="25"/>
+        <w:jc w:val="both"/>
+        <w:rPr>
+          <w:rFonts w:ascii="Cambria" w:hAnsi="Cambria"/>
+          <w:sz w:val="24"/>
+          <w:szCs w:val="24"/>
+        </w:rPr>
+      </w:pPr>
+      <w:r>
+        <w:rPr>
+          <w:rFonts w:ascii="Cambria" w:hAnsi="Cambria"/>
+          <w:sz w:val="24"/>
+          <w:szCs w:val="24"/>
+        </w:rPr>
+        <w:t>Justify why a Graph Database is not the best tool for performing large-scale aggregations across all entities (e.g., total sales sum).</w:t>
+      </w:r>
+    </w:p>
+    <w:p>
+      <w:pPr>
+        <w:pStyle w:val="ListParagraph"/>
+        <w:numPr>
+          <w:ilvl w:val="0"/>
+          <w:numId w:val="1"/>
+        </w:numPr>
+        <w:tabs>
+          <w:tab w:val="left" w:pos="743"/>
+        </w:tabs>
+        <w:spacing w:line="278" w:lineRule="auto"/>
+        <w:ind w:right="25"/>
+        <w:jc w:val="both"/>
+        <w:rPr>
+          <w:rFonts w:ascii="Cambria" w:hAnsi="Cambria"/>
+          <w:sz w:val="24"/>
+          <w:szCs w:val="24"/>
+        </w:rPr>
+      </w:pPr>
+      <w:r>
+        <w:rPr>
+          <w:rFonts w:ascii="Cambria" w:hAnsi="Cambria" w:cstheme="minorHAnsi"/>
+          <w:sz w:val="24"/>
+          <w:szCs w:val="24"/>
+        </w:rPr>
+        <w:t xml:space="preserve">Design a </w:t>
+      </w:r>
+      <w:proofErr w:type="spellStart"/>
+      <w:r>
+        <w:rPr>
+          <w:rFonts w:ascii="Cambria" w:hAnsi="Cambria" w:cstheme="minorHAnsi"/>
+          <w:sz w:val="24"/>
+          <w:szCs w:val="24"/>
+        </w:rPr>
+        <w:t>sharding</w:t>
+      </w:r>
+      <w:proofErr w:type="spellEnd"/>
+      <w:r>
+        <w:rPr>
+          <w:rFonts w:ascii="Cambria" w:hAnsi="Cambria" w:cstheme="minorHAnsi"/>
+          <w:sz w:val="24"/>
+          <w:szCs w:val="24"/>
+        </w:rPr>
+        <w:t xml:space="preserve"> strategy for an e-commerce application to distribute “Orders” collection across multiple shards based on region and date.</w:t>
+      </w:r>
+      <w:r>
+        <w:rPr>
+          <w:rFonts w:ascii="Cambria" w:hAnsi="Cambria" w:cstheme="minorHAnsi"/>
+          <w:sz w:val="24"/>
+          <w:szCs w:val="24"/>
+        </w:rPr>
+        <w:t xml:space="preserve"> </w:t>
+      </w:r>
+      <w:r>
+        <w:rPr>
+          <w:rFonts w:ascii="Cambria" w:hAnsi="Cambria" w:cstheme="minorHAnsi"/>
+          <w:sz w:val="24"/>
+          <w:szCs w:val="24"/>
+        </w:rPr>
+        <w:t>Explain how horizontal partitioning works in MongoDB.</w:t>
+      </w:r>
+    </w:p>
+    <w:p>
+      <w:pPr>
+        <w:pStyle w:val="ListParagraph"/>
+        <w:numPr>
+          <w:ilvl w:val="0"/>
+          <w:numId w:val="1"/>
+        </w:numPr>
+        <w:tabs>
+          <w:tab w:val="left" w:pos="743"/>
+        </w:tabs>
+        <w:spacing w:line="278" w:lineRule="auto"/>
+        <w:ind w:right="25"/>
+        <w:jc w:val="both"/>
+        <w:rPr>
+          <w:rFonts w:ascii="Cambria" w:hAnsi="Cambria"/>
+          <w:sz w:val="24"/>
+          <w:szCs w:val="24"/>
+        </w:rPr>
+      </w:pPr>
+      <w:r>
+        <w:rPr>
+          <w:rFonts w:ascii="Cambria" w:hAnsi="Cambria"/>
+          <w:sz w:val="24"/>
+          <w:szCs w:val="24"/>
+        </w:rPr>
+        <w:t xml:space="preserve">In a </w:t>
+      </w:r>
+      <w:r>
+        <w:rPr>
+          <w:rStyle w:val="Strong"/>
+          <w:rFonts w:ascii="Cambria" w:hAnsi="Cambria"/>
+          <w:sz w:val="24"/>
+          <w:szCs w:val="24"/>
+        </w:rPr>
+        <w:t>banking system</w:t>
+      </w:r>
+      <w:r>
+        <w:rPr>
+          <w:rFonts w:ascii="Cambria" w:hAnsi="Cambria"/>
+          <w:sz w:val="24"/>
+          <w:szCs w:val="24"/>
+        </w:rPr>
+        <w:t xml:space="preserve">, customers can have multiple accounts and each account can have multiple transactions. Model this using an </w:t>
+      </w:r>
+      <w:r>
+        <w:rPr>
+          <w:rStyle w:val="Strong"/>
+          <w:rFonts w:ascii="Cambria" w:hAnsi="Cambria"/>
+          <w:sz w:val="24"/>
+          <w:szCs w:val="24"/>
+        </w:rPr>
+        <w:t>aggregate-oriented schema</w:t>
+      </w:r>
+      <w:r>
+        <w:rPr>
+          <w:rFonts w:ascii="Cambria" w:hAnsi="Cambria"/>
+          <w:sz w:val="24"/>
+          <w:szCs w:val="24"/>
+        </w:rPr>
+        <w:t xml:space="preserve"> where each customer embeds accounts and their transactions. Provide example documents for one customer with at least two accounts.</w:t>
+      </w:r>
+    </w:p>
+    <w:p>
+      <w:pPr>
+        <w:pStyle w:val="ListParagraph"/>
+        <w:numPr>
+          <w:ilvl w:val="0"/>
+          <w:numId w:val="1"/>
+        </w:numPr>
+        <w:tabs>
+          <w:tab w:val="left" w:pos="743"/>
+        </w:tabs>
+        <w:spacing w:line="278" w:lineRule="auto"/>
+        <w:ind w:right="25"/>
+        <w:jc w:val="both"/>
+        <w:rPr>
+          <w:rFonts w:ascii="Cambria" w:hAnsi="Cambria"/>
+          <w:sz w:val="24"/>
+          <w:szCs w:val="24"/>
+        </w:rPr>
+      </w:pPr>
+      <w:r>
+        <w:rPr>
+          <w:rFonts w:ascii="Cambria" w:hAnsi="Cambria"/>
+          <w:sz w:val="24"/>
+          <w:szCs w:val="24"/>
+        </w:rPr>
+        <w:t>Compare and contrast master-slave replication and peer-to-peer replication. Which scenarios are best suited for each?</w:t>
+      </w:r>
+    </w:p>
+    <w:p>
+      <w:pPr>
+        <w:pStyle w:val="ListParagraph"/>
+        <w:numPr>
+          <w:ilvl w:val="0"/>
+          <w:numId w:val="1"/>
+        </w:numPr>
+        <w:tabs>
+          <w:tab w:val="left" w:pos="743"/>
+        </w:tabs>
+        <w:spacing w:line="278" w:lineRule="auto"/>
+        <w:ind w:right="25"/>
+        <w:jc w:val="both"/>
+        <w:rPr>
+          <w:rFonts w:ascii="Cambria" w:hAnsi="Cambria"/>
+          <w:sz w:val="24"/>
+          <w:szCs w:val="24"/>
+        </w:rPr>
+      </w:pPr>
+      <w:r>
+        <w:rPr>
+          <w:rFonts w:ascii="Cambria" w:hAnsi="Cambria"/>
+          <w:sz w:val="24"/>
+          <w:szCs w:val="24"/>
+        </w:rPr>
+        <w:t xml:space="preserve">Illustrate how </w:t>
+      </w:r>
+      <w:proofErr w:type="spellStart"/>
+      <w:r>
+        <w:rPr>
+          <w:rFonts w:ascii="Cambria" w:hAnsi="Cambria"/>
+          <w:sz w:val="24"/>
+          <w:szCs w:val="24"/>
+        </w:rPr>
+        <w:t>sharding</w:t>
+      </w:r>
+      <w:proofErr w:type="spellEnd"/>
+      <w:r>
+        <w:rPr>
+          <w:rFonts w:ascii="Cambria" w:hAnsi="Cambria"/>
+          <w:sz w:val="24"/>
+          <w:szCs w:val="24"/>
+        </w:rPr>
+        <w:t xml:space="preserve"> can be combined with replication to achieve both scalability and availability.</w:t>
+      </w:r>
+      <w:r>
+        <w:rPr>
+          <w:rFonts w:ascii="Cambria" w:hAnsi="Cambria"/>
+          <w:sz w:val="24"/>
+          <w:szCs w:val="24"/>
+        </w:rPr>
+        <w:t xml:space="preserve"> </w:t>
+      </w:r>
+      <w:r>
+        <w:rPr>
+          <w:rFonts w:ascii="Cambria" w:hAnsi="Cambria"/>
+          <w:sz w:val="24"/>
+          <w:szCs w:val="24"/>
+        </w:rPr>
+        <w:t>Analyze the CAP theorem. For a distributed banking system, which two characteristics would you prioritize and why?</w:t>
+      </w:r>
+    </w:p>
+    <w:p>
+      <w:pPr>
+        <w:pStyle w:val="ListParagraph"/>
+        <w:numPr>
+          <w:ilvl w:val="0"/>
+          <w:numId w:val="1"/>
+        </w:numPr>
+        <w:tabs>
+          <w:tab w:val="left" w:pos="743"/>
+        </w:tabs>
+        <w:spacing w:line="278" w:lineRule="auto"/>
+        <w:ind w:right="25"/>
+        <w:jc w:val="both"/>
+        <w:rPr>
+          <w:rFonts w:ascii="Cambria" w:hAnsi="Cambria"/>
+          <w:sz w:val="24"/>
+          <w:szCs w:val="24"/>
+        </w:rPr>
+      </w:pPr>
+      <w:r>
+        <w:rPr>
+          <w:rFonts w:ascii="Cambria" w:hAnsi="Cambria"/>
           <w:sz w:val="24"/>
           <w:szCs w:val="24"/>
         </w:rPr>
@@ -1778,7 +3979,7 @@
       <w:r>
         <w:rPr>
           <w:rStyle w:val="Strong"/>
-          <w:rFonts w:asciiTheme="majorHAnsi" w:hAnsiTheme="majorHAnsi"/>
+          <w:rFonts w:ascii="Cambria" w:hAnsi="Cambria"/>
           <w:sz w:val="24"/>
           <w:szCs w:val="24"/>
         </w:rPr>
@@ -1786,7 +3987,7 @@
       </w:r>
       <w:r>
         <w:rPr>
-          <w:rFonts w:asciiTheme="majorHAnsi" w:hAnsiTheme="majorHAnsi"/>
+          <w:rFonts w:ascii="Cambria" w:hAnsi="Cambria"/>
           <w:sz w:val="24"/>
           <w:szCs w:val="24"/>
         </w:rPr>
@@ -1795,7 +3996,7 @@
       <w:r>
         <w:rPr>
           <w:rStyle w:val="Strong"/>
-          <w:rFonts w:asciiTheme="majorHAnsi" w:hAnsiTheme="majorHAnsi"/>
+          <w:rFonts w:ascii="Cambria" w:hAnsi="Cambria"/>
           <w:sz w:val="24"/>
           <w:szCs w:val="24"/>
         </w:rPr>
@@ -1803,11 +4004,39 @@
       </w:r>
       <w:r>
         <w:rPr>
-          <w:rFonts w:asciiTheme="majorHAnsi" w:hAnsiTheme="majorHAnsi"/>
+          <w:rFonts w:ascii="Cambria" w:hAnsi="Cambria"/>
           <w:sz w:val="24"/>
           <w:szCs w:val="24"/>
         </w:rPr>
         <w:t xml:space="preserve"> ensures consistency. Provide a diagram.</w:t>
+      </w:r>
+    </w:p>
+    <w:p>
+      <w:pPr>
+        <w:pStyle w:val="ListParagraph"/>
+        <w:numPr>
+          <w:ilvl w:val="0"/>
+          <w:numId w:val="1"/>
+        </w:numPr>
+        <w:tabs>
+          <w:tab w:val="left" w:pos="743"/>
+        </w:tabs>
+        <w:spacing w:line="278" w:lineRule="auto"/>
+        <w:ind w:right="25"/>
+        <w:jc w:val="both"/>
+        <w:rPr>
+          <w:rFonts w:ascii="Cambria" w:hAnsi="Cambria"/>
+          <w:sz w:val="24"/>
+          <w:szCs w:val="24"/>
+        </w:rPr>
+      </w:pPr>
+      <w:r>
+        <w:rPr>
+          <w:rFonts w:ascii="Cambria" w:hAnsi="Cambria"/>
+          <w:sz w:val="24"/>
+          <w:szCs w:val="24"/>
+        </w:rPr>
+        <w:t>Explain the trade-off involved when "Relaxing Durability" in a distributed data store.</w:t>
       </w:r>
     </w:p>
     <w:p>
@@ -1824,14 +4053,14 @@
         <w:ind w:right="21"/>
         <w:jc w:val="both"/>
         <w:rPr>
-          <w:rFonts w:asciiTheme="majorHAnsi" w:hAnsiTheme="majorHAnsi"/>
-          <w:sz w:val="24"/>
-          <w:szCs w:val="24"/>
-        </w:rPr>
-      </w:pPr>
-      <w:r>
-        <w:rPr>
-          <w:rFonts w:asciiTheme="majorHAnsi" w:hAnsiTheme="majorHAnsi"/>
+          <w:rFonts w:ascii="Cambria" w:hAnsi="Cambria"/>
+          <w:sz w:val="24"/>
+          <w:szCs w:val="24"/>
+        </w:rPr>
+      </w:pPr>
+      <w:r>
+        <w:rPr>
+          <w:rFonts w:ascii="Cambria" w:hAnsi="Cambria"/>
           <w:sz w:val="24"/>
           <w:szCs w:val="24"/>
         </w:rPr>
@@ -1840,7 +4069,7 @@
       <w:proofErr w:type="gramStart"/>
       <w:r>
         <w:rPr>
-          <w:rFonts w:asciiTheme="majorHAnsi" w:hAnsiTheme="majorHAnsi"/>
+          <w:rFonts w:ascii="Cambria" w:hAnsi="Cambria"/>
           <w:sz w:val="24"/>
           <w:szCs w:val="24"/>
         </w:rPr>
@@ -1849,7 +4078,7 @@
       <w:proofErr w:type="gramEnd"/>
       <w:r>
         <w:rPr>
-          <w:rFonts w:asciiTheme="majorHAnsi" w:hAnsiTheme="majorHAnsi"/>
+          <w:rFonts w:ascii="Cambria" w:hAnsi="Cambria"/>
           <w:sz w:val="24"/>
           <w:szCs w:val="24"/>
         </w:rPr>
@@ -1857,7 +4086,7 @@
       </w:r>
       <w:r>
         <w:rPr>
-          <w:rFonts w:asciiTheme="majorHAnsi" w:hAnsiTheme="majorHAnsi"/>
+          <w:rFonts w:ascii="Cambria" w:hAnsi="Cambria"/>
           <w:b/>
           <w:sz w:val="24"/>
           <w:szCs w:val="24"/>
@@ -1866,11 +4095,20 @@
       </w:r>
       <w:r>
         <w:rPr>
-          <w:rFonts w:asciiTheme="majorHAnsi" w:hAnsiTheme="majorHAnsi"/>
-          <w:sz w:val="24"/>
-          <w:szCs w:val="24"/>
-        </w:rPr>
-        <w:t>and Discuss benefits of materialized view.</w:t>
+          <w:rFonts w:ascii="Cambria" w:hAnsi="Cambria"/>
+          <w:sz w:val="24"/>
+          <w:szCs w:val="24"/>
+        </w:rPr>
+        <w:t xml:space="preserve">and Discuss benefits of </w:t>
+      </w:r>
+      <w:r>
+        <w:rPr>
+          <w:rFonts w:ascii="Cambria" w:hAnsi="Cambria"/>
+          <w:sz w:val="24"/>
+          <w:szCs w:val="24"/>
+        </w:rPr>
+        <w:lastRenderedPageBreak/>
+        <w:t>materialized view.</w:t>
       </w:r>
     </w:p>
     <w:p>
@@ -1887,14 +4125,50 @@
         <w:ind w:right="21"/>
         <w:jc w:val="both"/>
         <w:rPr>
-          <w:rFonts w:asciiTheme="majorHAnsi" w:hAnsiTheme="majorHAnsi"/>
-          <w:sz w:val="24"/>
-          <w:szCs w:val="24"/>
-        </w:rPr>
-      </w:pPr>
-      <w:r>
-        <w:rPr>
-          <w:rFonts w:asciiTheme="majorHAnsi" w:hAnsiTheme="majorHAnsi"/>
+          <w:rFonts w:ascii="Cambria" w:hAnsi="Cambria"/>
+          <w:sz w:val="24"/>
+          <w:szCs w:val="24"/>
+        </w:rPr>
+      </w:pPr>
+      <w:r>
+        <w:rPr>
+          <w:rFonts w:ascii="Cambria" w:hAnsi="Cambria" w:cstheme="minorHAnsi"/>
+          <w:sz w:val="24"/>
+          <w:szCs w:val="24"/>
+        </w:rPr>
+        <w:t>Design a document model for a hospital management system where each patient document stores personal details, medical history, prescriptions, and doctor references. Provide sample JSON.</w:t>
+      </w:r>
+      <w:r>
+        <w:rPr>
+          <w:rFonts w:ascii="Cambria" w:hAnsi="Cambria" w:cstheme="minorHAnsi"/>
+          <w:sz w:val="24"/>
+          <w:szCs w:val="24"/>
+        </w:rPr>
+        <w:t xml:space="preserve"> </w:t>
+      </w:r>
+    </w:p>
+    <w:p>
+      <w:pPr>
+        <w:pStyle w:val="ListParagraph"/>
+        <w:numPr>
+          <w:ilvl w:val="0"/>
+          <w:numId w:val="1"/>
+        </w:numPr>
+        <w:tabs>
+          <w:tab w:val="left" w:pos="743"/>
+        </w:tabs>
+        <w:spacing w:before="37" w:line="276" w:lineRule="auto"/>
+        <w:ind w:right="21"/>
+        <w:jc w:val="both"/>
+        <w:rPr>
+          <w:rFonts w:ascii="Cambria" w:hAnsi="Cambria"/>
+          <w:sz w:val="24"/>
+          <w:szCs w:val="24"/>
+        </w:rPr>
+      </w:pPr>
+      <w:r>
+        <w:rPr>
+          <w:rFonts w:ascii="Cambria" w:hAnsi="Cambria"/>
           <w:sz w:val="24"/>
           <w:szCs w:val="24"/>
         </w:rPr>
@@ -1903,7 +4177,7 @@
       <w:r>
         <w:rPr>
           <w:rStyle w:val="Strong"/>
-          <w:rFonts w:asciiTheme="majorHAnsi" w:hAnsiTheme="majorHAnsi"/>
+          <w:rFonts w:ascii="Cambria" w:hAnsi="Cambria"/>
           <w:sz w:val="24"/>
           <w:szCs w:val="24"/>
         </w:rPr>
@@ -1911,11 +4185,39 @@
       </w:r>
       <w:r>
         <w:rPr>
-          <w:rFonts w:asciiTheme="majorHAnsi" w:hAnsiTheme="majorHAnsi"/>
+          <w:rFonts w:ascii="Cambria" w:hAnsi="Cambria"/>
           <w:sz w:val="24"/>
           <w:szCs w:val="24"/>
         </w:rPr>
         <w:t xml:space="preserve"> and their role in distributed databases.</w:t>
+      </w:r>
+    </w:p>
+    <w:p>
+      <w:pPr>
+        <w:pStyle w:val="ListParagraph"/>
+        <w:numPr>
+          <w:ilvl w:val="0"/>
+          <w:numId w:val="1"/>
+        </w:numPr>
+        <w:tabs>
+          <w:tab w:val="left" w:pos="743"/>
+        </w:tabs>
+        <w:spacing w:before="37" w:line="276" w:lineRule="auto"/>
+        <w:ind w:right="21"/>
+        <w:jc w:val="both"/>
+        <w:rPr>
+          <w:rFonts w:ascii="Cambria" w:hAnsi="Cambria"/>
+          <w:sz w:val="24"/>
+          <w:szCs w:val="24"/>
+        </w:rPr>
+      </w:pPr>
+      <w:r>
+        <w:rPr>
+          <w:rFonts w:ascii="Cambria" w:hAnsi="Cambria" w:cstheme="minorHAnsi"/>
+          <w:sz w:val="24"/>
+          <w:szCs w:val="24"/>
+        </w:rPr>
+        <w:t>Critically evaluate a scenario where a Document-oriented database would be an inappropriate choice. What specific characteristics would lead to this conclusion?</w:t>
       </w:r>
     </w:p>
     <w:p>
@@ -1932,14 +4234,14 @@
         <w:ind w:left="742" w:hanging="359"/>
         <w:jc w:val="both"/>
         <w:rPr>
-          <w:rFonts w:asciiTheme="majorHAnsi" w:hAnsiTheme="majorHAnsi"/>
-          <w:sz w:val="24"/>
-          <w:szCs w:val="24"/>
-        </w:rPr>
-      </w:pPr>
-      <w:r>
-        <w:rPr>
-          <w:rFonts w:asciiTheme="majorHAnsi" w:hAnsiTheme="majorHAnsi"/>
+          <w:rFonts w:ascii="Cambria" w:hAnsi="Cambria"/>
+          <w:sz w:val="24"/>
+          <w:szCs w:val="24"/>
+        </w:rPr>
+      </w:pPr>
+      <w:r>
+        <w:rPr>
+          <w:rFonts w:ascii="Cambria" w:hAnsi="Cambria"/>
           <w:sz w:val="24"/>
           <w:szCs w:val="24"/>
         </w:rPr>
@@ -1948,7 +4250,7 @@
       <w:r>
         <w:rPr>
           <w:rStyle w:val="Strong"/>
-          <w:rFonts w:asciiTheme="majorHAnsi" w:hAnsiTheme="majorHAnsi"/>
+          <w:rFonts w:ascii="Cambria" w:hAnsi="Cambria"/>
           <w:sz w:val="24"/>
           <w:szCs w:val="24"/>
         </w:rPr>
@@ -1956,7 +4258,7 @@
       </w:r>
       <w:r>
         <w:rPr>
-          <w:rFonts w:asciiTheme="majorHAnsi" w:hAnsiTheme="majorHAnsi"/>
+          <w:rFonts w:ascii="Cambria" w:hAnsi="Cambria"/>
           <w:sz w:val="24"/>
           <w:szCs w:val="24"/>
         </w:rPr>
@@ -1977,14 +4279,14 @@
         <w:ind w:left="742" w:hanging="359"/>
         <w:jc w:val="both"/>
         <w:rPr>
-          <w:rFonts w:asciiTheme="majorHAnsi" w:hAnsiTheme="majorHAnsi"/>
-          <w:sz w:val="24"/>
-          <w:szCs w:val="24"/>
-        </w:rPr>
-      </w:pPr>
-      <w:r>
-        <w:rPr>
-          <w:rFonts w:asciiTheme="majorHAnsi" w:hAnsiTheme="majorHAnsi"/>
+          <w:rFonts w:ascii="Cambria" w:hAnsi="Cambria"/>
+          <w:sz w:val="24"/>
+          <w:szCs w:val="24"/>
+        </w:rPr>
+      </w:pPr>
+      <w:r>
+        <w:rPr>
+          <w:rFonts w:ascii="Cambria" w:hAnsi="Cambria"/>
           <w:sz w:val="24"/>
           <w:szCs w:val="24"/>
         </w:rPr>
@@ -1993,7 +4295,7 @@
       <w:r>
         <w:rPr>
           <w:rStyle w:val="Strong"/>
-          <w:rFonts w:asciiTheme="majorHAnsi" w:hAnsiTheme="majorHAnsi"/>
+          <w:rFonts w:ascii="Cambria" w:hAnsi="Cambria"/>
           <w:sz w:val="24"/>
           <w:szCs w:val="24"/>
         </w:rPr>
@@ -2001,7 +4303,7 @@
       </w:r>
       <w:r>
         <w:rPr>
-          <w:rFonts w:asciiTheme="majorHAnsi" w:hAnsiTheme="majorHAnsi"/>
+          <w:rFonts w:ascii="Cambria" w:hAnsi="Cambria"/>
           <w:sz w:val="24"/>
           <w:szCs w:val="24"/>
         </w:rPr>
@@ -2022,14 +4324,14 @@
         <w:ind w:left="742" w:hanging="359"/>
         <w:jc w:val="both"/>
         <w:rPr>
-          <w:rFonts w:asciiTheme="majorHAnsi" w:hAnsiTheme="majorHAnsi"/>
-          <w:sz w:val="24"/>
-          <w:szCs w:val="24"/>
-        </w:rPr>
-      </w:pPr>
-      <w:r>
-        <w:rPr>
-          <w:rFonts w:asciiTheme="majorHAnsi" w:hAnsiTheme="majorHAnsi"/>
+          <w:rFonts w:ascii="Cambria" w:hAnsi="Cambria"/>
+          <w:sz w:val="24"/>
+          <w:szCs w:val="24"/>
+        </w:rPr>
+      </w:pPr>
+      <w:r>
+        <w:rPr>
+          <w:rFonts w:ascii="Cambria" w:hAnsi="Cambria"/>
           <w:sz w:val="24"/>
           <w:szCs w:val="24"/>
         </w:rPr>
@@ -2038,7 +4340,7 @@
       <w:r>
         <w:rPr>
           <w:rStyle w:val="Strong"/>
-          <w:rFonts w:asciiTheme="majorHAnsi" w:hAnsiTheme="majorHAnsi"/>
+          <w:rFonts w:ascii="Cambria" w:hAnsi="Cambria"/>
           <w:sz w:val="24"/>
           <w:szCs w:val="24"/>
         </w:rPr>
@@ -2046,7 +4348,7 @@
       </w:r>
       <w:r>
         <w:rPr>
-          <w:rFonts w:asciiTheme="majorHAnsi" w:hAnsiTheme="majorHAnsi"/>
+          <w:rFonts w:ascii="Cambria" w:hAnsi="Cambria"/>
           <w:sz w:val="24"/>
           <w:szCs w:val="24"/>
         </w:rPr>
@@ -2055,7 +4357,7 @@
       <w:r>
         <w:rPr>
           <w:rStyle w:val="Strong"/>
-          <w:rFonts w:asciiTheme="majorHAnsi" w:hAnsiTheme="majorHAnsi"/>
+          <w:rFonts w:ascii="Cambria" w:hAnsi="Cambria"/>
           <w:sz w:val="24"/>
           <w:szCs w:val="24"/>
         </w:rPr>
@@ -2063,7 +4365,7 @@
       </w:r>
       <w:r>
         <w:rPr>
-          <w:rFonts w:asciiTheme="majorHAnsi" w:hAnsiTheme="majorHAnsi"/>
+          <w:rFonts w:ascii="Cambria" w:hAnsi="Cambria"/>
           <w:sz w:val="24"/>
           <w:szCs w:val="24"/>
         </w:rPr>
@@ -2072,7 +4374,7 @@
       <w:r>
         <w:rPr>
           <w:rStyle w:val="Strong"/>
-          <w:rFonts w:asciiTheme="majorHAnsi" w:hAnsiTheme="majorHAnsi"/>
+          <w:rFonts w:ascii="Cambria" w:hAnsi="Cambria"/>
           <w:sz w:val="24"/>
           <w:szCs w:val="24"/>
         </w:rPr>
@@ -2080,7 +4382,7 @@
       </w:r>
       <w:r>
         <w:rPr>
-          <w:rFonts w:asciiTheme="majorHAnsi" w:hAnsiTheme="majorHAnsi"/>
+          <w:rFonts w:ascii="Cambria" w:hAnsi="Cambria"/>
           <w:sz w:val="24"/>
           <w:szCs w:val="24"/>
         </w:rPr>
@@ -2101,14 +4403,14 @@
         <w:ind w:right="71"/>
         <w:jc w:val="both"/>
         <w:rPr>
-          <w:rFonts w:asciiTheme="majorHAnsi" w:hAnsiTheme="majorHAnsi"/>
-          <w:sz w:val="24"/>
-          <w:szCs w:val="24"/>
-        </w:rPr>
-      </w:pPr>
-      <w:r>
-        <w:rPr>
-          <w:rFonts w:asciiTheme="majorHAnsi" w:hAnsiTheme="majorHAnsi"/>
+          <w:rFonts w:ascii="Cambria" w:hAnsi="Cambria"/>
+          <w:sz w:val="24"/>
+          <w:szCs w:val="24"/>
+        </w:rPr>
+      </w:pPr>
+      <w:r>
+        <w:rPr>
+          <w:rFonts w:ascii="Cambria" w:hAnsi="Cambria"/>
           <w:sz w:val="24"/>
           <w:szCs w:val="24"/>
         </w:rPr>
@@ -2117,7 +4419,7 @@
       <w:r>
         <w:rPr>
           <w:rStyle w:val="Strong"/>
-          <w:rFonts w:asciiTheme="majorHAnsi" w:hAnsiTheme="majorHAnsi"/>
+          <w:rFonts w:ascii="Cambria" w:hAnsi="Cambria"/>
           <w:sz w:val="24"/>
           <w:szCs w:val="24"/>
         </w:rPr>
@@ -2125,7 +4427,7 @@
       </w:r>
       <w:r>
         <w:rPr>
-          <w:rFonts w:asciiTheme="majorHAnsi" w:hAnsiTheme="majorHAnsi"/>
+          <w:rFonts w:ascii="Cambria" w:hAnsi="Cambria"/>
           <w:sz w:val="24"/>
           <w:szCs w:val="24"/>
         </w:rPr>
@@ -2146,35 +4448,18 @@
         <w:ind w:right="71"/>
         <w:jc w:val="both"/>
         <w:rPr>
-          <w:rFonts w:asciiTheme="majorHAnsi" w:hAnsiTheme="majorHAnsi"/>
-          <w:sz w:val="24"/>
-          <w:szCs w:val="24"/>
-        </w:rPr>
-      </w:pPr>
-      <w:r>
-        <w:rPr>
-          <w:rFonts w:asciiTheme="majorHAnsi" w:hAnsiTheme="majorHAnsi"/>
-          <w:sz w:val="24"/>
-          <w:szCs w:val="24"/>
-        </w:rPr>
-        <w:t xml:space="preserve">Given a healthcare database (doctors, patients, appointments, prescription), design an aggregate-oriented schema that supports </w:t>
-      </w:r>
-      <w:r>
-        <w:rPr>
-          <w:rStyle w:val="Strong"/>
-          <w:rFonts w:asciiTheme="majorHAnsi" w:hAnsiTheme="majorHAnsi"/>
-          <w:sz w:val="24"/>
-          <w:szCs w:val="24"/>
-        </w:rPr>
-        <w:t>one-to-many relationships</w:t>
-      </w:r>
-      <w:r>
-        <w:rPr>
-          <w:rFonts w:asciiTheme="majorHAnsi" w:hAnsiTheme="majorHAnsi"/>
-          <w:sz w:val="24"/>
-          <w:szCs w:val="24"/>
-        </w:rPr>
-        <w:t xml:space="preserve"> between doctors and their patients. Provide example documents showing how doctors are embedded within a patient document.</w:t>
+          <w:rFonts w:ascii="Cambria" w:hAnsi="Cambria"/>
+          <w:sz w:val="24"/>
+          <w:szCs w:val="24"/>
+        </w:rPr>
+      </w:pPr>
+      <w:r>
+        <w:rPr>
+          <w:rFonts w:ascii="Cambria" w:hAnsi="Cambria"/>
+          <w:sz w:val="24"/>
+          <w:szCs w:val="24"/>
+        </w:rPr>
+        <w:t>Evaluate the challenges of ensuring atomic updates in a Document Database when multiple aggregates must be modified simultaneously. When does this limitation indicate the need for a relational or graph-based approach instead?</w:t>
       </w:r>
     </w:p>
     <w:p>
@@ -2191,44 +4476,70 @@
         <w:ind w:right="71"/>
         <w:jc w:val="both"/>
         <w:rPr>
-          <w:rFonts w:asciiTheme="majorHAnsi" w:hAnsiTheme="majorHAnsi"/>
-          <w:sz w:val="24"/>
-          <w:szCs w:val="24"/>
-        </w:rPr>
-      </w:pPr>
-      <w:r>
-        <w:rPr>
-          <w:rFonts w:asciiTheme="majorHAnsi" w:hAnsiTheme="majorHAnsi"/>
-          <w:sz w:val="24"/>
-          <w:szCs w:val="24"/>
-        </w:rPr>
-        <w:t xml:space="preserve">What are </w:t>
-      </w:r>
-      <w:r>
-        <w:rPr>
-          <w:rStyle w:val="Strong"/>
-          <w:rFonts w:asciiTheme="majorHAnsi" w:hAnsiTheme="majorHAnsi"/>
-          <w:sz w:val="24"/>
-          <w:szCs w:val="24"/>
-        </w:rPr>
-        <w:t>materialized views</w:t>
-      </w:r>
-      <w:r>
-        <w:rPr>
-          <w:rFonts w:asciiTheme="majorHAnsi" w:hAnsiTheme="majorHAnsi"/>
-          <w:b/>
-          <w:sz w:val="24"/>
-          <w:szCs w:val="24"/>
-        </w:rPr>
-        <w:t>?</w:t>
-      </w:r>
-      <w:r>
-        <w:rPr>
-          <w:rFonts w:asciiTheme="majorHAnsi" w:hAnsiTheme="majorHAnsi"/>
-          <w:sz w:val="24"/>
-          <w:szCs w:val="24"/>
-        </w:rPr>
-        <w:t xml:space="preserve"> Discuss their role in query optimization.</w:t>
+          <w:rFonts w:ascii="Cambria" w:hAnsi="Cambria"/>
+          <w:sz w:val="24"/>
+          <w:szCs w:val="24"/>
+        </w:rPr>
+      </w:pPr>
+      <w:r>
+        <w:rPr>
+          <w:rFonts w:ascii="Cambria" w:hAnsi="Cambria"/>
+          <w:sz w:val="24"/>
+          <w:szCs w:val="24"/>
+        </w:rPr>
+        <w:t xml:space="preserve">How does the scaling strategy (e.g., </w:t>
+      </w:r>
+      <w:proofErr w:type="spellStart"/>
+      <w:r>
+        <w:rPr>
+          <w:rFonts w:ascii="Cambria" w:hAnsi="Cambria"/>
+          <w:sz w:val="24"/>
+          <w:szCs w:val="24"/>
+        </w:rPr>
+        <w:t>sharding</w:t>
+      </w:r>
+      <w:proofErr w:type="spellEnd"/>
+      <w:r>
+        <w:rPr>
+          <w:rFonts w:ascii="Cambria" w:hAnsi="Cambria"/>
+          <w:sz w:val="24"/>
+          <w:szCs w:val="24"/>
+        </w:rPr>
+        <w:t>) of a document database impact the way you design your document IDs?</w:t>
+      </w:r>
+      <w:r>
+        <w:rPr>
+          <w:rFonts w:ascii="Cambria" w:hAnsi="Cambria"/>
+          <w:sz w:val="24"/>
+          <w:szCs w:val="24"/>
+        </w:rPr>
+        <w:t xml:space="preserve"> </w:t>
+      </w:r>
+      <w:r>
+        <w:rPr>
+          <w:rFonts w:ascii="Cambria" w:hAnsi="Cambria"/>
+          <w:sz w:val="24"/>
+          <w:szCs w:val="24"/>
+        </w:rPr>
+        <w:t xml:space="preserve">Propose an alternative data </w:t>
+      </w:r>
+      <w:proofErr w:type="gramStart"/>
+      <w:r>
+        <w:rPr>
+          <w:rFonts w:ascii="Cambria" w:hAnsi="Cambria"/>
+          <w:sz w:val="24"/>
+          <w:szCs w:val="24"/>
+        </w:rPr>
+        <w:t>Modeling</w:t>
+      </w:r>
+      <w:proofErr w:type="gramEnd"/>
+      <w:r>
+        <w:rPr>
+          <w:rFonts w:ascii="Cambria" w:hAnsi="Cambria"/>
+          <w:sz w:val="24"/>
+          <w:szCs w:val="24"/>
+        </w:rPr>
+        <w:t xml:space="preserve"> strategy within a document database to handle "varying aggregate structures."</w:t>
       </w:r>
     </w:p>
     <w:p>
@@ -2245,14 +4556,185 @@
         <w:ind w:right="71"/>
         <w:jc w:val="both"/>
         <w:rPr>
-          <w:rFonts w:asciiTheme="majorHAnsi" w:hAnsiTheme="majorHAnsi"/>
-          <w:sz w:val="24"/>
-          <w:szCs w:val="24"/>
-        </w:rPr>
-      </w:pPr>
-      <w:r>
-        <w:rPr>
-          <w:rFonts w:asciiTheme="majorHAnsi" w:hAnsiTheme="majorHAnsi"/>
+          <w:rFonts w:ascii="Cambria" w:hAnsi="Cambria"/>
+          <w:sz w:val="24"/>
+          <w:szCs w:val="24"/>
+        </w:rPr>
+      </w:pPr>
+      <w:r>
+        <w:rPr>
+          <w:rFonts w:ascii="Cambria" w:hAnsi="Cambria"/>
+          <w:sz w:val="24"/>
+          <w:szCs w:val="24"/>
+        </w:rPr>
+        <w:t xml:space="preserve">Given a healthcare database (doctors, patients, appointments, prescription), design an aggregate-oriented schema that supports </w:t>
+      </w:r>
+      <w:r>
+        <w:rPr>
+          <w:rStyle w:val="Strong"/>
+          <w:rFonts w:ascii="Cambria" w:hAnsi="Cambria"/>
+          <w:sz w:val="24"/>
+          <w:szCs w:val="24"/>
+        </w:rPr>
+        <w:t>one-to-many relationships</w:t>
+      </w:r>
+      <w:r>
+        <w:rPr>
+          <w:rFonts w:ascii="Cambria" w:hAnsi="Cambria"/>
+          <w:sz w:val="24"/>
+          <w:szCs w:val="24"/>
+        </w:rPr>
+        <w:t xml:space="preserve"> between doctors and their patients. Provide example documents showing how doctors are embedded within a patient document.</w:t>
+      </w:r>
+    </w:p>
+    <w:p>
+      <w:pPr>
+        <w:pStyle w:val="ListParagraph"/>
+        <w:numPr>
+          <w:ilvl w:val="0"/>
+          <w:numId w:val="1"/>
+        </w:numPr>
+        <w:tabs>
+          <w:tab w:val="left" w:pos="743"/>
+        </w:tabs>
+        <w:spacing w:before="41" w:line="278" w:lineRule="auto"/>
+        <w:ind w:right="71"/>
+        <w:jc w:val="both"/>
+        <w:rPr>
+          <w:rFonts w:ascii="Cambria" w:hAnsi="Cambria"/>
+          <w:sz w:val="24"/>
+          <w:szCs w:val="24"/>
+        </w:rPr>
+      </w:pPr>
+      <w:r>
+        <w:rPr>
+          <w:rFonts w:ascii="Cambria" w:hAnsi="Cambria" w:cstheme="minorHAnsi"/>
+          <w:sz w:val="24"/>
+          <w:szCs w:val="24"/>
+        </w:rPr>
+        <w:t>Design a graph model for a “Social Media Application” showing users, friendships and post.</w:t>
+      </w:r>
+      <w:r>
+        <w:rPr>
+          <w:rFonts w:ascii="Cambria" w:hAnsi="Cambria" w:cstheme="minorHAnsi"/>
+          <w:sz w:val="24"/>
+          <w:szCs w:val="24"/>
+        </w:rPr>
+        <w:t xml:space="preserve"> </w:t>
+      </w:r>
+      <w:r>
+        <w:rPr>
+          <w:rFonts w:ascii="Cambria" w:hAnsi="Cambria" w:cstheme="minorHAnsi"/>
+          <w:sz w:val="24"/>
+          <w:szCs w:val="24"/>
+        </w:rPr>
+        <w:t>Design a large-scale social networking graph system and illustrate how each feature is achieved within the architecture.</w:t>
+      </w:r>
+    </w:p>
+    <w:p>
+      <w:pPr>
+        <w:pStyle w:val="ListParagraph"/>
+        <w:numPr>
+          <w:ilvl w:val="0"/>
+          <w:numId w:val="1"/>
+        </w:numPr>
+        <w:tabs>
+          <w:tab w:val="left" w:pos="743"/>
+        </w:tabs>
+        <w:spacing w:before="41" w:line="278" w:lineRule="auto"/>
+        <w:ind w:right="71"/>
+        <w:jc w:val="both"/>
+        <w:rPr>
+          <w:rFonts w:ascii="Cambria" w:hAnsi="Cambria"/>
+          <w:sz w:val="24"/>
+          <w:szCs w:val="24"/>
+        </w:rPr>
+      </w:pPr>
+      <w:r>
+        <w:rPr>
+          <w:rFonts w:ascii="Cambria" w:hAnsi="Cambria" w:cstheme="minorHAnsi"/>
+          <w:sz w:val="24"/>
+          <w:szCs w:val="24"/>
+        </w:rPr>
+        <w:t>Explain how these features are implemented in a graph database like Neo4j with the help of a neat labeled diagram showing nodes, relationships, and replication setup.</w:t>
+      </w:r>
+    </w:p>
+    <w:p>
+      <w:pPr>
+        <w:pStyle w:val="ListParagraph"/>
+        <w:numPr>
+          <w:ilvl w:val="0"/>
+          <w:numId w:val="1"/>
+        </w:numPr>
+        <w:tabs>
+          <w:tab w:val="left" w:pos="743"/>
+        </w:tabs>
+        <w:spacing w:before="41" w:line="278" w:lineRule="auto"/>
+        <w:ind w:right="71"/>
+        <w:jc w:val="both"/>
+        <w:rPr>
+          <w:rFonts w:ascii="Cambria" w:hAnsi="Cambria"/>
+          <w:sz w:val="24"/>
+          <w:szCs w:val="24"/>
+        </w:rPr>
+      </w:pPr>
+      <w:r>
+        <w:rPr>
+          <w:rFonts w:ascii="Cambria" w:hAnsi="Cambria"/>
+          <w:sz w:val="24"/>
+          <w:szCs w:val="24"/>
+        </w:rPr>
+        <w:t xml:space="preserve">What are </w:t>
+      </w:r>
+      <w:r>
+        <w:rPr>
+          <w:rStyle w:val="Strong"/>
+          <w:rFonts w:ascii="Cambria" w:hAnsi="Cambria"/>
+          <w:sz w:val="24"/>
+          <w:szCs w:val="24"/>
+        </w:rPr>
+        <w:t>materialized views</w:t>
+      </w:r>
+      <w:r>
+        <w:rPr>
+          <w:rFonts w:ascii="Cambria" w:hAnsi="Cambria"/>
+          <w:b/>
+          <w:sz w:val="24"/>
+          <w:szCs w:val="24"/>
+        </w:rPr>
+        <w:t>?</w:t>
+      </w:r>
+      <w:r>
+        <w:rPr>
+          <w:rFonts w:ascii="Cambria" w:hAnsi="Cambria"/>
+          <w:sz w:val="24"/>
+          <w:szCs w:val="24"/>
+        </w:rPr>
+        <w:t xml:space="preserve"> Discuss their role in query optimization.</w:t>
+      </w:r>
+    </w:p>
+    <w:p>
+      <w:pPr>
+        <w:pStyle w:val="ListParagraph"/>
+        <w:numPr>
+          <w:ilvl w:val="0"/>
+          <w:numId w:val="1"/>
+        </w:numPr>
+        <w:tabs>
+          <w:tab w:val="left" w:pos="743"/>
+        </w:tabs>
+        <w:spacing w:before="41" w:line="278" w:lineRule="auto"/>
+        <w:ind w:right="71"/>
+        <w:jc w:val="both"/>
+        <w:rPr>
+          <w:rFonts w:ascii="Cambria" w:hAnsi="Cambria"/>
+          <w:sz w:val="24"/>
+          <w:szCs w:val="24"/>
+        </w:rPr>
+      </w:pPr>
+      <w:r>
+        <w:rPr>
+          <w:rFonts w:ascii="Cambria" w:hAnsi="Cambria"/>
           <w:sz w:val="24"/>
           <w:szCs w:val="24"/>
         </w:rPr>
@@ -2261,7 +4743,7 @@
       <w:proofErr w:type="spellStart"/>
       <w:r>
         <w:rPr>
-          <w:rFonts w:asciiTheme="majorHAnsi" w:hAnsiTheme="majorHAnsi"/>
+          <w:rFonts w:ascii="Cambria" w:hAnsi="Cambria"/>
           <w:sz w:val="24"/>
           <w:szCs w:val="24"/>
         </w:rPr>
@@ -2270,7 +4752,7 @@
       <w:proofErr w:type="spellEnd"/>
       <w:r>
         <w:rPr>
-          <w:rFonts w:asciiTheme="majorHAnsi" w:hAnsiTheme="majorHAnsi"/>
+          <w:rFonts w:ascii="Cambria" w:hAnsi="Cambria"/>
           <w:sz w:val="24"/>
           <w:szCs w:val="24"/>
         </w:rPr>
@@ -2283,7 +4765,7 @@
         <w:spacing w:line="278" w:lineRule="auto"/>
         <w:jc w:val="both"/>
         <w:rPr>
-          <w:rFonts w:asciiTheme="majorHAnsi" w:hAnsiTheme="majorHAnsi"/>
+          <w:rFonts w:ascii="Cambria" w:hAnsi="Cambria"/>
           <w:sz w:val="24"/>
           <w:szCs w:val="24"/>
         </w:rPr>
@@ -2299,7 +4781,7 @@
         <w:spacing w:line="278" w:lineRule="auto"/>
         <w:jc w:val="both"/>
         <w:rPr>
-          <w:rFonts w:asciiTheme="majorHAnsi" w:hAnsiTheme="majorHAnsi"/>
+          <w:rFonts w:ascii="Cambria" w:hAnsi="Cambria"/>
           <w:sz w:val="24"/>
           <w:szCs w:val="24"/>
         </w:rPr>
@@ -2325,16 +4807,14 @@
         <w:ind w:right="21"/>
         <w:jc w:val="both"/>
         <w:rPr>
-          <w:rFonts w:asciiTheme="majorHAnsi" w:hAnsiTheme="majorHAnsi"/>
-          <w:sz w:val="24"/>
-          <w:szCs w:val="24"/>
-        </w:rPr>
-      </w:pPr>
-      <w:bookmarkStart w:id="0" w:name="_GoBack"/>
-      <w:bookmarkEnd w:id="0"/>
-      <w:r>
-        <w:rPr>
-          <w:rFonts w:asciiTheme="majorHAnsi" w:hAnsiTheme="majorHAnsi"/>
+          <w:rFonts w:ascii="Cambria" w:hAnsi="Cambria"/>
+          <w:sz w:val="24"/>
+          <w:szCs w:val="24"/>
+        </w:rPr>
+      </w:pPr>
+      <w:r>
+        <w:rPr>
+          <w:rFonts w:ascii="Cambria" w:hAnsi="Cambria"/>
           <w:sz w:val="24"/>
           <w:szCs w:val="24"/>
         </w:rPr>
@@ -2344,7 +4824,7 @@
       <w:proofErr w:type="spellStart"/>
       <w:r>
         <w:rPr>
-          <w:rFonts w:asciiTheme="majorHAnsi" w:hAnsiTheme="majorHAnsi"/>
+          <w:rFonts w:ascii="Cambria" w:hAnsi="Cambria"/>
           <w:sz w:val="24"/>
           <w:szCs w:val="24"/>
         </w:rPr>
@@ -2353,12 +4833,13 @@
       <w:proofErr w:type="spellEnd"/>
       <w:r>
         <w:rPr>
-          <w:rFonts w:asciiTheme="majorHAnsi" w:hAnsiTheme="majorHAnsi"/>
+          <w:rFonts w:ascii="Cambria" w:hAnsi="Cambria"/>
           <w:sz w:val="24"/>
           <w:szCs w:val="24"/>
         </w:rPr>
         <w:t xml:space="preserve"> and replication would be combined to ensure both performance and availability.</w:t>
       </w:r>
+      <w:bookmarkEnd w:id="0"/>
     </w:p>
     <w:sectPr>
       <w:pgSz w:w="11910" w:h="16840"/>

</xml_diff>